<commit_message>
cards of cabinets in one line, fixes in docs
</commit_message>
<xml_diff>
--- a/patients/templates/patients/docs/card_IP_template.docx
+++ b/patients/templates/patients/docs/card_IP_template.docx
@@ -607,7 +607,6 @@
                 <w:lang w:val="en-US"/>
               </w:rPr>
             </w:pPr>
-            <w:proofErr w:type="gramStart"/>
             <w:r>
               <w:rPr>
                 <w:b/>
@@ -615,37 +614,7 @@
                 <w:szCs w:val="28"/>
                 <w:lang w:val="en-US"/>
               </w:rPr>
-              <w:t xml:space="preserve">{{ </w:t>
-            </w:r>
-            <w:proofErr w:type="spellStart"/>
-            <w:r>
-              <w:rPr>
-                <w:b/>
-                <w:sz w:val="28"/>
-                <w:szCs w:val="28"/>
-                <w:lang w:val="en-US"/>
-              </w:rPr>
-              <w:t>card</w:t>
-            </w:r>
-            <w:proofErr w:type="gramEnd"/>
-            <w:r>
-              <w:rPr>
-                <w:b/>
-                <w:sz w:val="28"/>
-                <w:szCs w:val="28"/>
-                <w:lang w:val="en-US"/>
-              </w:rPr>
-              <w:t>_number_IP</w:t>
-            </w:r>
-            <w:proofErr w:type="spellEnd"/>
-            <w:r>
-              <w:rPr>
-                <w:b/>
-                <w:sz w:val="28"/>
-                <w:szCs w:val="28"/>
-                <w:lang w:val="en-US"/>
-              </w:rPr>
-              <w:t xml:space="preserve"> }}</w:t>
+              <w:t>{{ card_number_IP }}</w:t>
             </w:r>
           </w:p>
         </w:tc>
@@ -782,37 +751,12 @@
                 <w:szCs w:val="20"/>
               </w:rPr>
             </w:pPr>
-            <w:proofErr w:type="gramStart"/>
-            <w:r>
-              <w:rPr>
-                <w:sz w:val="20"/>
-                <w:szCs w:val="20"/>
-              </w:rPr>
-              <w:t xml:space="preserve">{{ </w:t>
-            </w:r>
-            <w:proofErr w:type="spellStart"/>
-            <w:r>
-              <w:rPr>
-                <w:sz w:val="20"/>
-                <w:szCs w:val="20"/>
-              </w:rPr>
-              <w:t>c</w:t>
-            </w:r>
-            <w:proofErr w:type="gramEnd"/>
-            <w:r>
-              <w:rPr>
-                <w:sz w:val="20"/>
-                <w:szCs w:val="20"/>
-              </w:rPr>
-              <w:t>_day</w:t>
-            </w:r>
-            <w:proofErr w:type="spellEnd"/>
-            <w:r>
-              <w:rPr>
-                <w:sz w:val="20"/>
-                <w:szCs w:val="20"/>
-              </w:rPr>
-              <w:t xml:space="preserve"> }}</w:t>
+            <w:r>
+              <w:rPr>
+                <w:sz w:val="20"/>
+                <w:szCs w:val="20"/>
+              </w:rPr>
+              <w:t>{{ c_day }}</w:t>
             </w:r>
           </w:p>
         </w:tc>
@@ -857,7 +801,6 @@
                 <w:lang w:val="en-US"/>
               </w:rPr>
             </w:pPr>
-            <w:proofErr w:type="gramStart"/>
             <w:r>
               <w:rPr>
                 <w:sz w:val="20"/>
@@ -874,23 +817,13 @@
               </w:rPr>
               <w:t xml:space="preserve"> </w:t>
             </w:r>
-            <w:proofErr w:type="spellStart"/>
-            <w:r>
-              <w:rPr>
-                <w:sz w:val="20"/>
-                <w:szCs w:val="20"/>
-              </w:rPr>
-              <w:t>cur</w:t>
-            </w:r>
-            <w:proofErr w:type="gramEnd"/>
-            <w:r>
-              <w:rPr>
-                <w:sz w:val="20"/>
-                <w:szCs w:val="20"/>
-              </w:rPr>
-              <w:t>_month_ru</w:t>
-            </w:r>
-            <w:proofErr w:type="spellEnd"/>
+            <w:r>
+              <w:rPr>
+                <w:sz w:val="20"/>
+                <w:szCs w:val="20"/>
+              </w:rPr>
+              <w:t>cur_month_ru</w:t>
+            </w:r>
             <w:r>
               <w:rPr>
                 <w:sz w:val="20"/>
@@ -949,7 +882,6 @@
                 <w:szCs w:val="20"/>
               </w:rPr>
             </w:pPr>
-            <w:proofErr w:type="gramStart"/>
             <w:r>
               <w:rPr>
                 <w:sz w:val="20"/>
@@ -957,23 +889,13 @@
               </w:rPr>
               <w:t xml:space="preserve">{{ </w:t>
             </w:r>
-            <w:proofErr w:type="spellStart"/>
-            <w:r>
-              <w:rPr>
-                <w:sz w:val="20"/>
-                <w:szCs w:val="20"/>
-              </w:rPr>
-              <w:t>current</w:t>
-            </w:r>
-            <w:proofErr w:type="gramEnd"/>
-            <w:r>
-              <w:rPr>
-                <w:sz w:val="20"/>
-                <w:szCs w:val="20"/>
-              </w:rPr>
-              <w:t>_year</w:t>
-            </w:r>
-            <w:proofErr w:type="spellEnd"/>
+            <w:r>
+              <w:rPr>
+                <w:sz w:val="20"/>
+                <w:szCs w:val="20"/>
+              </w:rPr>
+              <w:t>current_year</w:t>
+            </w:r>
           </w:p>
           <w:p>
             <w:pPr>
@@ -1041,113 +963,13 @@
                 <w:lang w:val="en-US"/>
               </w:rPr>
             </w:pPr>
-            <w:proofErr w:type="gramStart"/>
             <w:r>
               <w:rPr>
                 <w:sz w:val="20"/>
                 <w:szCs w:val="20"/>
                 <w:lang w:val="en-US"/>
               </w:rPr>
-              <w:t>{{ surname</w:t>
-            </w:r>
-            <w:proofErr w:type="gramEnd"/>
-            <w:r>
-              <w:rPr>
-                <w:sz w:val="20"/>
-                <w:szCs w:val="20"/>
-                <w:lang w:val="en-US"/>
-              </w:rPr>
-              <w:t xml:space="preserve"> }} </w:t>
-            </w:r>
-            <w:proofErr w:type="gramStart"/>
-            <w:r>
-              <w:rPr>
-                <w:sz w:val="20"/>
-                <w:szCs w:val="20"/>
-                <w:lang w:val="en-US"/>
-              </w:rPr>
-              <w:t xml:space="preserve">{{ </w:t>
-            </w:r>
-            <w:proofErr w:type="spellStart"/>
-            <w:r>
-              <w:rPr>
-                <w:sz w:val="20"/>
-                <w:szCs w:val="20"/>
-                <w:lang w:val="en-US"/>
-              </w:rPr>
-              <w:t>first</w:t>
-            </w:r>
-            <w:proofErr w:type="gramEnd"/>
-            <w:r>
-              <w:rPr>
-                <w:sz w:val="20"/>
-                <w:szCs w:val="20"/>
-                <w:lang w:val="en-US"/>
-              </w:rPr>
-              <w:t>_</w:t>
-            </w:r>
-            <w:proofErr w:type="gramStart"/>
-            <w:r>
-              <w:rPr>
-                <w:sz w:val="20"/>
-                <w:szCs w:val="20"/>
-                <w:lang w:val="en-US"/>
-              </w:rPr>
-              <w:t>name</w:t>
-            </w:r>
-            <w:proofErr w:type="spellEnd"/>
-            <w:r>
-              <w:rPr>
-                <w:sz w:val="20"/>
-                <w:szCs w:val="20"/>
-                <w:lang w:val="en-US"/>
-              </w:rPr>
-              <w:t xml:space="preserve"> }</w:t>
-            </w:r>
-            <w:proofErr w:type="gramEnd"/>
-            <w:r>
-              <w:rPr>
-                <w:sz w:val="20"/>
-                <w:szCs w:val="20"/>
-                <w:lang w:val="en-US"/>
-              </w:rPr>
-              <w:t xml:space="preserve">} </w:t>
-            </w:r>
-            <w:proofErr w:type="gramStart"/>
-            <w:r>
-              <w:rPr>
-                <w:sz w:val="20"/>
-                <w:szCs w:val="20"/>
-                <w:lang w:val="en-US"/>
-              </w:rPr>
-              <w:t xml:space="preserve">{{ </w:t>
-            </w:r>
-            <w:proofErr w:type="spellStart"/>
-            <w:r>
-              <w:rPr>
-                <w:sz w:val="20"/>
-                <w:szCs w:val="20"/>
-                <w:lang w:val="en-US"/>
-              </w:rPr>
-              <w:t>last</w:t>
-            </w:r>
-            <w:proofErr w:type="gramEnd"/>
-            <w:r>
-              <w:rPr>
-                <w:sz w:val="20"/>
-                <w:szCs w:val="20"/>
-                <w:lang w:val="en-US"/>
-              </w:rPr>
-              <w:t>_name</w:t>
-            </w:r>
-            <w:proofErr w:type="spellEnd"/>
-            <w:r>
-              <w:rPr>
-                <w:sz w:val="20"/>
-                <w:szCs w:val="20"/>
-                <w:lang w:val="en-US"/>
-              </w:rPr>
-              <w:t xml:space="preserve"> }}</w:t>
+              <w:t>{{ surname }} {{ first_name }} {{ last_name }}</w:t>
             </w:r>
           </w:p>
         </w:tc>
@@ -1206,37 +1028,12 @@
                 <w:szCs w:val="20"/>
               </w:rPr>
             </w:pPr>
-            <w:proofErr w:type="gramStart"/>
-            <w:r>
-              <w:rPr>
-                <w:sz w:val="20"/>
-                <w:szCs w:val="20"/>
-              </w:rPr>
-              <w:t xml:space="preserve">{{ </w:t>
-            </w:r>
-            <w:proofErr w:type="spellStart"/>
-            <w:r>
-              <w:rPr>
-                <w:sz w:val="20"/>
-                <w:szCs w:val="20"/>
-              </w:rPr>
-              <w:t>b</w:t>
-            </w:r>
-            <w:proofErr w:type="gramEnd"/>
-            <w:r>
-              <w:rPr>
-                <w:sz w:val="20"/>
-                <w:szCs w:val="20"/>
-              </w:rPr>
-              <w:t>_day</w:t>
-            </w:r>
-            <w:proofErr w:type="spellEnd"/>
-            <w:r>
-              <w:rPr>
-                <w:sz w:val="20"/>
-                <w:szCs w:val="20"/>
-              </w:rPr>
-              <w:t xml:space="preserve"> }}</w:t>
+            <w:r>
+              <w:rPr>
+                <w:sz w:val="20"/>
+                <w:szCs w:val="20"/>
+              </w:rPr>
+              <w:t>{{ b_day }}</w:t>
             </w:r>
           </w:p>
         </w:tc>
@@ -1277,37 +1074,12 @@
                 <w:szCs w:val="20"/>
               </w:rPr>
             </w:pPr>
-            <w:proofErr w:type="gramStart"/>
-            <w:r>
-              <w:rPr>
-                <w:sz w:val="20"/>
-                <w:szCs w:val="20"/>
-              </w:rPr>
-              <w:t xml:space="preserve">{{ </w:t>
-            </w:r>
-            <w:proofErr w:type="spellStart"/>
-            <w:r>
-              <w:rPr>
-                <w:sz w:val="20"/>
-                <w:szCs w:val="20"/>
-              </w:rPr>
-              <w:t>b</w:t>
-            </w:r>
-            <w:proofErr w:type="gramEnd"/>
-            <w:r>
-              <w:rPr>
-                <w:sz w:val="20"/>
-                <w:szCs w:val="20"/>
-              </w:rPr>
-              <w:t>_month_name</w:t>
-            </w:r>
-            <w:proofErr w:type="spellEnd"/>
-            <w:r>
-              <w:rPr>
-                <w:sz w:val="20"/>
-                <w:szCs w:val="20"/>
-              </w:rPr>
-              <w:t xml:space="preserve"> }}</w:t>
+            <w:r>
+              <w:rPr>
+                <w:sz w:val="20"/>
+                <w:szCs w:val="20"/>
+              </w:rPr>
+              <w:t>{{ b_month_name }}</w:t>
             </w:r>
           </w:p>
         </w:tc>
@@ -1344,37 +1116,12 @@
                 <w:szCs w:val="20"/>
               </w:rPr>
             </w:pPr>
-            <w:proofErr w:type="gramStart"/>
-            <w:r>
-              <w:rPr>
-                <w:sz w:val="20"/>
-                <w:szCs w:val="20"/>
-              </w:rPr>
-              <w:t xml:space="preserve">{{ </w:t>
-            </w:r>
-            <w:proofErr w:type="spellStart"/>
-            <w:r>
-              <w:rPr>
-                <w:sz w:val="20"/>
-                <w:szCs w:val="20"/>
-              </w:rPr>
-              <w:t>b</w:t>
-            </w:r>
-            <w:proofErr w:type="gramEnd"/>
-            <w:r>
-              <w:rPr>
-                <w:sz w:val="20"/>
-                <w:szCs w:val="20"/>
-              </w:rPr>
-              <w:t>_year</w:t>
-            </w:r>
-            <w:proofErr w:type="spellEnd"/>
-            <w:r>
-              <w:rPr>
-                <w:sz w:val="20"/>
-                <w:szCs w:val="20"/>
-              </w:rPr>
-              <w:t xml:space="preserve"> }}</w:t>
+            <w:r>
+              <w:rPr>
+                <w:sz w:val="20"/>
+                <w:szCs w:val="20"/>
+              </w:rPr>
+              <w:t>{{ b_year }}</w:t>
             </w:r>
           </w:p>
         </w:tc>
@@ -1396,15 +1143,7 @@
                 <w:sz w:val="20"/>
                 <w:szCs w:val="20"/>
               </w:rPr>
-              <w:t xml:space="preserve"> г. </w:t>
-            </w:r>
-            <w:proofErr w:type="gramStart"/>
-            <w:r>
-              <w:rPr>
-                <w:sz w:val="20"/>
-                <w:szCs w:val="20"/>
-              </w:rPr>
-              <w:t>Пол</w:t>
+              <w:t xml:space="preserve"> г. Пол</w:t>
             </w:r>
             <w:r>
               <w:rPr>
@@ -1436,37 +1175,7 @@
                 <w:u w:val="single"/>
                 <w:lang w:val="en-US"/>
               </w:rPr>
-              <w:t>{{ gender</w:t>
-            </w:r>
-            <w:proofErr w:type="gramEnd"/>
-            <w:r>
-              <w:rPr>
-                <w:sz w:val="20"/>
-                <w:szCs w:val="20"/>
-                <w:u w:val="single"/>
-                <w:lang w:val="en-US"/>
-              </w:rPr>
-              <w:t xml:space="preserve"> </w:t>
-            </w:r>
-            <w:proofErr w:type="gramStart"/>
-            <w:r>
-              <w:rPr>
-                <w:sz w:val="20"/>
-                <w:szCs w:val="20"/>
-                <w:u w:val="single"/>
-                <w:lang w:val="en-US"/>
-              </w:rPr>
-              <w:t xml:space="preserve">}}   </w:t>
-            </w:r>
-            <w:proofErr w:type="gramEnd"/>
-            <w:r>
-              <w:rPr>
-                <w:sz w:val="20"/>
-                <w:szCs w:val="20"/>
-                <w:u w:val="single"/>
-                <w:lang w:val="en-US"/>
-              </w:rPr>
-              <w:t xml:space="preserve">    </w:t>
+              <w:t xml:space="preserve">{{ gender }}       </w:t>
             </w:r>
             <w:r>
               <w:rPr>
@@ -1552,30 +1261,12 @@
                 <w:szCs w:val="20"/>
               </w:rPr>
             </w:pPr>
-            <w:proofErr w:type="gramStart"/>
-            <w:r>
-              <w:rPr>
-                <w:sz w:val="20"/>
-                <w:szCs w:val="20"/>
-              </w:rPr>
-              <w:t xml:space="preserve">{{ </w:t>
-            </w:r>
-            <w:proofErr w:type="spellStart"/>
-            <w:r>
-              <w:rPr>
-                <w:sz w:val="20"/>
-                <w:szCs w:val="20"/>
-              </w:rPr>
-              <w:t>passport</w:t>
-            </w:r>
-            <w:proofErr w:type="spellEnd"/>
-            <w:proofErr w:type="gramEnd"/>
-            <w:r>
-              <w:rPr>
-                <w:sz w:val="20"/>
-                <w:szCs w:val="20"/>
-              </w:rPr>
-              <w:t xml:space="preserve"> }}</w:t>
+            <w:r>
+              <w:rPr>
+                <w:sz w:val="20"/>
+                <w:szCs w:val="20"/>
+              </w:rPr>
+              <w:t>{{ passport }}</w:t>
             </w:r>
           </w:p>
         </w:tc>
@@ -1618,37 +1309,12 @@
                 <w:szCs w:val="20"/>
               </w:rPr>
             </w:pPr>
-            <w:proofErr w:type="gramStart"/>
-            <w:r>
-              <w:rPr>
-                <w:sz w:val="20"/>
-                <w:szCs w:val="20"/>
-              </w:rPr>
-              <w:t xml:space="preserve">{{ </w:t>
-            </w:r>
-            <w:proofErr w:type="spellStart"/>
-            <w:r>
-              <w:rPr>
-                <w:sz w:val="20"/>
-                <w:szCs w:val="20"/>
-              </w:rPr>
-              <w:t>p</w:t>
-            </w:r>
-            <w:proofErr w:type="gramEnd"/>
-            <w:r>
-              <w:rPr>
-                <w:sz w:val="20"/>
-                <w:szCs w:val="20"/>
-              </w:rPr>
-              <w:t>_series</w:t>
-            </w:r>
-            <w:proofErr w:type="spellEnd"/>
-            <w:r>
-              <w:rPr>
-                <w:sz w:val="20"/>
-                <w:szCs w:val="20"/>
-              </w:rPr>
-              <w:t xml:space="preserve"> }}</w:t>
+            <w:r>
+              <w:rPr>
+                <w:sz w:val="20"/>
+                <w:szCs w:val="20"/>
+              </w:rPr>
+              <w:t>{{ p_series }}</w:t>
             </w:r>
           </w:p>
         </w:tc>
@@ -1691,37 +1357,12 @@
                 <w:szCs w:val="20"/>
               </w:rPr>
             </w:pPr>
-            <w:proofErr w:type="gramStart"/>
-            <w:r>
-              <w:rPr>
-                <w:sz w:val="20"/>
-                <w:szCs w:val="20"/>
-              </w:rPr>
-              <w:t xml:space="preserve">{{ </w:t>
-            </w:r>
-            <w:proofErr w:type="spellStart"/>
-            <w:r>
-              <w:rPr>
-                <w:sz w:val="20"/>
-                <w:szCs w:val="20"/>
-              </w:rPr>
-              <w:t>p</w:t>
-            </w:r>
-            <w:proofErr w:type="gramEnd"/>
-            <w:r>
-              <w:rPr>
-                <w:sz w:val="20"/>
-                <w:szCs w:val="20"/>
-              </w:rPr>
-              <w:t>_number</w:t>
-            </w:r>
-            <w:proofErr w:type="spellEnd"/>
-            <w:r>
-              <w:rPr>
-                <w:sz w:val="20"/>
-                <w:szCs w:val="20"/>
-              </w:rPr>
-              <w:t xml:space="preserve"> }}</w:t>
+            <w:r>
+              <w:rPr>
+                <w:sz w:val="20"/>
+                <w:szCs w:val="20"/>
+              </w:rPr>
+              <w:t>{{ p_number }}</w:t>
             </w:r>
           </w:p>
         </w:tc>
@@ -1773,37 +1414,12 @@
                 <w:szCs w:val="20"/>
               </w:rPr>
             </w:pPr>
-            <w:proofErr w:type="gramStart"/>
-            <w:r>
-              <w:rPr>
-                <w:sz w:val="20"/>
-                <w:szCs w:val="20"/>
-              </w:rPr>
-              <w:t xml:space="preserve">{{ </w:t>
-            </w:r>
-            <w:proofErr w:type="spellStart"/>
-            <w:r>
-              <w:rPr>
-                <w:sz w:val="20"/>
-                <w:szCs w:val="20"/>
-              </w:rPr>
-              <w:t>phone</w:t>
-            </w:r>
-            <w:proofErr w:type="gramEnd"/>
-            <w:r>
-              <w:rPr>
-                <w:sz w:val="20"/>
-                <w:szCs w:val="20"/>
-              </w:rPr>
-              <w:t>_number</w:t>
-            </w:r>
-            <w:proofErr w:type="spellEnd"/>
-            <w:r>
-              <w:rPr>
-                <w:sz w:val="20"/>
-                <w:szCs w:val="20"/>
-              </w:rPr>
-              <w:t xml:space="preserve"> }}</w:t>
+            <w:r>
+              <w:rPr>
+                <w:sz w:val="20"/>
+                <w:szCs w:val="20"/>
+              </w:rPr>
+              <w:t>{{ phone_number }}</w:t>
             </w:r>
           </w:p>
         </w:tc>
@@ -1896,30 +1512,12 @@
                 <w:szCs w:val="20"/>
               </w:rPr>
             </w:pPr>
-            <w:proofErr w:type="gramStart"/>
-            <w:r>
-              <w:rPr>
-                <w:sz w:val="20"/>
-                <w:szCs w:val="20"/>
-              </w:rPr>
-              <w:t xml:space="preserve">{{ </w:t>
-            </w:r>
-            <w:proofErr w:type="spellStart"/>
-            <w:r>
-              <w:rPr>
-                <w:sz w:val="20"/>
-                <w:szCs w:val="20"/>
-              </w:rPr>
-              <w:t>area</w:t>
-            </w:r>
-            <w:proofErr w:type="spellEnd"/>
-            <w:proofErr w:type="gramEnd"/>
-            <w:r>
-              <w:rPr>
-                <w:sz w:val="20"/>
-                <w:szCs w:val="20"/>
-              </w:rPr>
-              <w:t xml:space="preserve"> }}</w:t>
+            <w:r>
+              <w:rPr>
+                <w:sz w:val="20"/>
+                <w:szCs w:val="20"/>
+              </w:rPr>
+              <w:t>{{ area }}</w:t>
             </w:r>
           </w:p>
         </w:tc>
@@ -1967,30 +1565,12 @@
                 <w:szCs w:val="20"/>
               </w:rPr>
             </w:pPr>
-            <w:proofErr w:type="gramStart"/>
-            <w:r>
-              <w:rPr>
-                <w:sz w:val="20"/>
-                <w:szCs w:val="20"/>
-              </w:rPr>
-              <w:t xml:space="preserve">{{ </w:t>
-            </w:r>
-            <w:proofErr w:type="spellStart"/>
-            <w:r>
-              <w:rPr>
-                <w:sz w:val="20"/>
-                <w:szCs w:val="20"/>
-              </w:rPr>
-              <w:t>district</w:t>
-            </w:r>
-            <w:proofErr w:type="spellEnd"/>
-            <w:proofErr w:type="gramEnd"/>
-            <w:r>
-              <w:rPr>
-                <w:sz w:val="20"/>
-                <w:szCs w:val="20"/>
-              </w:rPr>
-              <w:t xml:space="preserve"> }}</w:t>
+            <w:r>
+              <w:rPr>
+                <w:sz w:val="20"/>
+                <w:szCs w:val="20"/>
+              </w:rPr>
+              <w:t>{{ district }}</w:t>
             </w:r>
           </w:p>
         </w:tc>
@@ -2033,30 +1613,12 @@
                 <w:szCs w:val="20"/>
               </w:rPr>
             </w:pPr>
-            <w:proofErr w:type="gramStart"/>
-            <w:r>
-              <w:rPr>
-                <w:sz w:val="20"/>
-                <w:szCs w:val="20"/>
-              </w:rPr>
-              <w:t xml:space="preserve">{{ </w:t>
-            </w:r>
-            <w:proofErr w:type="spellStart"/>
-            <w:r>
-              <w:rPr>
-                <w:sz w:val="20"/>
-                <w:szCs w:val="20"/>
-              </w:rPr>
-              <w:t>locality</w:t>
-            </w:r>
-            <w:proofErr w:type="spellEnd"/>
-            <w:proofErr w:type="gramEnd"/>
-            <w:r>
-              <w:rPr>
-                <w:sz w:val="20"/>
-                <w:szCs w:val="20"/>
-              </w:rPr>
-              <w:t xml:space="preserve"> }}</w:t>
+            <w:r>
+              <w:rPr>
+                <w:sz w:val="20"/>
+                <w:szCs w:val="20"/>
+              </w:rPr>
+              <w:t>{{ locality }}</w:t>
             </w:r>
           </w:p>
         </w:tc>
@@ -2107,30 +1669,12 @@
                 <w:szCs w:val="20"/>
               </w:rPr>
             </w:pPr>
-            <w:proofErr w:type="gramStart"/>
-            <w:r>
-              <w:rPr>
-                <w:sz w:val="20"/>
-                <w:szCs w:val="20"/>
-              </w:rPr>
-              <w:t xml:space="preserve">{{ </w:t>
-            </w:r>
-            <w:proofErr w:type="spellStart"/>
-            <w:r>
-              <w:rPr>
-                <w:sz w:val="20"/>
-                <w:szCs w:val="20"/>
-              </w:rPr>
-              <w:t>street</w:t>
-            </w:r>
-            <w:proofErr w:type="spellEnd"/>
-            <w:proofErr w:type="gramEnd"/>
-            <w:r>
-              <w:rPr>
-                <w:sz w:val="20"/>
-                <w:szCs w:val="20"/>
-              </w:rPr>
-              <w:t xml:space="preserve"> }}</w:t>
+            <w:r>
+              <w:rPr>
+                <w:sz w:val="20"/>
+                <w:szCs w:val="20"/>
+              </w:rPr>
+              <w:t>{{ street }}</w:t>
             </w:r>
           </w:p>
         </w:tc>
@@ -2173,30 +1717,12 @@
                 <w:szCs w:val="20"/>
               </w:rPr>
             </w:pPr>
-            <w:proofErr w:type="gramStart"/>
-            <w:r>
-              <w:rPr>
-                <w:sz w:val="20"/>
-                <w:szCs w:val="20"/>
-              </w:rPr>
-              <w:t xml:space="preserve">{{ </w:t>
-            </w:r>
-            <w:proofErr w:type="spellStart"/>
-            <w:r>
-              <w:rPr>
-                <w:sz w:val="20"/>
-                <w:szCs w:val="20"/>
-              </w:rPr>
-              <w:t>home</w:t>
-            </w:r>
-            <w:proofErr w:type="spellEnd"/>
-            <w:proofErr w:type="gramEnd"/>
-            <w:r>
-              <w:rPr>
-                <w:sz w:val="20"/>
-                <w:szCs w:val="20"/>
-              </w:rPr>
-              <w:t xml:space="preserve"> }}</w:t>
+            <w:r>
+              <w:rPr>
+                <w:sz w:val="20"/>
+                <w:szCs w:val="20"/>
+              </w:rPr>
+              <w:t>{{ home }}</w:t>
             </w:r>
           </w:p>
         </w:tc>
@@ -2240,30 +1766,12 @@
                 <w:szCs w:val="20"/>
               </w:rPr>
             </w:pPr>
-            <w:proofErr w:type="gramStart"/>
-            <w:r>
-              <w:rPr>
-                <w:sz w:val="20"/>
-                <w:szCs w:val="20"/>
-              </w:rPr>
-              <w:t xml:space="preserve">{{ </w:t>
-            </w:r>
-            <w:proofErr w:type="spellStart"/>
-            <w:r>
-              <w:rPr>
-                <w:sz w:val="20"/>
-                <w:szCs w:val="20"/>
-              </w:rPr>
-              <w:t>building</w:t>
-            </w:r>
-            <w:proofErr w:type="spellEnd"/>
-            <w:proofErr w:type="gramEnd"/>
-            <w:r>
-              <w:rPr>
-                <w:sz w:val="20"/>
-                <w:szCs w:val="20"/>
-              </w:rPr>
-              <w:t xml:space="preserve"> }}</w:t>
+            <w:r>
+              <w:rPr>
+                <w:sz w:val="20"/>
+                <w:szCs w:val="20"/>
+              </w:rPr>
+              <w:t>{{ building }}</w:t>
             </w:r>
           </w:p>
         </w:tc>
@@ -2306,30 +1814,12 @@
                 <w:szCs w:val="20"/>
               </w:rPr>
             </w:pPr>
-            <w:proofErr w:type="gramStart"/>
-            <w:r>
-              <w:rPr>
-                <w:sz w:val="20"/>
-                <w:szCs w:val="20"/>
-              </w:rPr>
-              <w:t xml:space="preserve">{{ </w:t>
-            </w:r>
-            <w:proofErr w:type="spellStart"/>
-            <w:r>
-              <w:rPr>
-                <w:sz w:val="20"/>
-                <w:szCs w:val="20"/>
-              </w:rPr>
-              <w:t>apartment</w:t>
-            </w:r>
-            <w:proofErr w:type="spellEnd"/>
-            <w:proofErr w:type="gramEnd"/>
-            <w:r>
-              <w:rPr>
-                <w:sz w:val="20"/>
-                <w:szCs w:val="20"/>
-              </w:rPr>
-              <w:t xml:space="preserve"> }}</w:t>
+            <w:r>
+              <w:rPr>
+                <w:sz w:val="20"/>
+                <w:szCs w:val="20"/>
+              </w:rPr>
+              <w:t>{{ apartment }}</w:t>
             </w:r>
           </w:p>
         </w:tc>
@@ -3359,21 +2849,12 @@
                 <w:szCs w:val="20"/>
               </w:rPr>
             </w:pPr>
-            <w:proofErr w:type="spellStart"/>
-            <w:r>
-              <w:rPr>
-                <w:sz w:val="20"/>
-                <w:szCs w:val="20"/>
-              </w:rPr>
-              <w:t>щийся</w:t>
-            </w:r>
-            <w:proofErr w:type="spellEnd"/>
-            <w:r>
-              <w:rPr>
-                <w:sz w:val="20"/>
-                <w:szCs w:val="20"/>
-              </w:rPr>
-              <w:t xml:space="preserve"> — 4, не работает — 5, прочее — 6</w:t>
+            <w:r>
+              <w:rPr>
+                <w:sz w:val="20"/>
+                <w:szCs w:val="20"/>
+              </w:rPr>
+              <w:t>щийся — 4, не работает — 5, прочее — 6</w:t>
             </w:r>
           </w:p>
         </w:tc>
@@ -5441,17 +4922,8 @@
                 <w:sz w:val="20"/>
                 <w:szCs w:val="20"/>
               </w:rPr>
-              <w:t xml:space="preserve">антиген К1 системы </w:t>
-            </w:r>
-            <w:proofErr w:type="spellStart"/>
-            <w:r>
-              <w:rPr>
-                <w:sz w:val="20"/>
-                <w:szCs w:val="20"/>
-              </w:rPr>
-              <w:t>Kell</w:t>
-            </w:r>
-            <w:proofErr w:type="spellEnd"/>
+              <w:t>антиген К1 системы Kell</w:t>
+            </w:r>
           </w:p>
         </w:tc>
         <w:tc>
@@ -5601,23 +5073,7 @@
           <w:sz w:val="20"/>
           <w:szCs w:val="20"/>
         </w:rPr>
-        <w:t xml:space="preserve">иные виды непереносимости в </w:t>
-      </w:r>
-      <w:proofErr w:type="spellStart"/>
-      <w:r>
-        <w:rPr>
-          <w:sz w:val="20"/>
-          <w:szCs w:val="20"/>
-        </w:rPr>
-        <w:t>анаамнезе</w:t>
-      </w:r>
-      <w:proofErr w:type="spellEnd"/>
-      <w:r>
-        <w:rPr>
-          <w:sz w:val="20"/>
-          <w:szCs w:val="20"/>
-        </w:rPr>
-        <w:t>,</w:t>
+        <w:t>иные виды непереносимости в анаамнезе,</w:t>
       </w:r>
       <w:r>
         <w:rPr>
@@ -5727,7 +5183,6 @@
       </w:pPr>
     </w:p>
     <w:sectPr>
-      <w:headerReference w:type="default" r:id="rId7"/>
       <w:pgSz w:w="11906" w:h="16838"/>
       <w:pgMar w:top="851" w:right="567" w:bottom="567" w:left="1134" w:header="397" w:footer="397" w:gutter="0"/>
       <w:cols w:space="708"/>
@@ -5773,29 +5228,6 @@
     </w:p>
   </w:footnote>
 </w:footnotes>
-</file>
-
-<file path=word/header1.xml><?xml version="1.0" encoding="utf-8"?>
-<w:hdr xmlns:wpc="http://schemas.microsoft.com/office/word/2010/wordprocessingCanvas" xmlns:cx="http://schemas.microsoft.com/office/drawing/2014/chartex" xmlns:cx1="http://schemas.microsoft.com/office/drawing/2015/9/8/chartex" xmlns:cx2="http://schemas.microsoft.com/office/drawing/2015/10/21/chartex" xmlns:cx3="http://schemas.microsoft.com/office/drawing/2016/5/9/chartex" xmlns:cx4="http://schemas.microsoft.com/office/drawing/2016/5/10/chartex" xmlns:cx5="http://schemas.microsoft.com/office/drawing/2016/5/11/chartex" xmlns:cx6="http://schemas.microsoft.com/office/drawing/2016/5/12/chartex" xmlns:cx7="http://schemas.microsoft.com/office/drawing/2016/5/13/chartex" xmlns:cx8="http://schemas.microsoft.com/office/drawing/2016/5/14/chartex" xmlns:mc="http://schemas.openxmlformats.org/markup-compatibility/2006" xmlns:aink="http://schemas.microsoft.com/office/drawing/2016/ink" xmlns:am3d="http://schemas.microsoft.com/office/drawing/2017/model3d" xmlns:o="urn:schemas-microsoft-com:office:office" xmlns:oel="http://schemas.microsoft.com/office/2019/extlst" xmlns:r="http://schemas.openxmlformats.org/officeDocument/2006/relationships" xmlns:m="http://schemas.openxmlformats.org/officeDocument/2006/math" xmlns:v="urn:schemas-microsoft-com:vml" xmlns:wp14="http://schemas.microsoft.com/office/word/2010/wordprocessingDrawing" xmlns:wp="http://schemas.openxmlformats.org/drawingml/2006/wordprocessingDrawing" xmlns:w10="urn:schemas-microsoft-com:office:word" xmlns:w="http://schemas.openxmlformats.org/wordprocessingml/2006/main" xmlns:w14="http://schemas.microsoft.com/office/word/2010/wordml" xmlns:w15="http://schemas.microsoft.com/office/word/2012/wordml" xmlns:w16cex="http://schemas.microsoft.com/office/word/2018/wordml/cex" xmlns:w16cid="http://schemas.microsoft.com/office/word/2016/wordml/cid" xmlns:w16="http://schemas.microsoft.com/office/word/2018/wordml" xmlns:w16du="http://schemas.microsoft.com/office/word/2023/wordml/word16du" xmlns:w16sdtdh="http://schemas.microsoft.com/office/word/2020/wordml/sdtdatahash" xmlns:w16sdtfl="http://schemas.microsoft.com/office/word/2024/wordml/sdtformatlock" xmlns:w16se="http://schemas.microsoft.com/office/word/2015/wordml/symex" xmlns:wpg="http://schemas.microsoft.com/office/word/2010/wordprocessingGroup" xmlns:wpi="http://schemas.microsoft.com/office/word/2010/wordprocessingInk" xmlns:wne="http://schemas.microsoft.com/office/word/2006/wordml" xmlns:wps="http://schemas.microsoft.com/office/word/2010/wordprocessingShape" mc:Ignorable="w14 w15 w16se w16cid w16 w16cex w16sdtdh w16sdtfl w16du wp14">
-  <w:p>
-    <w:pPr>
-      <w:pStyle w:val="a9"/>
-      <w:rPr>
-        <w:rFonts w:ascii="Arial" w:hAnsi="Arial" w:cs="Arial"/>
-        <w:sz w:val="12"/>
-        <w:szCs w:val="12"/>
-      </w:rPr>
-    </w:pPr>
-    <w:r>
-      <w:rPr>
-        <w:rFonts w:ascii="Arial" w:hAnsi="Arial" w:cs="Arial"/>
-        <w:sz w:val="12"/>
-        <w:szCs w:val="12"/>
-      </w:rPr>
-      <w:t>Подготовлено с использованием системы ГАРАНТ</w:t>
-    </w:r>
-  </w:p>
-</w:hdr>
 </file>
 
 <file path=word/styles.xml><?xml version="1.0" encoding="utf-8"?>

</xml_diff>

<commit_message>
add new templates for documents
</commit_message>
<xml_diff>
--- a/patients/templates/patients/docs/card_IP_template.docx
+++ b/patients/templates/patients/docs/card_IP_template.docx
@@ -607,6 +607,7 @@
                 <w:lang w:val="en-US"/>
               </w:rPr>
             </w:pPr>
+            <w:proofErr w:type="gramStart"/>
             <w:r>
               <w:rPr>
                 <w:b/>
@@ -614,7 +615,17 @@
                 <w:szCs w:val="28"/>
                 <w:lang w:val="en-US"/>
               </w:rPr>
-              <w:t>{{ card_number_IP }}</w:t>
+              <w:t>{{ card</w:t>
+            </w:r>
+            <w:proofErr w:type="gramEnd"/>
+            <w:r>
+              <w:rPr>
+                <w:b/>
+                <w:sz w:val="28"/>
+                <w:szCs w:val="28"/>
+                <w:lang w:val="en-US"/>
+              </w:rPr>
+              <w:t>_number_IP }}</w:t>
             </w:r>
           </w:p>
         </w:tc>
@@ -751,12 +762,21 @@
                 <w:szCs w:val="20"/>
               </w:rPr>
             </w:pPr>
-            <w:r>
-              <w:rPr>
-                <w:sz w:val="20"/>
-                <w:szCs w:val="20"/>
-              </w:rPr>
-              <w:t>{{ c_day }}</w:t>
+            <w:proofErr w:type="gramStart"/>
+            <w:r>
+              <w:rPr>
+                <w:sz w:val="20"/>
+                <w:szCs w:val="20"/>
+              </w:rPr>
+              <w:t>{{ c</w:t>
+            </w:r>
+            <w:proofErr w:type="gramEnd"/>
+            <w:r>
+              <w:rPr>
+                <w:sz w:val="20"/>
+                <w:szCs w:val="20"/>
+              </w:rPr>
+              <w:t>_day }}</w:t>
             </w:r>
           </w:p>
         </w:tc>
@@ -801,6 +821,7 @@
                 <w:lang w:val="en-US"/>
               </w:rPr>
             </w:pPr>
+            <w:proofErr w:type="gramStart"/>
             <w:r>
               <w:rPr>
                 <w:sz w:val="20"/>
@@ -822,7 +843,15 @@
                 <w:sz w:val="20"/>
                 <w:szCs w:val="20"/>
               </w:rPr>
-              <w:t>cur_month_ru</w:t>
+              <w:t>cur</w:t>
+            </w:r>
+            <w:proofErr w:type="gramEnd"/>
+            <w:r>
+              <w:rPr>
+                <w:sz w:val="20"/>
+                <w:szCs w:val="20"/>
+              </w:rPr>
+              <w:t>_month_ru</w:t>
             </w:r>
             <w:r>
               <w:rPr>
@@ -882,6 +911,7 @@
                 <w:szCs w:val="20"/>
               </w:rPr>
             </w:pPr>
+            <w:proofErr w:type="gramStart"/>
             <w:r>
               <w:rPr>
                 <w:sz w:val="20"/>
@@ -894,7 +924,15 @@
                 <w:sz w:val="20"/>
                 <w:szCs w:val="20"/>
               </w:rPr>
-              <w:t>current_year</w:t>
+              <w:t>current</w:t>
+            </w:r>
+            <w:proofErr w:type="gramEnd"/>
+            <w:r>
+              <w:rPr>
+                <w:sz w:val="20"/>
+                <w:szCs w:val="20"/>
+              </w:rPr>
+              <w:t>_year</w:t>
             </w:r>
           </w:p>
           <w:p>
@@ -963,13 +1001,77 @@
                 <w:lang w:val="en-US"/>
               </w:rPr>
             </w:pPr>
+            <w:proofErr w:type="gramStart"/>
             <w:r>
               <w:rPr>
                 <w:sz w:val="20"/>
                 <w:szCs w:val="20"/>
                 <w:lang w:val="en-US"/>
               </w:rPr>
-              <w:t>{{ surname }} {{ first_name }} {{ last_name }}</w:t>
+              <w:t>{{ surname</w:t>
+            </w:r>
+            <w:proofErr w:type="gramEnd"/>
+            <w:r>
+              <w:rPr>
+                <w:sz w:val="20"/>
+                <w:szCs w:val="20"/>
+                <w:lang w:val="en-US"/>
+              </w:rPr>
+              <w:t xml:space="preserve"> }} </w:t>
+            </w:r>
+            <w:proofErr w:type="gramStart"/>
+            <w:r>
+              <w:rPr>
+                <w:sz w:val="20"/>
+                <w:szCs w:val="20"/>
+                <w:lang w:val="en-US"/>
+              </w:rPr>
+              <w:t>{{ first</w:t>
+            </w:r>
+            <w:proofErr w:type="gramEnd"/>
+            <w:r>
+              <w:rPr>
+                <w:sz w:val="20"/>
+                <w:szCs w:val="20"/>
+                <w:lang w:val="en-US"/>
+              </w:rPr>
+              <w:t>_</w:t>
+            </w:r>
+            <w:proofErr w:type="gramStart"/>
+            <w:r>
+              <w:rPr>
+                <w:sz w:val="20"/>
+                <w:szCs w:val="20"/>
+                <w:lang w:val="en-US"/>
+              </w:rPr>
+              <w:t>name }</w:t>
+            </w:r>
+            <w:proofErr w:type="gramEnd"/>
+            <w:r>
+              <w:rPr>
+                <w:sz w:val="20"/>
+                <w:szCs w:val="20"/>
+                <w:lang w:val="en-US"/>
+              </w:rPr>
+              <w:t xml:space="preserve">} </w:t>
+            </w:r>
+            <w:proofErr w:type="gramStart"/>
+            <w:r>
+              <w:rPr>
+                <w:sz w:val="20"/>
+                <w:szCs w:val="20"/>
+                <w:lang w:val="en-US"/>
+              </w:rPr>
+              <w:t>{{ last</w:t>
+            </w:r>
+            <w:proofErr w:type="gramEnd"/>
+            <w:r>
+              <w:rPr>
+                <w:sz w:val="20"/>
+                <w:szCs w:val="20"/>
+                <w:lang w:val="en-US"/>
+              </w:rPr>
+              <w:t>_name }}</w:t>
             </w:r>
           </w:p>
         </w:tc>
@@ -1028,12 +1130,21 @@
                 <w:szCs w:val="20"/>
               </w:rPr>
             </w:pPr>
-            <w:r>
-              <w:rPr>
-                <w:sz w:val="20"/>
-                <w:szCs w:val="20"/>
-              </w:rPr>
-              <w:t>{{ b_day }}</w:t>
+            <w:proofErr w:type="gramStart"/>
+            <w:r>
+              <w:rPr>
+                <w:sz w:val="20"/>
+                <w:szCs w:val="20"/>
+              </w:rPr>
+              <w:t>{{ b</w:t>
+            </w:r>
+            <w:proofErr w:type="gramEnd"/>
+            <w:r>
+              <w:rPr>
+                <w:sz w:val="20"/>
+                <w:szCs w:val="20"/>
+              </w:rPr>
+              <w:t>_day }}</w:t>
             </w:r>
           </w:p>
         </w:tc>
@@ -1074,12 +1185,21 @@
                 <w:szCs w:val="20"/>
               </w:rPr>
             </w:pPr>
-            <w:r>
-              <w:rPr>
-                <w:sz w:val="20"/>
-                <w:szCs w:val="20"/>
-              </w:rPr>
-              <w:t>{{ b_month_name }}</w:t>
+            <w:proofErr w:type="gramStart"/>
+            <w:r>
+              <w:rPr>
+                <w:sz w:val="20"/>
+                <w:szCs w:val="20"/>
+              </w:rPr>
+              <w:t>{{ b</w:t>
+            </w:r>
+            <w:proofErr w:type="gramEnd"/>
+            <w:r>
+              <w:rPr>
+                <w:sz w:val="20"/>
+                <w:szCs w:val="20"/>
+              </w:rPr>
+              <w:t>_month_name }}</w:t>
             </w:r>
           </w:p>
         </w:tc>
@@ -1116,12 +1236,21 @@
                 <w:szCs w:val="20"/>
               </w:rPr>
             </w:pPr>
-            <w:r>
-              <w:rPr>
-                <w:sz w:val="20"/>
-                <w:szCs w:val="20"/>
-              </w:rPr>
-              <w:t>{{ b_year }}</w:t>
+            <w:proofErr w:type="gramStart"/>
+            <w:r>
+              <w:rPr>
+                <w:sz w:val="20"/>
+                <w:szCs w:val="20"/>
+              </w:rPr>
+              <w:t>{{ b</w:t>
+            </w:r>
+            <w:proofErr w:type="gramEnd"/>
+            <w:r>
+              <w:rPr>
+                <w:sz w:val="20"/>
+                <w:szCs w:val="20"/>
+              </w:rPr>
+              <w:t>_year }}</w:t>
             </w:r>
           </w:p>
         </w:tc>
@@ -1143,7 +1272,15 @@
                 <w:sz w:val="20"/>
                 <w:szCs w:val="20"/>
               </w:rPr>
-              <w:t xml:space="preserve"> г. Пол</w:t>
+              <w:t xml:space="preserve"> г. </w:t>
+            </w:r>
+            <w:proofErr w:type="gramStart"/>
+            <w:r>
+              <w:rPr>
+                <w:sz w:val="20"/>
+                <w:szCs w:val="20"/>
+              </w:rPr>
+              <w:t>Пол</w:t>
             </w:r>
             <w:r>
               <w:rPr>
@@ -1175,7 +1312,37 @@
                 <w:u w:val="single"/>
                 <w:lang w:val="en-US"/>
               </w:rPr>
-              <w:t xml:space="preserve">{{ gender }}       </w:t>
+              <w:t>{{ gender</w:t>
+            </w:r>
+            <w:proofErr w:type="gramEnd"/>
+            <w:r>
+              <w:rPr>
+                <w:sz w:val="20"/>
+                <w:szCs w:val="20"/>
+                <w:u w:val="single"/>
+                <w:lang w:val="en-US"/>
+              </w:rPr>
+              <w:t xml:space="preserve"> </w:t>
+            </w:r>
+            <w:proofErr w:type="gramStart"/>
+            <w:r>
+              <w:rPr>
+                <w:sz w:val="20"/>
+                <w:szCs w:val="20"/>
+                <w:u w:val="single"/>
+                <w:lang w:val="en-US"/>
+              </w:rPr>
+              <w:t xml:space="preserve">}}   </w:t>
+            </w:r>
+            <w:proofErr w:type="gramEnd"/>
+            <w:r>
+              <w:rPr>
+                <w:sz w:val="20"/>
+                <w:szCs w:val="20"/>
+                <w:u w:val="single"/>
+                <w:lang w:val="en-US"/>
+              </w:rPr>
+              <w:t xml:space="preserve">    </w:t>
             </w:r>
             <w:r>
               <w:rPr>
@@ -1261,12 +1428,21 @@
                 <w:szCs w:val="20"/>
               </w:rPr>
             </w:pPr>
-            <w:r>
-              <w:rPr>
-                <w:sz w:val="20"/>
-                <w:szCs w:val="20"/>
-              </w:rPr>
-              <w:t>{{ passport }}</w:t>
+            <w:proofErr w:type="gramStart"/>
+            <w:r>
+              <w:rPr>
+                <w:sz w:val="20"/>
+                <w:szCs w:val="20"/>
+              </w:rPr>
+              <w:t>{{ passport</w:t>
+            </w:r>
+            <w:proofErr w:type="gramEnd"/>
+            <w:r>
+              <w:rPr>
+                <w:sz w:val="20"/>
+                <w:szCs w:val="20"/>
+              </w:rPr>
+              <w:t xml:space="preserve"> }}</w:t>
             </w:r>
           </w:p>
         </w:tc>
@@ -1309,12 +1485,21 @@
                 <w:szCs w:val="20"/>
               </w:rPr>
             </w:pPr>
-            <w:r>
-              <w:rPr>
-                <w:sz w:val="20"/>
-                <w:szCs w:val="20"/>
-              </w:rPr>
-              <w:t>{{ p_series }}</w:t>
+            <w:proofErr w:type="gramStart"/>
+            <w:r>
+              <w:rPr>
+                <w:sz w:val="20"/>
+                <w:szCs w:val="20"/>
+              </w:rPr>
+              <w:t>{{ p</w:t>
+            </w:r>
+            <w:proofErr w:type="gramEnd"/>
+            <w:r>
+              <w:rPr>
+                <w:sz w:val="20"/>
+                <w:szCs w:val="20"/>
+              </w:rPr>
+              <w:t>_series }}</w:t>
             </w:r>
           </w:p>
         </w:tc>
@@ -1357,12 +1542,21 @@
                 <w:szCs w:val="20"/>
               </w:rPr>
             </w:pPr>
-            <w:r>
-              <w:rPr>
-                <w:sz w:val="20"/>
-                <w:szCs w:val="20"/>
-              </w:rPr>
-              <w:t>{{ p_number }}</w:t>
+            <w:proofErr w:type="gramStart"/>
+            <w:r>
+              <w:rPr>
+                <w:sz w:val="20"/>
+                <w:szCs w:val="20"/>
+              </w:rPr>
+              <w:t>{{ p</w:t>
+            </w:r>
+            <w:proofErr w:type="gramEnd"/>
+            <w:r>
+              <w:rPr>
+                <w:sz w:val="20"/>
+                <w:szCs w:val="20"/>
+              </w:rPr>
+              <w:t>_number }}</w:t>
             </w:r>
           </w:p>
         </w:tc>
@@ -1414,12 +1608,21 @@
                 <w:szCs w:val="20"/>
               </w:rPr>
             </w:pPr>
-            <w:r>
-              <w:rPr>
-                <w:sz w:val="20"/>
-                <w:szCs w:val="20"/>
-              </w:rPr>
-              <w:t>{{ phone_number }}</w:t>
+            <w:proofErr w:type="gramStart"/>
+            <w:r>
+              <w:rPr>
+                <w:sz w:val="20"/>
+                <w:szCs w:val="20"/>
+              </w:rPr>
+              <w:t>{{ phone</w:t>
+            </w:r>
+            <w:proofErr w:type="gramEnd"/>
+            <w:r>
+              <w:rPr>
+                <w:sz w:val="20"/>
+                <w:szCs w:val="20"/>
+              </w:rPr>
+              <w:t>_number }}</w:t>
             </w:r>
           </w:p>
         </w:tc>
@@ -1512,12 +1715,21 @@
                 <w:szCs w:val="20"/>
               </w:rPr>
             </w:pPr>
-            <w:r>
-              <w:rPr>
-                <w:sz w:val="20"/>
-                <w:szCs w:val="20"/>
-              </w:rPr>
-              <w:t>{{ area }}</w:t>
+            <w:proofErr w:type="gramStart"/>
+            <w:r>
+              <w:rPr>
+                <w:sz w:val="20"/>
+                <w:szCs w:val="20"/>
+              </w:rPr>
+              <w:t>{{ area</w:t>
+            </w:r>
+            <w:proofErr w:type="gramEnd"/>
+            <w:r>
+              <w:rPr>
+                <w:sz w:val="20"/>
+                <w:szCs w:val="20"/>
+              </w:rPr>
+              <w:t xml:space="preserve"> }}</w:t>
             </w:r>
           </w:p>
         </w:tc>
@@ -1565,12 +1777,21 @@
                 <w:szCs w:val="20"/>
               </w:rPr>
             </w:pPr>
-            <w:r>
-              <w:rPr>
-                <w:sz w:val="20"/>
-                <w:szCs w:val="20"/>
-              </w:rPr>
-              <w:t>{{ district }}</w:t>
+            <w:proofErr w:type="gramStart"/>
+            <w:r>
+              <w:rPr>
+                <w:sz w:val="20"/>
+                <w:szCs w:val="20"/>
+              </w:rPr>
+              <w:t>{{ district</w:t>
+            </w:r>
+            <w:proofErr w:type="gramEnd"/>
+            <w:r>
+              <w:rPr>
+                <w:sz w:val="20"/>
+                <w:szCs w:val="20"/>
+              </w:rPr>
+              <w:t xml:space="preserve"> }}</w:t>
             </w:r>
           </w:p>
         </w:tc>
@@ -1613,12 +1834,21 @@
                 <w:szCs w:val="20"/>
               </w:rPr>
             </w:pPr>
-            <w:r>
-              <w:rPr>
-                <w:sz w:val="20"/>
-                <w:szCs w:val="20"/>
-              </w:rPr>
-              <w:t>{{ locality }}</w:t>
+            <w:proofErr w:type="gramStart"/>
+            <w:r>
+              <w:rPr>
+                <w:sz w:val="20"/>
+                <w:szCs w:val="20"/>
+              </w:rPr>
+              <w:t>{{ locality</w:t>
+            </w:r>
+            <w:proofErr w:type="gramEnd"/>
+            <w:r>
+              <w:rPr>
+                <w:sz w:val="20"/>
+                <w:szCs w:val="20"/>
+              </w:rPr>
+              <w:t xml:space="preserve"> }}</w:t>
             </w:r>
           </w:p>
         </w:tc>
@@ -1669,12 +1899,21 @@
                 <w:szCs w:val="20"/>
               </w:rPr>
             </w:pPr>
-            <w:r>
-              <w:rPr>
-                <w:sz w:val="20"/>
-                <w:szCs w:val="20"/>
-              </w:rPr>
-              <w:t>{{ street }}</w:t>
+            <w:proofErr w:type="gramStart"/>
+            <w:r>
+              <w:rPr>
+                <w:sz w:val="20"/>
+                <w:szCs w:val="20"/>
+              </w:rPr>
+              <w:t>{{ street</w:t>
+            </w:r>
+            <w:proofErr w:type="gramEnd"/>
+            <w:r>
+              <w:rPr>
+                <w:sz w:val="20"/>
+                <w:szCs w:val="20"/>
+              </w:rPr>
+              <w:t xml:space="preserve"> }}</w:t>
             </w:r>
           </w:p>
         </w:tc>
@@ -1717,12 +1956,21 @@
                 <w:szCs w:val="20"/>
               </w:rPr>
             </w:pPr>
-            <w:r>
-              <w:rPr>
-                <w:sz w:val="20"/>
-                <w:szCs w:val="20"/>
-              </w:rPr>
-              <w:t>{{ home }}</w:t>
+            <w:proofErr w:type="gramStart"/>
+            <w:r>
+              <w:rPr>
+                <w:sz w:val="20"/>
+                <w:szCs w:val="20"/>
+              </w:rPr>
+              <w:t>{{ home</w:t>
+            </w:r>
+            <w:proofErr w:type="gramEnd"/>
+            <w:r>
+              <w:rPr>
+                <w:sz w:val="20"/>
+                <w:szCs w:val="20"/>
+              </w:rPr>
+              <w:t xml:space="preserve"> }}</w:t>
             </w:r>
           </w:p>
         </w:tc>
@@ -1766,12 +2014,21 @@
                 <w:szCs w:val="20"/>
               </w:rPr>
             </w:pPr>
-            <w:r>
-              <w:rPr>
-                <w:sz w:val="20"/>
-                <w:szCs w:val="20"/>
-              </w:rPr>
-              <w:t>{{ building }}</w:t>
+            <w:proofErr w:type="gramStart"/>
+            <w:r>
+              <w:rPr>
+                <w:sz w:val="20"/>
+                <w:szCs w:val="20"/>
+              </w:rPr>
+              <w:t>{{ building</w:t>
+            </w:r>
+            <w:proofErr w:type="gramEnd"/>
+            <w:r>
+              <w:rPr>
+                <w:sz w:val="20"/>
+                <w:szCs w:val="20"/>
+              </w:rPr>
+              <w:t xml:space="preserve"> }}</w:t>
             </w:r>
           </w:p>
         </w:tc>
@@ -1814,12 +2071,21 @@
                 <w:szCs w:val="20"/>
               </w:rPr>
             </w:pPr>
-            <w:r>
-              <w:rPr>
-                <w:sz w:val="20"/>
-                <w:szCs w:val="20"/>
-              </w:rPr>
-              <w:t>{{ apartment }}</w:t>
+            <w:proofErr w:type="gramStart"/>
+            <w:r>
+              <w:rPr>
+                <w:sz w:val="20"/>
+                <w:szCs w:val="20"/>
+              </w:rPr>
+              <w:t>{{ apartment</w:t>
+            </w:r>
+            <w:proofErr w:type="gramEnd"/>
+            <w:r>
+              <w:rPr>
+                <w:sz w:val="20"/>
+                <w:szCs w:val="20"/>
+              </w:rPr>
+              <w:t xml:space="preserve"> }}</w:t>
             </w:r>
           </w:p>
         </w:tc>
@@ -5182,9 +5448,1943 @@
         </w:rPr>
       </w:pPr>
     </w:p>
+    <w:p>
+      <w:pPr>
+        <w:rPr>
+          <w:sz w:val="20"/>
+          <w:szCs w:val="20"/>
+        </w:rPr>
+      </w:pPr>
+      <w:r>
+        <w:rPr>
+          <w:sz w:val="20"/>
+          <w:szCs w:val="20"/>
+        </w:rPr>
+        <w:br w:type="page"/>
+      </w:r>
+    </w:p>
+    <w:p>
+      <w:pPr>
+        <w:pStyle w:val="af3"/>
+        <w:tabs>
+          <w:tab w:val="left" w:pos="765"/>
+          <w:tab w:val="left" w:pos="1725"/>
+          <w:tab w:val="left" w:leader="underscore" w:pos="7372"/>
+        </w:tabs>
+        <w:spacing w:line="100" w:lineRule="atLeast"/>
+        <w:ind w:firstLine="360"/>
+        <w:jc w:val="center"/>
+        <w:rPr>
+          <w:b/>
+          <w:bCs/>
+          <w:sz w:val="28"/>
+          <w:szCs w:val="28"/>
+          <w:lang w:val="ru-RU"/>
+        </w:rPr>
+      </w:pPr>
+      <w:r>
+        <w:rPr>
+          <w:b/>
+          <w:bCs/>
+          <w:sz w:val="28"/>
+          <w:szCs w:val="28"/>
+          <w:lang w:val="ru-RU"/>
+        </w:rPr>
+        <w:lastRenderedPageBreak/>
+        <w:t>ИП Епифанова Ольга Евгеньевна</w:t>
+      </w:r>
+    </w:p>
+    <w:tbl>
+      <w:tblPr>
+        <w:tblStyle w:val="ad"/>
+        <w:tblW w:w="10191" w:type="dxa"/>
+        <w:tblInd w:w="14" w:type="dxa"/>
+        <w:tblBorders>
+          <w:top w:val="none" w:sz="0" w:space="0" w:color="auto"/>
+          <w:left w:val="none" w:sz="0" w:space="0" w:color="auto"/>
+          <w:bottom w:val="none" w:sz="0" w:space="0" w:color="auto"/>
+          <w:right w:val="none" w:sz="0" w:space="0" w:color="auto"/>
+          <w:insideH w:val="none" w:sz="0" w:space="0" w:color="auto"/>
+          <w:insideV w:val="none" w:sz="0" w:space="0" w:color="auto"/>
+        </w:tblBorders>
+        <w:tblCellMar>
+          <w:left w:w="0" w:type="dxa"/>
+          <w:right w:w="0" w:type="dxa"/>
+        </w:tblCellMar>
+        <w:tblLook w:val="04A0" w:firstRow="1" w:lastRow="0" w:firstColumn="1" w:lastColumn="0" w:noHBand="0" w:noVBand="1"/>
+      </w:tblPr>
+      <w:tblGrid>
+        <w:gridCol w:w="10191"/>
+      </w:tblGrid>
+      <w:tr>
+        <w:tc>
+          <w:tcPr>
+            <w:tcW w:w="5110" w:type="dxa"/>
+            <w:tcBorders>
+              <w:bottom w:val="single" w:sz="4" w:space="0" w:color="auto"/>
+            </w:tcBorders>
+            <w:vAlign w:val="bottom"/>
+          </w:tcPr>
+          <w:p>
+            <w:pPr>
+              <w:jc w:val="center"/>
+            </w:pPr>
+            <w:r>
+              <w:rPr>
+                <w:lang w:val="en-US" w:eastAsia="zh-CN"/>
+              </w:rPr>
+              <w:t>ОГРНИП</w:t>
+            </w:r>
+            <w:r>
+              <w:rPr>
+                <w:lang w:eastAsia="zh-CN"/>
+              </w:rPr>
+              <w:t xml:space="preserve"> </w:t>
+            </w:r>
+            <w:r>
+              <w:rPr>
+                <w:rFonts w:eastAsia="SimSun"/>
+                <w:lang w:val="en-US" w:eastAsia="zh-CN" w:bidi="ar"/>
+              </w:rPr>
+              <w:t>325110000011898</w:t>
+            </w:r>
+          </w:p>
+        </w:tc>
+      </w:tr>
+      <w:tr>
+        <w:tc>
+          <w:tcPr>
+            <w:tcW w:w="5110" w:type="dxa"/>
+            <w:tcBorders>
+              <w:top w:val="single" w:sz="4" w:space="0" w:color="auto"/>
+              <w:bottom w:val="single" w:sz="4" w:space="0" w:color="auto"/>
+            </w:tcBorders>
+            <w:vAlign w:val="bottom"/>
+          </w:tcPr>
+          <w:p>
+            <w:pPr>
+              <w:jc w:val="center"/>
+            </w:pPr>
+            <w:r>
+              <w:t>ИНН 110101793309</w:t>
+            </w:r>
+          </w:p>
+        </w:tc>
+      </w:tr>
+    </w:tbl>
+    <w:p>
+      <w:pPr>
+        <w:pStyle w:val="af3"/>
+        <w:tabs>
+          <w:tab w:val="left" w:pos="765"/>
+          <w:tab w:val="left" w:pos="1725"/>
+          <w:tab w:val="left" w:leader="underscore" w:pos="7372"/>
+        </w:tabs>
+        <w:spacing w:line="100" w:lineRule="atLeast"/>
+        <w:ind w:firstLine="360"/>
+        <w:jc w:val="right"/>
+        <w:rPr>
+          <w:b/>
+          <w:bCs/>
+          <w:sz w:val="24"/>
+          <w:szCs w:val="24"/>
+          <w:lang w:val="ru-RU"/>
+        </w:rPr>
+      </w:pPr>
+    </w:p>
+    <w:p>
+      <w:pPr>
+        <w:pStyle w:val="af3"/>
+        <w:tabs>
+          <w:tab w:val="left" w:pos="765"/>
+          <w:tab w:val="left" w:pos="1725"/>
+          <w:tab w:val="left" w:leader="underscore" w:pos="7372"/>
+        </w:tabs>
+        <w:spacing w:line="100" w:lineRule="atLeast"/>
+        <w:jc w:val="center"/>
+        <w:rPr>
+          <w:lang w:val="ru-RU"/>
+        </w:rPr>
+      </w:pPr>
+      <w:r>
+        <w:rPr>
+          <w:rStyle w:val="11"/>
+          <w:rFonts w:ascii="Times New Roman" w:hAnsi="Times New Roman"/>
+          <w:b/>
+          <w:color w:val="000000"/>
+          <w:lang w:val="ru-RU"/>
+        </w:rPr>
+        <w:t xml:space="preserve">Информированное добровольное </w:t>
+      </w:r>
+      <w:proofErr w:type="gramStart"/>
+      <w:r>
+        <w:rPr>
+          <w:rStyle w:val="11"/>
+          <w:rFonts w:ascii="Times New Roman" w:hAnsi="Times New Roman"/>
+          <w:b/>
+          <w:color w:val="000000"/>
+          <w:lang w:val="ru-RU"/>
+        </w:rPr>
+        <w:t>согласие  на</w:t>
+      </w:r>
+      <w:proofErr w:type="gramEnd"/>
+      <w:r>
+        <w:rPr>
+          <w:rStyle w:val="11"/>
+          <w:rFonts w:ascii="Times New Roman" w:hAnsi="Times New Roman"/>
+          <w:b/>
+          <w:color w:val="000000"/>
+          <w:lang w:val="ru-RU"/>
+        </w:rPr>
+        <w:t xml:space="preserve"> обработку персональных данных</w:t>
+      </w:r>
+    </w:p>
+    <w:p>
+      <w:pPr>
+        <w:pStyle w:val="af3"/>
+        <w:tabs>
+          <w:tab w:val="left" w:pos="163"/>
+        </w:tabs>
+        <w:spacing w:after="0" w:line="312" w:lineRule="auto"/>
+        <w:ind w:firstLineChars="200" w:firstLine="440"/>
+        <w:jc w:val="both"/>
+        <w:rPr>
+          <w:sz w:val="22"/>
+          <w:szCs w:val="22"/>
+          <w:lang w:val="ru-RU"/>
+        </w:rPr>
+      </w:pPr>
+      <w:r>
+        <w:rPr>
+          <w:rFonts w:ascii="Times New Roman" w:hAnsi="Times New Roman"/>
+          <w:sz w:val="22"/>
+          <w:szCs w:val="22"/>
+          <w:lang w:val="ru-RU"/>
+        </w:rPr>
+        <w:t xml:space="preserve">В соответствии с требованиями статьи 9 федерального закона от 27.07.06 г. «О персональных данных» № 152-ФЗ я, </w:t>
+      </w:r>
+      <w:r>
+        <w:rPr>
+          <w:rFonts w:ascii="Times New Roman" w:hAnsi="Times New Roman"/>
+          <w:b/>
+          <w:bCs/>
+          <w:sz w:val="22"/>
+          <w:szCs w:val="22"/>
+          <w:lang w:val="ru-RU"/>
+        </w:rPr>
+        <w:t>{{ surname }} {{ first_name }} {{ last_name }}</w:t>
+      </w:r>
+      <w:r>
+        <w:rPr>
+          <w:rFonts w:ascii="Times New Roman" w:hAnsi="Times New Roman"/>
+          <w:sz w:val="22"/>
+          <w:szCs w:val="22"/>
+          <w:lang w:val="ru-RU"/>
+        </w:rPr>
+        <w:t xml:space="preserve">,  подтверждаю своё согласие на обработку </w:t>
+      </w:r>
+      <w:r>
+        <w:rPr>
+          <w:rFonts w:ascii="Times New Roman" w:hAnsi="Times New Roman"/>
+          <w:b/>
+          <w:bCs/>
+          <w:sz w:val="22"/>
+          <w:szCs w:val="22"/>
+          <w:lang w:val="ru-RU"/>
+        </w:rPr>
+        <w:t>ИП Епифанова Ольга Евгеньевна</w:t>
+      </w:r>
+      <w:r>
+        <w:rPr>
+          <w:rFonts w:ascii="Times New Roman" w:hAnsi="Times New Roman"/>
+          <w:sz w:val="22"/>
+          <w:szCs w:val="22"/>
+          <w:lang w:val="ru-RU"/>
+        </w:rPr>
+        <w:t xml:space="preserve"> (далее - Оператор) моих персональных данных, включающих фамилию, имя, отчество, пол, дату рождения, адрес места жительства, профессия, образование, семейное положение, контактный(е) телефон(ы), реквизиты полиса ОМС (ДМС), страховой номер индивидуального лицевого счёта в Пенсионном фонде России (СНИЛС), данные о состоянии здоровья, заболеваниях, случаях обращения за медицинской помощью — в медико-профилактических целях, в целях установления медицинского диагноза и оказания медицинских услуг при условии, что их обработка осуществляется лицом, профессионально занимающимся медицинской деятельностью и обязанным сохранять врачебную тайну. В процессе оказания Оператором медицинской помощи я предоставляю право медицинским работникам передавать мои персональные данные, содержащие сведения, составляющие врачебную тайну, другим должностным лицам Оператора, в интересах моего обследования и лечения (обследования и лечения несовершеннолетнего пациента/лица, признанного недееспособным). Предоставляю Оператору право осуществлять все действия (операции) с моими персональными данными, включая сбор, систематизацию, накопление, хранение, обновление, изменение, использование, обезличивание, блокирование, уничтожение. Оператор вправе обрабатывать вышеуказанные персональные данные посредством внесения их в электронную базу данных, включения в списки (реестры) и отчётные формы, предусмотренные документами, регламентирующими предоставление отчётных данных (документов) по ОМС (договором ДМС).</w:t>
+      </w:r>
+    </w:p>
+    <w:p>
+      <w:pPr>
+        <w:pStyle w:val="af3"/>
+        <w:tabs>
+          <w:tab w:val="left" w:pos="163"/>
+        </w:tabs>
+        <w:spacing w:after="0" w:line="312" w:lineRule="auto"/>
+        <w:ind w:firstLineChars="200" w:firstLine="440"/>
+        <w:jc w:val="both"/>
+        <w:rPr>
+          <w:rStyle w:val="blk"/>
+          <w:rFonts w:ascii="Times New Roman" w:hAnsi="Times New Roman"/>
+          <w:sz w:val="22"/>
+          <w:szCs w:val="22"/>
+          <w:lang w:val="ru-RU"/>
+        </w:rPr>
+      </w:pPr>
+      <w:r>
+        <w:rPr>
+          <w:rFonts w:ascii="Times New Roman" w:hAnsi="Times New Roman"/>
+          <w:sz w:val="22"/>
+          <w:szCs w:val="22"/>
+          <w:lang w:val="ru-RU"/>
+        </w:rPr>
+        <w:t xml:space="preserve">Я даю своё согласие на то, что вышеуказанные персональные данные могут быть переданы в Минздрав РК, Росздравнадзор, Роспотребнадзор, страховые медицинские организации, в иные ЛПУ и другие организации как с применением средств автоматизации, так и без их применения в связи с организацией оказания медицинской помощи, осуществления контроля качества ее оказания, а также в соответствии с действующим законодательством в Фонд социального страхования России и в медицинскую организацию, выбранную мной согласно ст. 21 Федерального закона "Об основах охраны здоровья граждан в Российской Федерации" от 21.11.2011 N 323-ФЗ </w:t>
+      </w:r>
+      <w:r>
+        <w:rPr>
+          <w:rStyle w:val="blk"/>
+          <w:rFonts w:ascii="Times New Roman" w:hAnsi="Times New Roman"/>
+          <w:sz w:val="22"/>
+          <w:szCs w:val="22"/>
+          <w:lang w:val="ru-RU"/>
+        </w:rPr>
+        <w:t xml:space="preserve">для получения первичной медико-санитарной помощи в рамках ОМС. </w:t>
+      </w:r>
+    </w:p>
+    <w:p>
+      <w:pPr>
+        <w:pStyle w:val="af3"/>
+        <w:tabs>
+          <w:tab w:val="left" w:pos="163"/>
+        </w:tabs>
+        <w:spacing w:after="0" w:line="312" w:lineRule="auto"/>
+        <w:ind w:firstLineChars="200" w:firstLine="440"/>
+        <w:jc w:val="both"/>
+        <w:rPr>
+          <w:sz w:val="22"/>
+          <w:szCs w:val="22"/>
+          <w:lang w:val="ru-RU"/>
+        </w:rPr>
+      </w:pPr>
+      <w:r>
+        <w:rPr>
+          <w:rStyle w:val="blk"/>
+          <w:rFonts w:ascii="Times New Roman" w:hAnsi="Times New Roman"/>
+          <w:sz w:val="22"/>
+          <w:szCs w:val="22"/>
+          <w:lang w:val="ru-RU"/>
+        </w:rPr>
+        <w:t>Подтверждаю, что до заключения договора об оказании платных услуг мне была предоставлена информация о возможности получения соответствующих видов и объёмов медицинской помощи без взимания платы в рамках программы государственных гарантий бесплатного оказания гражданам медицинской помощи и территориальной программы государственных гарантий бесплатного оказания гражданам медицинской помощи.</w:t>
+      </w:r>
+    </w:p>
+    <w:p>
+      <w:pPr>
+        <w:pStyle w:val="af3"/>
+        <w:tabs>
+          <w:tab w:val="left" w:pos="163"/>
+        </w:tabs>
+        <w:spacing w:after="0" w:line="312" w:lineRule="auto"/>
+        <w:ind w:firstLineChars="200" w:firstLine="440"/>
+        <w:jc w:val="both"/>
+        <w:rPr>
+          <w:rFonts w:ascii="Times New Roman" w:hAnsi="Times New Roman"/>
+          <w:sz w:val="22"/>
+          <w:szCs w:val="22"/>
+          <w:lang w:val="ru-RU"/>
+        </w:rPr>
+      </w:pPr>
+      <w:r>
+        <w:rPr>
+          <w:rFonts w:ascii="Times New Roman" w:hAnsi="Times New Roman"/>
+          <w:sz w:val="22"/>
+          <w:szCs w:val="22"/>
+          <w:lang w:val="ru-RU"/>
+        </w:rPr>
+        <w:t xml:space="preserve">Настоящее согласие на обработку персональных данных дано мной и действует с </w:t>
+      </w:r>
+      <w:r>
+        <w:rPr>
+          <w:rFonts w:ascii="Times New Roman" w:hAnsi="Times New Roman"/>
+          <w:sz w:val="22"/>
+          <w:szCs w:val="22"/>
+          <w:lang w:val="ru-RU"/>
+        </w:rPr>
+        <w:t>«</w:t>
+      </w:r>
+      <w:proofErr w:type="gramStart"/>
+      <w:r>
+        <w:rPr>
+          <w:rFonts w:ascii="Times New Roman" w:hAnsi="Times New Roman"/>
+          <w:sz w:val="22"/>
+          <w:szCs w:val="22"/>
+          <w:lang w:val="ru-RU"/>
+        </w:rPr>
+        <w:t xml:space="preserve">{{ </w:t>
+      </w:r>
+      <w:r>
+        <w:rPr>
+          <w:rFonts w:ascii="Times New Roman" w:hAnsi="Times New Roman"/>
+          <w:sz w:val="22"/>
+          <w:szCs w:val="22"/>
+        </w:rPr>
+        <w:t>c</w:t>
+      </w:r>
+      <w:proofErr w:type="gramEnd"/>
+      <w:r>
+        <w:rPr>
+          <w:rFonts w:ascii="Times New Roman" w:hAnsi="Times New Roman"/>
+          <w:sz w:val="22"/>
+          <w:szCs w:val="22"/>
+          <w:lang w:val="ru-RU"/>
+        </w:rPr>
+        <w:t>_</w:t>
+      </w:r>
+      <w:proofErr w:type="gramStart"/>
+      <w:r>
+        <w:rPr>
+          <w:rFonts w:ascii="Times New Roman" w:hAnsi="Times New Roman"/>
+          <w:sz w:val="22"/>
+          <w:szCs w:val="22"/>
+        </w:rPr>
+        <w:t>day</w:t>
+      </w:r>
+      <w:r>
+        <w:rPr>
+          <w:rFonts w:ascii="Times New Roman" w:hAnsi="Times New Roman"/>
+          <w:sz w:val="22"/>
+          <w:szCs w:val="22"/>
+          <w:lang w:val="ru-RU"/>
+        </w:rPr>
+        <w:t xml:space="preserve"> }</w:t>
+      </w:r>
+      <w:proofErr w:type="gramEnd"/>
+      <w:r>
+        <w:rPr>
+          <w:rFonts w:ascii="Times New Roman" w:hAnsi="Times New Roman"/>
+          <w:sz w:val="22"/>
+          <w:szCs w:val="22"/>
+          <w:lang w:val="ru-RU"/>
+        </w:rPr>
+        <w:t xml:space="preserve">}» </w:t>
+      </w:r>
+      <w:proofErr w:type="gramStart"/>
+      <w:r>
+        <w:rPr>
+          <w:rFonts w:ascii="Times New Roman" w:hAnsi="Times New Roman"/>
+          <w:sz w:val="22"/>
+          <w:szCs w:val="22"/>
+          <w:lang w:val="ru-RU"/>
+        </w:rPr>
+        <w:t xml:space="preserve">{{ </w:t>
+      </w:r>
+      <w:r>
+        <w:rPr>
+          <w:rFonts w:ascii="Times New Roman" w:hAnsi="Times New Roman"/>
+          <w:sz w:val="22"/>
+          <w:szCs w:val="22"/>
+        </w:rPr>
+        <w:t>cur</w:t>
+      </w:r>
+      <w:proofErr w:type="gramEnd"/>
+      <w:r>
+        <w:rPr>
+          <w:rFonts w:ascii="Times New Roman" w:hAnsi="Times New Roman"/>
+          <w:sz w:val="22"/>
+          <w:szCs w:val="22"/>
+          <w:lang w:val="ru-RU"/>
+        </w:rPr>
+        <w:t>_</w:t>
+      </w:r>
+      <w:r>
+        <w:rPr>
+          <w:rFonts w:ascii="Times New Roman" w:hAnsi="Times New Roman"/>
+          <w:sz w:val="22"/>
+          <w:szCs w:val="22"/>
+        </w:rPr>
+        <w:t>month</w:t>
+      </w:r>
+      <w:r>
+        <w:rPr>
+          <w:rFonts w:ascii="Times New Roman" w:hAnsi="Times New Roman"/>
+          <w:sz w:val="22"/>
+          <w:szCs w:val="22"/>
+          <w:lang w:val="ru-RU"/>
+        </w:rPr>
+        <w:t>_</w:t>
+      </w:r>
+      <w:proofErr w:type="gramStart"/>
+      <w:r>
+        <w:rPr>
+          <w:rFonts w:ascii="Times New Roman" w:hAnsi="Times New Roman"/>
+          <w:sz w:val="22"/>
+          <w:szCs w:val="22"/>
+        </w:rPr>
+        <w:t>ru</w:t>
+      </w:r>
+      <w:r>
+        <w:rPr>
+          <w:rFonts w:ascii="Times New Roman" w:hAnsi="Times New Roman"/>
+          <w:sz w:val="22"/>
+          <w:szCs w:val="22"/>
+          <w:lang w:val="ru-RU"/>
+        </w:rPr>
+        <w:t xml:space="preserve"> }</w:t>
+      </w:r>
+      <w:proofErr w:type="gramEnd"/>
+      <w:r>
+        <w:rPr>
+          <w:rFonts w:ascii="Times New Roman" w:hAnsi="Times New Roman"/>
+          <w:sz w:val="22"/>
+          <w:szCs w:val="22"/>
+          <w:lang w:val="ru-RU"/>
+        </w:rPr>
+        <w:t xml:space="preserve">} </w:t>
+      </w:r>
+      <w:proofErr w:type="gramStart"/>
+      <w:r>
+        <w:rPr>
+          <w:rFonts w:ascii="Times New Roman" w:hAnsi="Times New Roman"/>
+          <w:sz w:val="22"/>
+          <w:szCs w:val="22"/>
+          <w:lang w:val="ru-RU"/>
+        </w:rPr>
+        <w:t xml:space="preserve">{{ </w:t>
+      </w:r>
+      <w:r>
+        <w:rPr>
+          <w:rFonts w:ascii="Times New Roman" w:hAnsi="Times New Roman"/>
+          <w:sz w:val="22"/>
+          <w:szCs w:val="22"/>
+        </w:rPr>
+        <w:t>current</w:t>
+      </w:r>
+      <w:proofErr w:type="gramEnd"/>
+      <w:r>
+        <w:rPr>
+          <w:rFonts w:ascii="Times New Roman" w:hAnsi="Times New Roman"/>
+          <w:sz w:val="22"/>
+          <w:szCs w:val="22"/>
+          <w:lang w:val="ru-RU"/>
+        </w:rPr>
+        <w:t>_</w:t>
+      </w:r>
+      <w:proofErr w:type="gramStart"/>
+      <w:r>
+        <w:rPr>
+          <w:rFonts w:ascii="Times New Roman" w:hAnsi="Times New Roman"/>
+          <w:sz w:val="22"/>
+          <w:szCs w:val="22"/>
+        </w:rPr>
+        <w:t>year</w:t>
+      </w:r>
+      <w:r>
+        <w:rPr>
+          <w:rFonts w:ascii="Times New Roman" w:hAnsi="Times New Roman"/>
+          <w:sz w:val="22"/>
+          <w:szCs w:val="22"/>
+          <w:lang w:val="ru-RU"/>
+        </w:rPr>
+        <w:t xml:space="preserve"> }}</w:t>
+      </w:r>
+      <w:r>
+        <w:rPr>
+          <w:rFonts w:ascii="Times New Roman" w:hAnsi="Times New Roman"/>
+          <w:sz w:val="22"/>
+          <w:szCs w:val="22"/>
+          <w:lang w:val="ru-RU"/>
+        </w:rPr>
+        <w:t>г.</w:t>
+      </w:r>
+      <w:proofErr w:type="gramEnd"/>
+      <w:r>
+        <w:rPr>
+          <w:rFonts w:ascii="Times New Roman" w:hAnsi="Times New Roman"/>
+          <w:sz w:val="22"/>
+          <w:szCs w:val="22"/>
+          <w:lang w:val="ru-RU"/>
+        </w:rPr>
+        <w:t xml:space="preserve"> до минования надобности. Я оставляю за собой право отозвать своё согласие на обработку персональных данных посредством составления соответствующего письменного документа, который может быть направлен мной в адрес Оператора по почте заказным письмом с уведомлением о вручении либо вручён лично под расписку представителю Оператора. В случае получения моего письменного заявления об отзыве настоящего согласия на обработку персональных данных Оператор обязан прекратить их обработку в течение периода времени, необходимого для завершения взаиморасчетов </w:t>
+      </w:r>
+      <w:proofErr w:type="gramStart"/>
+      <w:r>
+        <w:rPr>
+          <w:rFonts w:ascii="Times New Roman" w:hAnsi="Times New Roman"/>
+          <w:sz w:val="22"/>
+          <w:szCs w:val="22"/>
+          <w:lang w:val="ru-RU"/>
+        </w:rPr>
+        <w:t>по оплате</w:t>
+      </w:r>
+      <w:proofErr w:type="gramEnd"/>
+      <w:r>
+        <w:rPr>
+          <w:rFonts w:ascii="Times New Roman" w:hAnsi="Times New Roman"/>
+          <w:sz w:val="22"/>
+          <w:szCs w:val="22"/>
+          <w:lang w:val="ru-RU"/>
+        </w:rPr>
+        <w:t xml:space="preserve"> оказанной мне (несовершеннолетнему пациенту/лицу, признанному недееспособным) до этого медицинской помощи.</w:t>
+      </w:r>
+    </w:p>
+    <w:p>
+      <w:pPr>
+        <w:pStyle w:val="af3"/>
+        <w:tabs>
+          <w:tab w:val="left" w:pos="163"/>
+        </w:tabs>
+        <w:spacing w:after="0" w:line="312" w:lineRule="auto"/>
+        <w:ind w:firstLineChars="200" w:firstLine="440"/>
+        <w:jc w:val="both"/>
+        <w:rPr>
+          <w:sz w:val="22"/>
+          <w:szCs w:val="22"/>
+          <w:lang w:val="ru-RU"/>
+        </w:rPr>
+      </w:pPr>
+    </w:p>
+    <w:tbl>
+      <w:tblPr>
+        <w:tblStyle w:val="ad"/>
+        <w:tblW w:w="0" w:type="auto"/>
+        <w:tblBorders>
+          <w:top w:val="none" w:sz="0" w:space="0" w:color="auto"/>
+          <w:left w:val="none" w:sz="0" w:space="0" w:color="auto"/>
+          <w:bottom w:val="none" w:sz="0" w:space="0" w:color="auto"/>
+          <w:right w:val="none" w:sz="0" w:space="0" w:color="auto"/>
+          <w:insideH w:val="none" w:sz="0" w:space="0" w:color="auto"/>
+          <w:insideV w:val="none" w:sz="0" w:space="0" w:color="auto"/>
+        </w:tblBorders>
+        <w:tblLook w:val="04A0" w:firstRow="1" w:lastRow="0" w:firstColumn="1" w:lastColumn="0" w:noHBand="0" w:noVBand="1"/>
+      </w:tblPr>
+      <w:tblGrid>
+        <w:gridCol w:w="3387"/>
+        <w:gridCol w:w="7101"/>
+      </w:tblGrid>
+      <w:tr>
+        <w:tc>
+          <w:tcPr>
+            <w:tcW w:w="3402" w:type="dxa"/>
+          </w:tcPr>
+          <w:p>
+            <w:pPr>
+              <w:pStyle w:val="af3"/>
+              <w:shd w:val="clear" w:color="auto" w:fill="auto"/>
+              <w:tabs>
+                <w:tab w:val="left" w:pos="163"/>
+              </w:tabs>
+              <w:spacing w:after="0" w:line="240" w:lineRule="auto"/>
+              <w:jc w:val="both"/>
+            </w:pPr>
+            <w:proofErr w:type="gramStart"/>
+            <w:r>
+              <w:rPr>
+                <w:rFonts w:ascii="Times New Roman" w:hAnsi="Times New Roman"/>
+                <w:sz w:val="22"/>
+                <w:szCs w:val="22"/>
+                <w:u w:val="single"/>
+              </w:rPr>
+              <w:t>{{</w:t>
+            </w:r>
+            <w:r>
+              <w:rPr>
+                <w:rFonts w:ascii="Times New Roman" w:hAnsi="Times New Roman"/>
+                <w:sz w:val="22"/>
+                <w:szCs w:val="22"/>
+                <w:u w:val="single"/>
+              </w:rPr>
+              <w:t xml:space="preserve"> appointment</w:t>
+            </w:r>
+            <w:proofErr w:type="gramEnd"/>
+            <w:r>
+              <w:rPr>
+                <w:rFonts w:ascii="Times New Roman" w:hAnsi="Times New Roman"/>
+                <w:sz w:val="22"/>
+                <w:szCs w:val="22"/>
+                <w:u w:val="single"/>
+              </w:rPr>
+              <w:t>_date</w:t>
+            </w:r>
+            <w:r>
+              <w:rPr>
+                <w:rFonts w:ascii="Times New Roman" w:hAnsi="Times New Roman"/>
+                <w:sz w:val="22"/>
+                <w:szCs w:val="22"/>
+                <w:u w:val="single"/>
+              </w:rPr>
+              <w:t xml:space="preserve">}} </w:t>
+            </w:r>
+            <w:r>
+              <w:rPr>
+                <w:rFonts w:ascii="Times New Roman" w:hAnsi="Times New Roman"/>
+                <w:sz w:val="22"/>
+                <w:szCs w:val="22"/>
+                <w:u w:val="single"/>
+                <w:lang w:val="ru-RU"/>
+              </w:rPr>
+              <w:t>года</w:t>
+            </w:r>
+            <w:r>
+              <w:rPr>
+                <w:rFonts w:ascii="Times New Roman" w:hAnsi="Times New Roman"/>
+                <w:sz w:val="22"/>
+                <w:szCs w:val="22"/>
+                <w:u w:val="single"/>
+              </w:rPr>
+              <w:t>.</w:t>
+            </w:r>
+          </w:p>
+        </w:tc>
+        <w:tc>
+          <w:tcPr>
+            <w:tcW w:w="7130" w:type="dxa"/>
+          </w:tcPr>
+          <w:p>
+            <w:pPr>
+              <w:pStyle w:val="af3"/>
+              <w:shd w:val="clear" w:color="auto" w:fill="auto"/>
+              <w:tabs>
+                <w:tab w:val="left" w:pos="163"/>
+              </w:tabs>
+              <w:spacing w:after="0" w:line="240" w:lineRule="auto"/>
+              <w:jc w:val="both"/>
+            </w:pPr>
+            <w:r>
+              <w:rPr>
+                <w:rFonts w:ascii="Times New Roman" w:hAnsi="Times New Roman"/>
+                <w:sz w:val="22"/>
+                <w:szCs w:val="22"/>
+                <w:lang w:val="ru-RU"/>
+              </w:rPr>
+              <w:t>Подпись</w:t>
+            </w:r>
+            <w:r>
+              <w:rPr>
+                <w:rFonts w:ascii="Times New Roman" w:hAnsi="Times New Roman"/>
+                <w:sz w:val="22"/>
+                <w:szCs w:val="22"/>
+              </w:rPr>
+              <w:t xml:space="preserve"> </w:t>
+            </w:r>
+            <w:r>
+              <w:rPr>
+                <w:rFonts w:ascii="Times New Roman" w:hAnsi="Times New Roman"/>
+                <w:sz w:val="22"/>
+                <w:szCs w:val="22"/>
+                <w:lang w:val="ru-RU"/>
+              </w:rPr>
+              <w:t>пациента/законного представителя</w:t>
+            </w:r>
+            <w:r>
+              <w:rPr>
+                <w:rFonts w:ascii="Times New Roman" w:hAnsi="Times New Roman"/>
+                <w:lang w:val="ru-RU"/>
+              </w:rPr>
+              <w:t>__</w:t>
+            </w:r>
+            <w:r>
+              <w:rPr>
+                <w:rFonts w:ascii="Times New Roman" w:hAnsi="Times New Roman"/>
+              </w:rPr>
+              <w:t>_________</w:t>
+            </w:r>
+            <w:r>
+              <w:rPr>
+                <w:rFonts w:ascii="Times New Roman" w:hAnsi="Times New Roman"/>
+                <w:lang w:val="ru-RU"/>
+              </w:rPr>
+              <w:t>_______</w:t>
+            </w:r>
+            <w:r>
+              <w:rPr>
+                <w:rFonts w:ascii="Times New Roman" w:hAnsi="Times New Roman"/>
+              </w:rPr>
+              <w:t>________</w:t>
+            </w:r>
+          </w:p>
+        </w:tc>
+      </w:tr>
+    </w:tbl>
+    <w:p>
+      <w:pPr>
+        <w:pStyle w:val="af3"/>
+        <w:tabs>
+          <w:tab w:val="left" w:pos="765"/>
+          <w:tab w:val="left" w:pos="1725"/>
+          <w:tab w:val="left" w:leader="underscore" w:pos="7372"/>
+        </w:tabs>
+        <w:spacing w:line="100" w:lineRule="atLeast"/>
+        <w:rPr>
+          <w:b/>
+          <w:bCs/>
+          <w:sz w:val="28"/>
+          <w:szCs w:val="28"/>
+          <w:lang w:val="ru-RU"/>
+        </w:rPr>
+      </w:pPr>
+    </w:p>
+    <w:p>
+      <w:pPr>
+        <w:pStyle w:val="af3"/>
+        <w:tabs>
+          <w:tab w:val="left" w:pos="765"/>
+          <w:tab w:val="left" w:pos="1725"/>
+          <w:tab w:val="left" w:leader="underscore" w:pos="7372"/>
+        </w:tabs>
+        <w:spacing w:line="100" w:lineRule="atLeast"/>
+        <w:ind w:firstLine="360"/>
+        <w:jc w:val="center"/>
+        <w:rPr>
+          <w:b/>
+          <w:bCs/>
+          <w:sz w:val="28"/>
+          <w:szCs w:val="28"/>
+          <w:lang w:val="ru-RU"/>
+        </w:rPr>
+      </w:pPr>
+      <w:r>
+        <w:rPr>
+          <w:b/>
+          <w:bCs/>
+          <w:sz w:val="28"/>
+          <w:szCs w:val="28"/>
+          <w:lang w:val="ru-RU"/>
+        </w:rPr>
+        <w:lastRenderedPageBreak/>
+        <w:t>ИП Епифанова Ольга Евгеньевна</w:t>
+      </w:r>
+    </w:p>
+    <w:tbl>
+      <w:tblPr>
+        <w:tblStyle w:val="ad"/>
+        <w:tblW w:w="10191" w:type="dxa"/>
+        <w:tblInd w:w="14" w:type="dxa"/>
+        <w:tblBorders>
+          <w:top w:val="none" w:sz="0" w:space="0" w:color="auto"/>
+          <w:left w:val="none" w:sz="0" w:space="0" w:color="auto"/>
+          <w:bottom w:val="none" w:sz="0" w:space="0" w:color="auto"/>
+          <w:right w:val="none" w:sz="0" w:space="0" w:color="auto"/>
+          <w:insideH w:val="none" w:sz="0" w:space="0" w:color="auto"/>
+          <w:insideV w:val="none" w:sz="0" w:space="0" w:color="auto"/>
+        </w:tblBorders>
+        <w:tblCellMar>
+          <w:left w:w="0" w:type="dxa"/>
+          <w:right w:w="0" w:type="dxa"/>
+        </w:tblCellMar>
+        <w:tblLook w:val="04A0" w:firstRow="1" w:lastRow="0" w:firstColumn="1" w:lastColumn="0" w:noHBand="0" w:noVBand="1"/>
+      </w:tblPr>
+      <w:tblGrid>
+        <w:gridCol w:w="10191"/>
+      </w:tblGrid>
+      <w:tr>
+        <w:tc>
+          <w:tcPr>
+            <w:tcW w:w="5110" w:type="dxa"/>
+            <w:tcBorders>
+              <w:bottom w:val="single" w:sz="4" w:space="0" w:color="auto"/>
+            </w:tcBorders>
+            <w:vAlign w:val="bottom"/>
+          </w:tcPr>
+          <w:p>
+            <w:pPr>
+              <w:jc w:val="center"/>
+            </w:pPr>
+            <w:r>
+              <w:rPr>
+                <w:lang w:val="en-US" w:eastAsia="zh-CN"/>
+              </w:rPr>
+              <w:t>ОГРНИП</w:t>
+            </w:r>
+            <w:r>
+              <w:rPr>
+                <w:lang w:eastAsia="zh-CN"/>
+              </w:rPr>
+              <w:t xml:space="preserve"> </w:t>
+            </w:r>
+            <w:r>
+              <w:rPr>
+                <w:rFonts w:eastAsia="SimSun"/>
+                <w:lang w:val="en-US" w:eastAsia="zh-CN" w:bidi="ar"/>
+              </w:rPr>
+              <w:t>325110000011898</w:t>
+            </w:r>
+          </w:p>
+        </w:tc>
+      </w:tr>
+      <w:tr>
+        <w:tc>
+          <w:tcPr>
+            <w:tcW w:w="5110" w:type="dxa"/>
+            <w:tcBorders>
+              <w:top w:val="single" w:sz="4" w:space="0" w:color="auto"/>
+              <w:bottom w:val="single" w:sz="4" w:space="0" w:color="auto"/>
+            </w:tcBorders>
+            <w:vAlign w:val="bottom"/>
+          </w:tcPr>
+          <w:p>
+            <w:pPr>
+              <w:jc w:val="center"/>
+            </w:pPr>
+            <w:r>
+              <w:t>ИНН 110101793309</w:t>
+            </w:r>
+          </w:p>
+        </w:tc>
+      </w:tr>
+    </w:tbl>
+    <w:p>
+      <w:pPr>
+        <w:pStyle w:val="af3"/>
+        <w:tabs>
+          <w:tab w:val="left" w:pos="163"/>
+        </w:tabs>
+        <w:spacing w:line="100" w:lineRule="atLeast"/>
+        <w:ind w:left="720"/>
+        <w:jc w:val="both"/>
+        <w:rPr>
+          <w:sz w:val="22"/>
+          <w:szCs w:val="22"/>
+          <w:lang w:val="ru-RU"/>
+        </w:rPr>
+      </w:pPr>
+    </w:p>
+    <w:p>
+      <w:pPr>
+        <w:pStyle w:val="af3"/>
+        <w:tabs>
+          <w:tab w:val="left" w:pos="765"/>
+          <w:tab w:val="left" w:pos="1725"/>
+          <w:tab w:val="left" w:leader="underscore" w:pos="7372"/>
+        </w:tabs>
+        <w:spacing w:line="100" w:lineRule="atLeast"/>
+        <w:jc w:val="center"/>
+        <w:rPr>
+          <w:lang w:val="ru-RU"/>
+        </w:rPr>
+      </w:pPr>
+      <w:r>
+        <w:rPr>
+          <w:rStyle w:val="11"/>
+          <w:rFonts w:ascii="Times New Roman" w:hAnsi="Times New Roman"/>
+          <w:b/>
+          <w:color w:val="000000"/>
+          <w:lang w:val="ru-RU"/>
+        </w:rPr>
+        <w:t>Информированное добровольное согласие на медицинское вмешательство</w:t>
+      </w:r>
+    </w:p>
+    <w:p>
+      <w:pPr>
+        <w:pStyle w:val="af3"/>
+        <w:tabs>
+          <w:tab w:val="left" w:pos="163"/>
+        </w:tabs>
+        <w:spacing w:after="0" w:line="240" w:lineRule="auto"/>
+        <w:ind w:firstLineChars="200" w:firstLine="420"/>
+        <w:jc w:val="both"/>
+        <w:rPr>
+          <w:i/>
+          <w:iCs/>
+          <w:lang w:val="ru-RU"/>
+        </w:rPr>
+      </w:pPr>
+      <w:r>
+        <w:rPr>
+          <w:rStyle w:val="11"/>
+          <w:rFonts w:ascii="Times New Roman" w:hAnsi="Times New Roman"/>
+          <w:color w:val="000000"/>
+          <w:lang w:val="ru-RU"/>
+        </w:rPr>
+        <w:t xml:space="preserve">Я, </w:t>
+      </w:r>
+      <w:r>
+        <w:rPr>
+          <w:rStyle w:val="11"/>
+          <w:rFonts w:ascii="Times New Roman" w:hAnsi="Times New Roman"/>
+          <w:b/>
+          <w:bCs/>
+          <w:color w:val="000000"/>
+          <w:lang w:val="ru-RU"/>
+        </w:rPr>
+        <w:t>{{ surname }} {{ first_name }} {{ last_name }}</w:t>
+      </w:r>
+      <w:r>
+        <w:rPr>
+          <w:rStyle w:val="11"/>
+          <w:rFonts w:ascii="Times New Roman" w:hAnsi="Times New Roman"/>
+          <w:b/>
+          <w:bCs/>
+          <w:color w:val="000000"/>
+          <w:lang w:val="ru-RU"/>
+        </w:rPr>
+        <w:t>,</w:t>
+      </w:r>
+      <w:r>
+        <w:rPr>
+          <w:rStyle w:val="11"/>
+          <w:rFonts w:ascii="Times New Roman" w:hAnsi="Times New Roman"/>
+          <w:color w:val="000000"/>
+          <w:lang w:val="ru-RU"/>
+        </w:rPr>
+        <w:t xml:space="preserve"> д</w:t>
+      </w:r>
+      <w:r>
+        <w:rPr>
+          <w:rStyle w:val="11"/>
+          <w:rFonts w:ascii="Times New Roman" w:hAnsi="Times New Roman"/>
+          <w:color w:val="000000"/>
+          <w:lang w:val="ru-RU"/>
+        </w:rPr>
+        <w:t xml:space="preserve">обровольно даю своё согласие на проведение опроса, в том числе выявления жалоб, сбор анамнеза; осмотр, в том числе пальпацию, перкуссию, аускультацию, фарингоскопию, антропометрические исследования, термометрию, тонометрию; ультразвуковые исследования; для получения мною первичной медико-санитарной помощи / получения первичной медико-санитарной помощи лицом, законным  представителем которого я  являюсь,  в </w:t>
+      </w:r>
+      <w:r>
+        <w:rPr>
+          <w:rFonts w:ascii="Times New Roman" w:hAnsi="Times New Roman"/>
+          <w:lang w:val="ru-RU"/>
+        </w:rPr>
+        <w:t xml:space="preserve">обработку </w:t>
+      </w:r>
+      <w:r>
+        <w:rPr>
+          <w:rFonts w:ascii="Times New Roman" w:hAnsi="Times New Roman"/>
+          <w:b/>
+          <w:bCs/>
+          <w:sz w:val="22"/>
+          <w:szCs w:val="22"/>
+          <w:lang w:val="ru-RU"/>
+        </w:rPr>
+        <w:t>Индивидуальным предпринимателем Епифановой Ольгой Евгеньевной</w:t>
+      </w:r>
+      <w:r>
+        <w:rPr>
+          <w:rFonts w:ascii="Times New Roman" w:hAnsi="Times New Roman"/>
+          <w:lang w:val="ru-RU"/>
+        </w:rPr>
+        <w:t>.</w:t>
+      </w:r>
+    </w:p>
+    <w:p>
+      <w:pPr>
+        <w:pStyle w:val="af3"/>
+        <w:tabs>
+          <w:tab w:val="left" w:pos="163"/>
+        </w:tabs>
+        <w:spacing w:after="0" w:line="240" w:lineRule="auto"/>
+        <w:ind w:firstLineChars="200" w:firstLine="420"/>
+        <w:jc w:val="both"/>
+        <w:rPr>
+          <w:lang w:val="ru-RU"/>
+        </w:rPr>
+      </w:pPr>
+      <w:r>
+        <w:rPr>
+          <w:rStyle w:val="11"/>
+          <w:rFonts w:ascii="Times New Roman" w:hAnsi="Times New Roman"/>
+          <w:color w:val="000000"/>
+          <w:lang w:val="ru-RU"/>
+        </w:rPr>
+        <w:t xml:space="preserve"> Необходимость других методов обследования и лечения будет мне разъяснена дополнительно;</w:t>
+      </w:r>
+    </w:p>
+    <w:p>
+      <w:pPr>
+        <w:pStyle w:val="af3"/>
+        <w:numPr>
+          <w:ilvl w:val="0"/>
+          <w:numId w:val="1"/>
+        </w:numPr>
+        <w:tabs>
+          <w:tab w:val="left" w:pos="163"/>
+        </w:tabs>
+        <w:ind w:left="0" w:firstLineChars="200" w:firstLine="420"/>
+        <w:jc w:val="both"/>
+        <w:rPr>
+          <w:rFonts w:ascii="Times New Roman" w:hAnsi="Times New Roman"/>
+          <w:shd w:val="clear" w:color="auto" w:fill="FFFFFF"/>
+        </w:rPr>
+      </w:pPr>
+      <w:r>
+        <w:rPr>
+          <w:rFonts w:ascii="Times New Roman" w:hAnsi="Times New Roman"/>
+          <w:color w:val="000000"/>
+          <w:shd w:val="clear" w:color="auto" w:fill="FFFFFF"/>
+          <w:lang w:val="ru-RU"/>
+        </w:rPr>
+        <w:t>Медицинским</w:t>
+      </w:r>
+      <w:r>
+        <w:rPr>
+          <w:rFonts w:ascii="Times New Roman" w:hAnsi="Times New Roman"/>
+          <w:color w:val="000000"/>
+          <w:shd w:val="clear" w:color="auto" w:fill="FFFFFF"/>
+        </w:rPr>
+        <w:t xml:space="preserve"> </w:t>
+      </w:r>
+      <w:r>
+        <w:rPr>
+          <w:rFonts w:ascii="Times New Roman" w:hAnsi="Times New Roman"/>
+          <w:color w:val="000000"/>
+          <w:shd w:val="clear" w:color="auto" w:fill="FFFFFF"/>
+          <w:lang w:val="ru-RU"/>
+        </w:rPr>
+        <w:t>работником</w:t>
+      </w:r>
+      <w:r>
+        <w:rPr>
+          <w:rFonts w:ascii="Times New Roman" w:hAnsi="Times New Roman"/>
+          <w:color w:val="000000"/>
+          <w:shd w:val="clear" w:color="auto" w:fill="FFFFFF"/>
+        </w:rPr>
+        <w:t xml:space="preserve"> </w:t>
+      </w:r>
+      <w:proofErr w:type="gramStart"/>
+      <w:r>
+        <w:rPr>
+          <w:rFonts w:ascii="Times New Roman" w:hAnsi="Times New Roman"/>
+          <w:b/>
+          <w:bCs/>
+          <w:color w:val="000000"/>
+          <w:shd w:val="clear" w:color="auto" w:fill="FFFFFF"/>
+        </w:rPr>
+        <w:t xml:space="preserve">{{  </w:t>
+      </w:r>
+      <w:proofErr w:type="gramEnd"/>
+      <w:r>
+        <w:rPr>
+          <w:rFonts w:ascii="Times New Roman" w:hAnsi="Times New Roman"/>
+          <w:b/>
+          <w:bCs/>
+          <w:color w:val="000000"/>
+          <w:shd w:val="clear" w:color="auto" w:fill="FFFFFF"/>
+        </w:rPr>
+        <w:t>doctor</w:t>
+      </w:r>
+      <w:r>
+        <w:rPr>
+          <w:rFonts w:ascii="Times New Roman" w:hAnsi="Times New Roman"/>
+          <w:b/>
+          <w:bCs/>
+          <w:color w:val="000000"/>
+          <w:shd w:val="clear" w:color="auto" w:fill="FFFFFF"/>
+        </w:rPr>
+        <w:t>_</w:t>
+      </w:r>
+      <w:proofErr w:type="gramStart"/>
+      <w:r>
+        <w:rPr>
+          <w:rFonts w:ascii="Times New Roman" w:hAnsi="Times New Roman"/>
+          <w:b/>
+          <w:bCs/>
+          <w:color w:val="000000"/>
+          <w:shd w:val="clear" w:color="auto" w:fill="FFFFFF"/>
+        </w:rPr>
+        <w:t>name</w:t>
+      </w:r>
+      <w:r>
+        <w:rPr>
+          <w:rFonts w:ascii="Times New Roman" w:hAnsi="Times New Roman"/>
+          <w:b/>
+          <w:bCs/>
+          <w:color w:val="000000"/>
+          <w:shd w:val="clear" w:color="auto" w:fill="FFFFFF"/>
+        </w:rPr>
+        <w:t xml:space="preserve"> }</w:t>
+      </w:r>
+      <w:proofErr w:type="gramEnd"/>
+      <w:r>
+        <w:rPr>
+          <w:rFonts w:ascii="Times New Roman" w:hAnsi="Times New Roman"/>
+          <w:b/>
+          <w:bCs/>
+          <w:color w:val="000000"/>
+          <w:shd w:val="clear" w:color="auto" w:fill="FFFFFF"/>
+        </w:rPr>
+        <w:t xml:space="preserve">} </w:t>
+      </w:r>
+      <w:r>
+        <w:rPr>
+          <w:rFonts w:ascii="Times New Roman" w:hAnsi="Times New Roman"/>
+          <w:b/>
+          <w:bCs/>
+          <w:color w:val="000000"/>
+          <w:shd w:val="clear" w:color="auto" w:fill="FFFFFF"/>
+          <w:lang w:val="ru-RU"/>
+        </w:rPr>
+        <w:t>врач</w:t>
+      </w:r>
+      <w:r>
+        <w:rPr>
+          <w:rFonts w:ascii="Times New Roman" w:hAnsi="Times New Roman"/>
+          <w:b/>
+          <w:bCs/>
+          <w:color w:val="000000"/>
+          <w:shd w:val="clear" w:color="auto" w:fill="FFFFFF"/>
+        </w:rPr>
+        <w:t xml:space="preserve"> </w:t>
+      </w:r>
+      <w:proofErr w:type="gramStart"/>
+      <w:r>
+        <w:rPr>
+          <w:rFonts w:ascii="Times New Roman" w:hAnsi="Times New Roman"/>
+          <w:b/>
+          <w:bCs/>
+          <w:color w:val="000000"/>
+          <w:shd w:val="clear" w:color="auto" w:fill="FFFFFF"/>
+        </w:rPr>
+        <w:t xml:space="preserve">{{ </w:t>
+      </w:r>
+      <w:r>
+        <w:rPr>
+          <w:rFonts w:ascii="Times New Roman" w:hAnsi="Times New Roman"/>
+          <w:b/>
+          <w:bCs/>
+          <w:shd w:val="clear" w:color="auto" w:fill="FFFFFF"/>
+        </w:rPr>
+        <w:t>doctor</w:t>
+      </w:r>
+      <w:proofErr w:type="gramEnd"/>
+      <w:r>
+        <w:rPr>
+          <w:rFonts w:ascii="Times New Roman" w:hAnsi="Times New Roman"/>
+          <w:b/>
+          <w:bCs/>
+          <w:shd w:val="clear" w:color="auto" w:fill="FFFFFF"/>
+        </w:rPr>
+        <w:t>_</w:t>
+      </w:r>
+      <w:proofErr w:type="gramStart"/>
+      <w:r>
+        <w:rPr>
+          <w:rFonts w:ascii="Times New Roman" w:hAnsi="Times New Roman"/>
+          <w:b/>
+          <w:bCs/>
+          <w:shd w:val="clear" w:color="auto" w:fill="FFFFFF"/>
+        </w:rPr>
+        <w:t>specialization</w:t>
+      </w:r>
+      <w:r>
+        <w:rPr>
+          <w:rFonts w:ascii="Times New Roman" w:hAnsi="Times New Roman"/>
+          <w:b/>
+          <w:bCs/>
+          <w:shd w:val="clear" w:color="auto" w:fill="FFFFFF"/>
+        </w:rPr>
+        <w:t xml:space="preserve"> }</w:t>
+      </w:r>
+      <w:proofErr w:type="gramEnd"/>
+      <w:r>
+        <w:rPr>
+          <w:rFonts w:ascii="Times New Roman" w:hAnsi="Times New Roman"/>
+          <w:b/>
+          <w:bCs/>
+          <w:shd w:val="clear" w:color="auto" w:fill="FFFFFF"/>
+        </w:rPr>
+        <w:t>}</w:t>
+      </w:r>
+      <w:r>
+        <w:rPr>
+          <w:rFonts w:ascii="Times New Roman" w:hAnsi="Times New Roman"/>
+          <w:color w:val="000000"/>
+          <w:shd w:val="clear" w:color="auto" w:fill="FFFFFF"/>
+        </w:rPr>
+        <w:t xml:space="preserve">         </w:t>
+      </w:r>
+    </w:p>
+    <w:p>
+      <w:pPr>
+        <w:pStyle w:val="af3"/>
+        <w:tabs>
+          <w:tab w:val="left" w:pos="163"/>
+        </w:tabs>
+        <w:spacing w:after="0" w:line="240" w:lineRule="auto"/>
+        <w:jc w:val="both"/>
+        <w:rPr>
+          <w:lang w:val="ru-RU"/>
+        </w:rPr>
+      </w:pPr>
+      <w:r>
+        <w:rPr>
+          <w:rFonts w:ascii="Times New Roman" w:hAnsi="Times New Roman"/>
+          <w:color w:val="000000"/>
+          <w:shd w:val="clear" w:color="auto" w:fill="FFFFFF"/>
+        </w:rPr>
+        <w:t xml:space="preserve">           </w:t>
+      </w:r>
+      <w:r>
+        <w:rPr>
+          <w:rFonts w:ascii="Times New Roman" w:hAnsi="Times New Roman"/>
+          <w:color w:val="000000"/>
+          <w:shd w:val="clear" w:color="auto" w:fill="FFFFFF"/>
+          <w:lang w:val="ru-RU"/>
+        </w:rPr>
+        <w:t xml:space="preserve">в доступной для меня форме мне разъяснены цели, методы оказания медицинской помощи, связанный с ними риск, возможные варианты медицинских вмешательств, их последствия, в том числе вероятность развития осложнений, а также предполагаемые результаты оказания медицинской помощи. Мне разъяснено, что я имею право отказаться от одного или нескольких видов медицинских вмешательств, включённых в Перечень определённых видов медицинских вмешательств, на которые граждане дают информированное добровольное согласие при выборе врача и медицинской организации для получения первичной медико-санитарной помощи, утверждённый приказом Министерства здравоохранения и социального развития Российской Федерации от 23 апреля 2012 г. </w:t>
+      </w:r>
+      <w:r>
+        <w:rPr>
+          <w:rFonts w:ascii="Times New Roman" w:hAnsi="Times New Roman"/>
+          <w:color w:val="000000"/>
+          <w:shd w:val="clear" w:color="auto" w:fill="FFFFFF"/>
+        </w:rPr>
+        <w:t>N</w:t>
+      </w:r>
+      <w:r>
+        <w:rPr>
+          <w:rFonts w:ascii="Times New Roman" w:hAnsi="Times New Roman"/>
+          <w:color w:val="000000"/>
+          <w:shd w:val="clear" w:color="auto" w:fill="FFFFFF"/>
+          <w:lang w:val="ru-RU"/>
+        </w:rPr>
+        <w:t xml:space="preserve"> 390н  (зарегистрирован Министерством юстиции Российской Федерации 5 мая 2012 г. </w:t>
+      </w:r>
+      <w:r>
+        <w:rPr>
+          <w:rFonts w:ascii="Times New Roman" w:hAnsi="Times New Roman"/>
+          <w:color w:val="000000"/>
+          <w:shd w:val="clear" w:color="auto" w:fill="FFFFFF"/>
+        </w:rPr>
+        <w:t>N</w:t>
+      </w:r>
+      <w:r>
+        <w:rPr>
+          <w:rFonts w:ascii="Times New Roman" w:hAnsi="Times New Roman"/>
+          <w:color w:val="000000"/>
+          <w:shd w:val="clear" w:color="auto" w:fill="FFFFFF"/>
+          <w:lang w:val="ru-RU"/>
+        </w:rPr>
+        <w:t xml:space="preserve"> 24082) или потребовать его (их) прекращения, за исключением случаев, предусмотренных частью 9 статьи 20 Федерального закона от 21 ноября 2011 г. </w:t>
+      </w:r>
+      <w:r>
+        <w:rPr>
+          <w:rFonts w:ascii="Times New Roman" w:hAnsi="Times New Roman"/>
+          <w:color w:val="000000"/>
+          <w:shd w:val="clear" w:color="auto" w:fill="FFFFFF"/>
+        </w:rPr>
+        <w:t>N</w:t>
+      </w:r>
+      <w:r>
+        <w:rPr>
+          <w:rFonts w:ascii="Times New Roman" w:hAnsi="Times New Roman"/>
+          <w:color w:val="000000"/>
+          <w:shd w:val="clear" w:color="auto" w:fill="FFFFFF"/>
+          <w:lang w:val="ru-RU"/>
+        </w:rPr>
+        <w:t xml:space="preserve"> 323-ФЗ "Об основах охраны здоровья граждан в Российской Федерации".</w:t>
+      </w:r>
+    </w:p>
+    <w:p>
+      <w:pPr>
+        <w:pStyle w:val="af3"/>
+        <w:tabs>
+          <w:tab w:val="left" w:pos="163"/>
+        </w:tabs>
+        <w:spacing w:after="0" w:line="240" w:lineRule="auto"/>
+        <w:ind w:firstLineChars="200" w:firstLine="420"/>
+        <w:jc w:val="both"/>
+        <w:rPr>
+          <w:lang w:val="ru-RU"/>
+        </w:rPr>
+      </w:pPr>
+      <w:r>
+        <w:rPr>
+          <w:rFonts w:ascii="Times New Roman" w:hAnsi="Times New Roman"/>
+          <w:color w:val="000000"/>
+          <w:shd w:val="clear" w:color="auto" w:fill="FFFFFF"/>
+          <w:lang w:val="ru-RU"/>
+        </w:rPr>
+        <w:t>Я извещён</w:t>
+      </w:r>
+      <w:r>
+        <w:rPr>
+          <w:rStyle w:val="11"/>
+          <w:rFonts w:ascii="Times New Roman" w:hAnsi="Times New Roman"/>
+          <w:color w:val="000000"/>
+          <w:lang w:val="ru-RU"/>
+        </w:rPr>
+        <w:t xml:space="preserve"> (извещена) о том, что мне (представляемому) необходимо регулярно принимать назначенные препараты и другие методы лечения, немедленно сообщать врачу о любом ухудшении самочувствия, согласовывать с врачом приём любых, не прописанных лекарств;</w:t>
+      </w:r>
+    </w:p>
+    <w:p>
+      <w:pPr>
+        <w:pStyle w:val="af3"/>
+        <w:tabs>
+          <w:tab w:val="left" w:pos="163"/>
+        </w:tabs>
+        <w:spacing w:after="0" w:line="240" w:lineRule="auto"/>
+        <w:ind w:firstLineChars="200" w:firstLine="420"/>
+        <w:jc w:val="both"/>
+        <w:rPr>
+          <w:lang w:val="ru-RU"/>
+        </w:rPr>
+      </w:pPr>
+      <w:r>
+        <w:rPr>
+          <w:rStyle w:val="af5"/>
+          <w:rFonts w:ascii="Times New Roman" w:hAnsi="Times New Roman"/>
+          <w:color w:val="000000"/>
+          <w:lang w:val="ru-RU"/>
+        </w:rPr>
+        <w:t>Я</w:t>
+      </w:r>
+      <w:r>
+        <w:rPr>
+          <w:rStyle w:val="11"/>
+          <w:rFonts w:ascii="Times New Roman" w:hAnsi="Times New Roman"/>
+          <w:i/>
+          <w:color w:val="000000"/>
+          <w:lang w:val="ru-RU"/>
+        </w:rPr>
+        <w:t xml:space="preserve"> </w:t>
+      </w:r>
+      <w:r>
+        <w:rPr>
+          <w:rStyle w:val="11"/>
+          <w:rFonts w:ascii="Times New Roman" w:hAnsi="Times New Roman"/>
+          <w:color w:val="000000"/>
+          <w:lang w:val="ru-RU"/>
+        </w:rPr>
+        <w:t>предупрежден (предупреждена) и осознаю, что отказ от лечения, несоблюдение лечебно-охранительного режима, рекомендаций медицинских работников, режима приёма препаратов, самовольное использование медицинского инструментария и оборудования, бесконтрольное самолечение могут осложнить процесс лечения и отрицательно сказаться на состоянии здоровья;</w:t>
+      </w:r>
+    </w:p>
+    <w:p>
+      <w:pPr>
+        <w:pStyle w:val="af3"/>
+        <w:tabs>
+          <w:tab w:val="left" w:pos="163"/>
+        </w:tabs>
+        <w:spacing w:after="0" w:line="240" w:lineRule="auto"/>
+        <w:ind w:firstLineChars="200" w:firstLine="420"/>
+        <w:jc w:val="both"/>
+        <w:rPr>
+          <w:lang w:val="ru-RU"/>
+        </w:rPr>
+      </w:pPr>
+      <w:r>
+        <w:rPr>
+          <w:rStyle w:val="11"/>
+          <w:rFonts w:ascii="Times New Roman" w:hAnsi="Times New Roman"/>
+          <w:color w:val="000000"/>
+          <w:lang w:val="ru-RU"/>
+        </w:rPr>
+        <w:t>Я поставил (поставила) в известность врача обо всех проблемах, связанных со здоровьем, в том числе об аллергических проявлениях или индивидуальной непереносимости лекарственных препаратов, обо всех перенесённых мною (представляемым) и известных мне травмах, операциях, заболеваниях, об экологических и производственных факторах физической, химической или биологической природы, воздействующих на меня (представляемого) во время жизнедеятельности, о принимаемых лекарственных средствах. Я сообщил (сообщила) правдивые сведения о наследственности, а также об употреблении алкоголя, наркотических и токсических средств.</w:t>
+      </w:r>
+    </w:p>
+    <w:p>
+      <w:pPr>
+        <w:pStyle w:val="af3"/>
+        <w:tabs>
+          <w:tab w:val="left" w:pos="163"/>
+        </w:tabs>
+        <w:spacing w:after="0" w:line="240" w:lineRule="auto"/>
+        <w:ind w:firstLineChars="200" w:firstLine="420"/>
+        <w:jc w:val="both"/>
+        <w:rPr>
+          <w:lang w:val="ru-RU"/>
+        </w:rPr>
+      </w:pPr>
+      <w:r>
+        <w:rPr>
+          <w:rStyle w:val="11"/>
+          <w:rFonts w:ascii="Times New Roman" w:hAnsi="Times New Roman"/>
+          <w:color w:val="000000"/>
+          <w:lang w:val="ru-RU"/>
+        </w:rPr>
+        <w:t>Я ознакомлен (ознакомлена) и согласен (согласна) со всеми пунктами настоящего документа, положения которого мне разъяснены, мною поняты и добровольно даю свое согласие на обследование и лечение в предложенном объеме;</w:t>
+      </w:r>
+    </w:p>
+    <w:p>
+      <w:pPr>
+        <w:pStyle w:val="af3"/>
+        <w:tabs>
+          <w:tab w:val="left" w:pos="163"/>
+        </w:tabs>
+        <w:spacing w:after="0" w:line="240" w:lineRule="auto"/>
+        <w:ind w:firstLineChars="200" w:firstLine="420"/>
+        <w:rPr>
+          <w:rStyle w:val="11"/>
+          <w:rFonts w:ascii="Times New Roman" w:hAnsi="Times New Roman"/>
+          <w:color w:val="C9211E"/>
+          <w:lang w:val="ru-RU"/>
+        </w:rPr>
+      </w:pPr>
+    </w:p>
+    <w:p>
+      <w:pPr>
+        <w:pStyle w:val="af3"/>
+        <w:tabs>
+          <w:tab w:val="left" w:pos="163"/>
+        </w:tabs>
+        <w:spacing w:after="0" w:line="240" w:lineRule="auto"/>
+        <w:ind w:firstLineChars="200" w:firstLine="420"/>
+        <w:rPr>
+          <w:lang w:val="ru-RU"/>
+        </w:rPr>
+      </w:pPr>
+      <w:r>
+        <w:rPr>
+          <w:rStyle w:val="11"/>
+          <w:rFonts w:ascii="Times New Roman" w:hAnsi="Times New Roman"/>
+          <w:color w:val="C9211E"/>
+          <w:lang w:val="ru-RU"/>
+        </w:rPr>
+        <w:t>Разрешаю, в случае необходимости, предоставить информацию о моем диагнозе (диагнозе представляемого), степени и характере моего заболевания (заболевания представляемого) моим родственникам, законным представителям, гражданам:______________________________________________________________________________________________________________________________________________________________________________________________</w:t>
+      </w:r>
+    </w:p>
+    <w:p>
+      <w:pPr>
+        <w:pStyle w:val="af3"/>
+        <w:tabs>
+          <w:tab w:val="left" w:pos="163"/>
+        </w:tabs>
+        <w:spacing w:after="0" w:line="240" w:lineRule="auto"/>
+        <w:ind w:firstLineChars="200" w:firstLine="420"/>
+        <w:jc w:val="both"/>
+        <w:rPr>
+          <w:rFonts w:ascii="Times New Roman" w:hAnsi="Times New Roman"/>
+          <w:lang w:val="ru-RU"/>
+        </w:rPr>
+      </w:pPr>
+    </w:p>
+    <w:p>
+      <w:pPr>
+        <w:pStyle w:val="af3"/>
+        <w:tabs>
+          <w:tab w:val="left" w:pos="163"/>
+        </w:tabs>
+        <w:spacing w:after="0" w:line="240" w:lineRule="auto"/>
+        <w:ind w:firstLineChars="200" w:firstLine="420"/>
+        <w:jc w:val="both"/>
+        <w:rPr>
+          <w:lang w:val="ru-RU"/>
+        </w:rPr>
+      </w:pPr>
+      <w:r>
+        <w:rPr>
+          <w:rFonts w:ascii="Times New Roman" w:hAnsi="Times New Roman"/>
+          <w:lang w:val="ru-RU"/>
+        </w:rPr>
+        <w:t xml:space="preserve">Настоящее информированное добровольное согласие действует в течение всего срока оказания мне (представляемому) медицинской помощи у </w:t>
+      </w:r>
+      <w:r>
+        <w:rPr>
+          <w:rFonts w:ascii="Times New Roman" w:hAnsi="Times New Roman"/>
+          <w:b/>
+          <w:bCs/>
+          <w:sz w:val="22"/>
+          <w:szCs w:val="22"/>
+          <w:lang w:val="ru-RU"/>
+        </w:rPr>
+        <w:t>Индивидуального предпринимателя Епифановой Ольги Евгеньевны</w:t>
+      </w:r>
+      <w:r>
+        <w:rPr>
+          <w:rFonts w:ascii="Times New Roman" w:hAnsi="Times New Roman"/>
+          <w:lang w:val="ru-RU"/>
+        </w:rPr>
+        <w:t xml:space="preserve"> или до момента отзыва мною настоящего согласия. </w:t>
+      </w:r>
+    </w:p>
+    <w:p>
+      <w:pPr>
+        <w:pStyle w:val="af3"/>
+        <w:tabs>
+          <w:tab w:val="left" w:pos="163"/>
+        </w:tabs>
+        <w:spacing w:after="0" w:line="240" w:lineRule="auto"/>
+        <w:jc w:val="both"/>
+        <w:rPr>
+          <w:rFonts w:ascii="Times New Roman" w:hAnsi="Times New Roman"/>
+          <w:lang w:val="ru-RU"/>
+        </w:rPr>
+      </w:pPr>
+    </w:p>
+    <w:tbl>
+      <w:tblPr>
+        <w:tblStyle w:val="ad"/>
+        <w:tblW w:w="0" w:type="auto"/>
+        <w:tblBorders>
+          <w:top w:val="none" w:sz="0" w:space="0" w:color="auto"/>
+          <w:left w:val="none" w:sz="0" w:space="0" w:color="auto"/>
+          <w:bottom w:val="none" w:sz="0" w:space="0" w:color="auto"/>
+          <w:right w:val="none" w:sz="0" w:space="0" w:color="auto"/>
+          <w:insideH w:val="none" w:sz="0" w:space="0" w:color="auto"/>
+          <w:insideV w:val="none" w:sz="0" w:space="0" w:color="auto"/>
+        </w:tblBorders>
+        <w:tblLook w:val="04A0" w:firstRow="1" w:lastRow="0" w:firstColumn="1" w:lastColumn="0" w:noHBand="0" w:noVBand="1"/>
+      </w:tblPr>
+      <w:tblGrid>
+        <w:gridCol w:w="3387"/>
+        <w:gridCol w:w="7101"/>
+      </w:tblGrid>
+      <w:tr>
+        <w:tc>
+          <w:tcPr>
+            <w:tcW w:w="3402" w:type="dxa"/>
+          </w:tcPr>
+          <w:p>
+            <w:pPr>
+              <w:pStyle w:val="af3"/>
+              <w:shd w:val="clear" w:color="auto" w:fill="auto"/>
+              <w:tabs>
+                <w:tab w:val="left" w:pos="163"/>
+              </w:tabs>
+              <w:spacing w:after="0" w:line="240" w:lineRule="auto"/>
+              <w:jc w:val="both"/>
+            </w:pPr>
+            <w:proofErr w:type="gramStart"/>
+            <w:r>
+              <w:rPr>
+                <w:rFonts w:ascii="Times New Roman" w:hAnsi="Times New Roman"/>
+                <w:sz w:val="22"/>
+                <w:szCs w:val="22"/>
+                <w:u w:val="single"/>
+              </w:rPr>
+              <w:t>{{</w:t>
+            </w:r>
+            <w:r>
+              <w:rPr>
+                <w:rFonts w:ascii="Times New Roman" w:hAnsi="Times New Roman"/>
+                <w:sz w:val="22"/>
+                <w:szCs w:val="22"/>
+                <w:u w:val="single"/>
+              </w:rPr>
+              <w:t xml:space="preserve"> appointment</w:t>
+            </w:r>
+            <w:proofErr w:type="gramEnd"/>
+            <w:r>
+              <w:rPr>
+                <w:rFonts w:ascii="Times New Roman" w:hAnsi="Times New Roman"/>
+                <w:sz w:val="22"/>
+                <w:szCs w:val="22"/>
+                <w:u w:val="single"/>
+              </w:rPr>
+              <w:t>_date</w:t>
+            </w:r>
+            <w:r>
+              <w:rPr>
+                <w:rFonts w:ascii="Times New Roman" w:hAnsi="Times New Roman"/>
+                <w:sz w:val="22"/>
+                <w:szCs w:val="22"/>
+                <w:u w:val="single"/>
+              </w:rPr>
+              <w:t xml:space="preserve">}} </w:t>
+            </w:r>
+            <w:r>
+              <w:rPr>
+                <w:rFonts w:ascii="Times New Roman" w:hAnsi="Times New Roman"/>
+                <w:sz w:val="22"/>
+                <w:szCs w:val="22"/>
+                <w:u w:val="single"/>
+                <w:lang w:val="ru-RU"/>
+              </w:rPr>
+              <w:t>года</w:t>
+            </w:r>
+            <w:r>
+              <w:rPr>
+                <w:rFonts w:ascii="Times New Roman" w:hAnsi="Times New Roman"/>
+                <w:sz w:val="22"/>
+                <w:szCs w:val="22"/>
+                <w:u w:val="single"/>
+              </w:rPr>
+              <w:t>.</w:t>
+            </w:r>
+          </w:p>
+        </w:tc>
+        <w:tc>
+          <w:tcPr>
+            <w:tcW w:w="7130" w:type="dxa"/>
+          </w:tcPr>
+          <w:p>
+            <w:pPr>
+              <w:pStyle w:val="af3"/>
+              <w:shd w:val="clear" w:color="auto" w:fill="auto"/>
+              <w:tabs>
+                <w:tab w:val="left" w:pos="163"/>
+              </w:tabs>
+              <w:spacing w:after="0" w:line="240" w:lineRule="auto"/>
+              <w:jc w:val="both"/>
+            </w:pPr>
+            <w:r>
+              <w:rPr>
+                <w:rFonts w:ascii="Times New Roman" w:hAnsi="Times New Roman"/>
+                <w:sz w:val="22"/>
+                <w:szCs w:val="22"/>
+                <w:lang w:val="ru-RU"/>
+              </w:rPr>
+              <w:t>Подпись</w:t>
+            </w:r>
+            <w:r>
+              <w:rPr>
+                <w:rFonts w:ascii="Times New Roman" w:hAnsi="Times New Roman"/>
+                <w:sz w:val="22"/>
+                <w:szCs w:val="22"/>
+              </w:rPr>
+              <w:t xml:space="preserve"> </w:t>
+            </w:r>
+            <w:r>
+              <w:rPr>
+                <w:rFonts w:ascii="Times New Roman" w:hAnsi="Times New Roman"/>
+                <w:sz w:val="22"/>
+                <w:szCs w:val="22"/>
+                <w:lang w:val="ru-RU"/>
+              </w:rPr>
+              <w:t>пациента/законного представителя</w:t>
+            </w:r>
+            <w:r>
+              <w:rPr>
+                <w:rFonts w:ascii="Times New Roman" w:hAnsi="Times New Roman"/>
+                <w:lang w:val="ru-RU"/>
+              </w:rPr>
+              <w:t>__</w:t>
+            </w:r>
+            <w:r>
+              <w:rPr>
+                <w:rFonts w:ascii="Times New Roman" w:hAnsi="Times New Roman"/>
+              </w:rPr>
+              <w:t>_________</w:t>
+            </w:r>
+            <w:r>
+              <w:rPr>
+                <w:rFonts w:ascii="Times New Roman" w:hAnsi="Times New Roman"/>
+                <w:lang w:val="ru-RU"/>
+              </w:rPr>
+              <w:t>_______</w:t>
+            </w:r>
+            <w:r>
+              <w:rPr>
+                <w:rFonts w:ascii="Times New Roman" w:hAnsi="Times New Roman"/>
+              </w:rPr>
+              <w:t>________</w:t>
+            </w:r>
+          </w:p>
+        </w:tc>
+      </w:tr>
+    </w:tbl>
+    <w:p>
+      <w:pPr>
+        <w:pStyle w:val="af3"/>
+        <w:tabs>
+          <w:tab w:val="left" w:pos="163"/>
+        </w:tabs>
+        <w:spacing w:after="0" w:line="240" w:lineRule="auto"/>
+        <w:jc w:val="both"/>
+        <w:rPr>
+          <w:lang w:val="ru-RU"/>
+        </w:rPr>
+      </w:pPr>
+    </w:p>
+    <w:p>
+      <w:pPr>
+        <w:pStyle w:val="af3"/>
+        <w:tabs>
+          <w:tab w:val="left" w:pos="163"/>
+        </w:tabs>
+        <w:spacing w:after="0" w:line="240" w:lineRule="auto"/>
+        <w:jc w:val="both"/>
+        <w:rPr>
+          <w:rFonts w:ascii="Times New Roman" w:hAnsi="Times New Roman"/>
+        </w:rPr>
+      </w:pPr>
+      <w:r>
+        <w:rPr>
+          <w:rFonts w:ascii="Times New Roman" w:hAnsi="Times New Roman"/>
+        </w:rPr>
+        <w:t xml:space="preserve">  </w:t>
+      </w:r>
+      <w:r>
+        <w:rPr>
+          <w:rFonts w:ascii="Times New Roman" w:hAnsi="Times New Roman"/>
+          <w:lang w:val="ru-RU"/>
+        </w:rPr>
+        <w:t>Расписался в моем присутствии:</w:t>
+      </w:r>
+    </w:p>
+    <w:p>
+      <w:pPr>
+        <w:pStyle w:val="af3"/>
+        <w:tabs>
+          <w:tab w:val="left" w:pos="163"/>
+        </w:tabs>
+        <w:spacing w:after="0" w:line="240" w:lineRule="auto"/>
+        <w:ind w:firstLineChars="200" w:firstLine="420"/>
+        <w:jc w:val="both"/>
+        <w:rPr>
+          <w:rFonts w:ascii="Times New Roman" w:hAnsi="Times New Roman"/>
+        </w:rPr>
+      </w:pPr>
+    </w:p>
+    <w:tbl>
+      <w:tblPr>
+        <w:tblStyle w:val="ad"/>
+        <w:tblW w:w="0" w:type="auto"/>
+        <w:tblBorders>
+          <w:top w:val="none" w:sz="0" w:space="0" w:color="auto"/>
+          <w:left w:val="none" w:sz="0" w:space="0" w:color="auto"/>
+          <w:bottom w:val="none" w:sz="0" w:space="0" w:color="auto"/>
+          <w:right w:val="none" w:sz="0" w:space="0" w:color="auto"/>
+          <w:insideH w:val="none" w:sz="0" w:space="0" w:color="auto"/>
+          <w:insideV w:val="none" w:sz="0" w:space="0" w:color="auto"/>
+        </w:tblBorders>
+        <w:tblLook w:val="04A0" w:firstRow="1" w:lastRow="0" w:firstColumn="1" w:lastColumn="0" w:noHBand="0" w:noVBand="1"/>
+      </w:tblPr>
+      <w:tblGrid>
+        <w:gridCol w:w="5200"/>
+        <w:gridCol w:w="5288"/>
+      </w:tblGrid>
+      <w:tr>
+        <w:tc>
+          <w:tcPr>
+            <w:tcW w:w="5266" w:type="dxa"/>
+          </w:tcPr>
+          <w:p>
+            <w:pPr>
+              <w:pStyle w:val="af3"/>
+              <w:shd w:val="clear" w:color="auto" w:fill="auto"/>
+              <w:tabs>
+                <w:tab w:val="left" w:pos="163"/>
+              </w:tabs>
+              <w:spacing w:after="0" w:line="240" w:lineRule="auto"/>
+              <w:jc w:val="both"/>
+            </w:pPr>
+            <w:r>
+              <w:rPr>
+                <w:rFonts w:ascii="Times New Roman" w:hAnsi="Times New Roman"/>
+                <w:lang w:val="ru-RU"/>
+              </w:rPr>
+              <w:t>Врач</w:t>
+            </w:r>
+            <w:r>
+              <w:rPr>
+                <w:rFonts w:ascii="Times New Roman" w:hAnsi="Times New Roman"/>
+              </w:rPr>
+              <w:t xml:space="preserve"> </w:t>
+            </w:r>
+            <w:proofErr w:type="gramStart"/>
+            <w:r>
+              <w:rPr>
+                <w:rFonts w:ascii="Times New Roman" w:hAnsi="Times New Roman"/>
+                <w:color w:val="000000"/>
+                <w:shd w:val="clear" w:color="auto" w:fill="FFFFFF"/>
+              </w:rPr>
+              <w:t xml:space="preserve">{{ </w:t>
+            </w:r>
+            <w:r>
+              <w:rPr>
+                <w:rFonts w:ascii="Times New Roman" w:hAnsi="Times New Roman"/>
+                <w:shd w:val="clear" w:color="auto" w:fill="FFFFFF"/>
+              </w:rPr>
+              <w:t>doctor</w:t>
+            </w:r>
+            <w:proofErr w:type="gramEnd"/>
+            <w:r>
+              <w:rPr>
+                <w:rFonts w:ascii="Times New Roman" w:hAnsi="Times New Roman"/>
+                <w:shd w:val="clear" w:color="auto" w:fill="FFFFFF"/>
+              </w:rPr>
+              <w:t>_</w:t>
+            </w:r>
+            <w:proofErr w:type="gramStart"/>
+            <w:r>
+              <w:rPr>
+                <w:rFonts w:ascii="Times New Roman" w:hAnsi="Times New Roman"/>
+                <w:shd w:val="clear" w:color="auto" w:fill="FFFFFF"/>
+              </w:rPr>
+              <w:t>specialization }</w:t>
+            </w:r>
+            <w:proofErr w:type="gramEnd"/>
+            <w:r>
+              <w:rPr>
+                <w:rFonts w:ascii="Times New Roman" w:hAnsi="Times New Roman"/>
+                <w:shd w:val="clear" w:color="auto" w:fill="FFFFFF"/>
+              </w:rPr>
+              <w:t>}</w:t>
+            </w:r>
+            <w:r>
+              <w:rPr>
+                <w:rFonts w:ascii="Times New Roman" w:hAnsi="Times New Roman"/>
+                <w:color w:val="000000"/>
+                <w:shd w:val="clear" w:color="auto" w:fill="FFFFFF"/>
+              </w:rPr>
+              <w:t xml:space="preserve"> </w:t>
+            </w:r>
+            <w:proofErr w:type="gramStart"/>
+            <w:r>
+              <w:rPr>
+                <w:rFonts w:ascii="Times New Roman" w:hAnsi="Times New Roman"/>
+                <w:color w:val="000000"/>
+                <w:shd w:val="clear" w:color="auto" w:fill="FFFFFF"/>
+              </w:rPr>
+              <w:t xml:space="preserve">{{  </w:t>
+            </w:r>
+            <w:proofErr w:type="gramEnd"/>
+            <w:r>
+              <w:rPr>
+                <w:rFonts w:ascii="Times New Roman" w:hAnsi="Times New Roman"/>
+                <w:color w:val="000000"/>
+                <w:shd w:val="clear" w:color="auto" w:fill="FFFFFF"/>
+              </w:rPr>
+              <w:t>doctor_name</w:t>
+            </w:r>
+            <w:r>
+              <w:rPr>
+                <w:rFonts w:ascii="Times New Roman" w:hAnsi="Times New Roman"/>
+                <w:color w:val="000000"/>
+                <w:shd w:val="clear" w:color="auto" w:fill="FFFFFF"/>
+              </w:rPr>
+              <w:t xml:space="preserve"> </w:t>
+            </w:r>
+            <w:r>
+              <w:rPr>
+                <w:rFonts w:ascii="Times New Roman" w:hAnsi="Times New Roman"/>
+                <w:color w:val="000000"/>
+                <w:shd w:val="clear" w:color="auto" w:fill="FFFFFF"/>
+              </w:rPr>
+              <w:t>}}</w:t>
+            </w:r>
+          </w:p>
+        </w:tc>
+        <w:tc>
+          <w:tcPr>
+            <w:tcW w:w="5266" w:type="dxa"/>
+          </w:tcPr>
+          <w:p>
+            <w:pPr>
+              <w:pStyle w:val="af3"/>
+              <w:shd w:val="clear" w:color="auto" w:fill="auto"/>
+              <w:tabs>
+                <w:tab w:val="left" w:pos="163"/>
+              </w:tabs>
+              <w:spacing w:after="0" w:line="240" w:lineRule="auto"/>
+              <w:jc w:val="both"/>
+            </w:pPr>
+            <w:r>
+              <w:rPr>
+                <w:rFonts w:ascii="Times New Roman" w:hAnsi="Times New Roman"/>
+              </w:rPr>
+              <w:t>(</w:t>
+            </w:r>
+            <w:r>
+              <w:rPr>
+                <w:rFonts w:ascii="Times New Roman" w:hAnsi="Times New Roman"/>
+                <w:lang w:val="ru-RU"/>
+              </w:rPr>
+              <w:t>подпись</w:t>
+            </w:r>
+            <w:r>
+              <w:rPr>
+                <w:rFonts w:ascii="Times New Roman" w:hAnsi="Times New Roman"/>
+              </w:rPr>
+              <w:t>)____________________________________</w:t>
+            </w:r>
+            <w:r>
+              <w:rPr>
+                <w:rFonts w:ascii="Times New Roman" w:hAnsi="Times New Roman"/>
+              </w:rPr>
+              <w:t>____</w:t>
+            </w:r>
+          </w:p>
+        </w:tc>
+      </w:tr>
+    </w:tbl>
+    <w:p>
+      <w:pPr>
+        <w:rPr>
+          <w:sz w:val="20"/>
+          <w:szCs w:val="20"/>
+        </w:rPr>
+      </w:pPr>
+    </w:p>
     <w:sectPr>
       <w:pgSz w:w="11906" w:h="16838"/>
-      <w:pgMar w:top="851" w:right="567" w:bottom="567" w:left="1134" w:header="397" w:footer="397" w:gutter="0"/>
+      <w:pgMar w:top="851" w:right="567" w:bottom="567" w:left="851" w:header="397" w:footer="397" w:gutter="0"/>
       <w:cols w:space="708"/>
       <w:docGrid w:linePitch="360"/>
     </w:sectPr>
@@ -5228,6 +7428,271 @@
     </w:p>
   </w:footnote>
 </w:footnotes>
+</file>
+
+<file path=word/numbering.xml><?xml version="1.0" encoding="utf-8"?>
+<w:numbering xmlns:wpc="http://schemas.microsoft.com/office/word/2010/wordprocessingCanvas" xmlns:cx="http://schemas.microsoft.com/office/drawing/2014/chartex" xmlns:cx1="http://schemas.microsoft.com/office/drawing/2015/9/8/chartex" xmlns:cx2="http://schemas.microsoft.com/office/drawing/2015/10/21/chartex" xmlns:cx3="http://schemas.microsoft.com/office/drawing/2016/5/9/chartex" xmlns:cx4="http://schemas.microsoft.com/office/drawing/2016/5/10/chartex" xmlns:cx5="http://schemas.microsoft.com/office/drawing/2016/5/11/chartex" xmlns:cx6="http://schemas.microsoft.com/office/drawing/2016/5/12/chartex" xmlns:cx7="http://schemas.microsoft.com/office/drawing/2016/5/13/chartex" xmlns:cx8="http://schemas.microsoft.com/office/drawing/2016/5/14/chartex" xmlns:mc="http://schemas.openxmlformats.org/markup-compatibility/2006" xmlns:aink="http://schemas.microsoft.com/office/drawing/2016/ink" xmlns:am3d="http://schemas.microsoft.com/office/drawing/2017/model3d" xmlns:o="urn:schemas-microsoft-com:office:office" xmlns:oel="http://schemas.microsoft.com/office/2019/extlst" xmlns:r="http://schemas.openxmlformats.org/officeDocument/2006/relationships" xmlns:m="http://schemas.openxmlformats.org/officeDocument/2006/math" xmlns:v="urn:schemas-microsoft-com:vml" xmlns:wp14="http://schemas.microsoft.com/office/word/2010/wordprocessingDrawing" xmlns:wp="http://schemas.openxmlformats.org/drawingml/2006/wordprocessingDrawing" xmlns:w10="urn:schemas-microsoft-com:office:word" xmlns:w="http://schemas.openxmlformats.org/wordprocessingml/2006/main" xmlns:w14="http://schemas.microsoft.com/office/word/2010/wordml" xmlns:w15="http://schemas.microsoft.com/office/word/2012/wordml" xmlns:w16cex="http://schemas.microsoft.com/office/word/2018/wordml/cex" xmlns:w16cid="http://schemas.microsoft.com/office/word/2016/wordml/cid" xmlns:w16="http://schemas.microsoft.com/office/word/2018/wordml" xmlns:w16du="http://schemas.microsoft.com/office/word/2023/wordml/word16du" xmlns:w16sdtdh="http://schemas.microsoft.com/office/word/2020/wordml/sdtdatahash" xmlns:w16sdtfl="http://schemas.microsoft.com/office/word/2024/wordml/sdtformatlock" xmlns:w16se="http://schemas.microsoft.com/office/word/2015/wordml/symex" xmlns:wpg="http://schemas.microsoft.com/office/word/2010/wordprocessingGroup" xmlns:wpi="http://schemas.microsoft.com/office/word/2010/wordprocessingInk" xmlns:wne="http://schemas.microsoft.com/office/word/2006/wordml" xmlns:wps="http://schemas.microsoft.com/office/word/2010/wordprocessingShape" mc:Ignorable="w14 w15 w16se w16cid w16 w16cex w16sdtdh w16sdtfl w16du wp14">
+  <w:abstractNum w:abstractNumId="0" w15:restartNumberingAfterBreak="0">
+    <w:nsid w:val="0053208E"/>
+    <w:multiLevelType w:val="multilevel"/>
+    <w:tmpl w:val="0053208E"/>
+    <w:lvl w:ilvl="0">
+      <w:start w:val="1"/>
+      <w:numFmt w:val="bullet"/>
+      <w:lvlText w:val="-"/>
+      <w:lvlJc w:val="left"/>
+      <w:pPr>
+        <w:tabs>
+          <w:tab w:val="left" w:pos="0"/>
+        </w:tabs>
+        <w:ind w:left="720" w:hanging="360"/>
+      </w:pPr>
+      <w:rPr>
+        <w:rFonts w:ascii="Sylfaen" w:hAnsi="Sylfaen" w:cs="Sylfaen" w:hint="default"/>
+        <w:b w:val="0"/>
+        <w:i w:val="0"/>
+        <w:caps w:val="0"/>
+        <w:smallCaps w:val="0"/>
+        <w:strike w:val="0"/>
+        <w:dstrike w:val="0"/>
+        <w:color w:val="000000"/>
+        <w:spacing w:val="0"/>
+        <w:w w:val="100"/>
+        <w:position w:val="0"/>
+        <w:sz w:val="21"/>
+        <w:u w:val="none"/>
+        <w:vertAlign w:val="baseline"/>
+      </w:rPr>
+    </w:lvl>
+    <w:lvl w:ilvl="1">
+      <w:start w:val="1"/>
+      <w:numFmt w:val="bullet"/>
+      <w:lvlText w:val="-"/>
+      <w:lvlJc w:val="left"/>
+      <w:pPr>
+        <w:tabs>
+          <w:tab w:val="left" w:pos="0"/>
+        </w:tabs>
+        <w:ind w:left="1080" w:hanging="360"/>
+      </w:pPr>
+      <w:rPr>
+        <w:rFonts w:ascii="Sylfaen" w:hAnsi="Sylfaen" w:cs="Sylfaen" w:hint="default"/>
+        <w:b w:val="0"/>
+        <w:i w:val="0"/>
+        <w:caps w:val="0"/>
+        <w:smallCaps w:val="0"/>
+        <w:strike w:val="0"/>
+        <w:dstrike w:val="0"/>
+        <w:color w:val="000000"/>
+        <w:spacing w:val="0"/>
+        <w:w w:val="100"/>
+        <w:position w:val="0"/>
+        <w:sz w:val="21"/>
+        <w:u w:val="none"/>
+        <w:vertAlign w:val="baseline"/>
+      </w:rPr>
+    </w:lvl>
+    <w:lvl w:ilvl="2">
+      <w:start w:val="1"/>
+      <w:numFmt w:val="bullet"/>
+      <w:lvlText w:val="-"/>
+      <w:lvlJc w:val="left"/>
+      <w:pPr>
+        <w:tabs>
+          <w:tab w:val="left" w:pos="0"/>
+        </w:tabs>
+        <w:ind w:left="1440" w:hanging="360"/>
+      </w:pPr>
+      <w:rPr>
+        <w:rFonts w:ascii="Sylfaen" w:hAnsi="Sylfaen" w:cs="Sylfaen" w:hint="default"/>
+        <w:b w:val="0"/>
+        <w:i w:val="0"/>
+        <w:caps w:val="0"/>
+        <w:smallCaps w:val="0"/>
+        <w:strike w:val="0"/>
+        <w:dstrike w:val="0"/>
+        <w:color w:val="000000"/>
+        <w:spacing w:val="0"/>
+        <w:w w:val="100"/>
+        <w:position w:val="0"/>
+        <w:sz w:val="21"/>
+        <w:u w:val="none"/>
+        <w:vertAlign w:val="baseline"/>
+      </w:rPr>
+    </w:lvl>
+    <w:lvl w:ilvl="3">
+      <w:start w:val="1"/>
+      <w:numFmt w:val="bullet"/>
+      <w:lvlText w:val="-"/>
+      <w:lvlJc w:val="left"/>
+      <w:pPr>
+        <w:tabs>
+          <w:tab w:val="left" w:pos="0"/>
+        </w:tabs>
+        <w:ind w:left="1800" w:hanging="360"/>
+      </w:pPr>
+      <w:rPr>
+        <w:rFonts w:ascii="Sylfaen" w:hAnsi="Sylfaen" w:cs="Sylfaen" w:hint="default"/>
+        <w:b w:val="0"/>
+        <w:i w:val="0"/>
+        <w:caps w:val="0"/>
+        <w:smallCaps w:val="0"/>
+        <w:strike w:val="0"/>
+        <w:dstrike w:val="0"/>
+        <w:color w:val="000000"/>
+        <w:spacing w:val="0"/>
+        <w:w w:val="100"/>
+        <w:position w:val="0"/>
+        <w:sz w:val="21"/>
+        <w:u w:val="none"/>
+        <w:vertAlign w:val="baseline"/>
+      </w:rPr>
+    </w:lvl>
+    <w:lvl w:ilvl="4">
+      <w:start w:val="1"/>
+      <w:numFmt w:val="bullet"/>
+      <w:lvlText w:val="-"/>
+      <w:lvlJc w:val="left"/>
+      <w:pPr>
+        <w:tabs>
+          <w:tab w:val="left" w:pos="0"/>
+        </w:tabs>
+        <w:ind w:left="2160" w:hanging="360"/>
+      </w:pPr>
+      <w:rPr>
+        <w:rFonts w:ascii="Sylfaen" w:hAnsi="Sylfaen" w:cs="Sylfaen" w:hint="default"/>
+        <w:b w:val="0"/>
+        <w:i w:val="0"/>
+        <w:caps w:val="0"/>
+        <w:smallCaps w:val="0"/>
+        <w:strike w:val="0"/>
+        <w:dstrike w:val="0"/>
+        <w:color w:val="000000"/>
+        <w:spacing w:val="0"/>
+        <w:w w:val="100"/>
+        <w:position w:val="0"/>
+        <w:sz w:val="21"/>
+        <w:u w:val="none"/>
+        <w:vertAlign w:val="baseline"/>
+      </w:rPr>
+    </w:lvl>
+    <w:lvl w:ilvl="5">
+      <w:start w:val="1"/>
+      <w:numFmt w:val="bullet"/>
+      <w:lvlText w:val="-"/>
+      <w:lvlJc w:val="left"/>
+      <w:pPr>
+        <w:tabs>
+          <w:tab w:val="left" w:pos="0"/>
+        </w:tabs>
+        <w:ind w:left="2520" w:hanging="360"/>
+      </w:pPr>
+      <w:rPr>
+        <w:rFonts w:ascii="Sylfaen" w:hAnsi="Sylfaen" w:cs="Sylfaen" w:hint="default"/>
+        <w:b w:val="0"/>
+        <w:i w:val="0"/>
+        <w:caps w:val="0"/>
+        <w:smallCaps w:val="0"/>
+        <w:strike w:val="0"/>
+        <w:dstrike w:val="0"/>
+        <w:color w:val="000000"/>
+        <w:spacing w:val="0"/>
+        <w:w w:val="100"/>
+        <w:position w:val="0"/>
+        <w:sz w:val="21"/>
+        <w:u w:val="none"/>
+        <w:vertAlign w:val="baseline"/>
+      </w:rPr>
+    </w:lvl>
+    <w:lvl w:ilvl="6">
+      <w:start w:val="1"/>
+      <w:numFmt w:val="bullet"/>
+      <w:lvlText w:val="-"/>
+      <w:lvlJc w:val="left"/>
+      <w:pPr>
+        <w:tabs>
+          <w:tab w:val="left" w:pos="0"/>
+        </w:tabs>
+        <w:ind w:left="2880" w:hanging="360"/>
+      </w:pPr>
+      <w:rPr>
+        <w:rFonts w:ascii="Sylfaen" w:hAnsi="Sylfaen" w:cs="Sylfaen" w:hint="default"/>
+        <w:b w:val="0"/>
+        <w:i w:val="0"/>
+        <w:caps w:val="0"/>
+        <w:smallCaps w:val="0"/>
+        <w:strike w:val="0"/>
+        <w:dstrike w:val="0"/>
+        <w:color w:val="000000"/>
+        <w:spacing w:val="0"/>
+        <w:w w:val="100"/>
+        <w:position w:val="0"/>
+        <w:sz w:val="21"/>
+        <w:u w:val="none"/>
+        <w:vertAlign w:val="baseline"/>
+      </w:rPr>
+    </w:lvl>
+    <w:lvl w:ilvl="7">
+      <w:start w:val="1"/>
+      <w:numFmt w:val="bullet"/>
+      <w:lvlText w:val="-"/>
+      <w:lvlJc w:val="left"/>
+      <w:pPr>
+        <w:tabs>
+          <w:tab w:val="left" w:pos="0"/>
+        </w:tabs>
+        <w:ind w:left="3240" w:hanging="360"/>
+      </w:pPr>
+      <w:rPr>
+        <w:rFonts w:ascii="Sylfaen" w:hAnsi="Sylfaen" w:cs="Sylfaen" w:hint="default"/>
+        <w:b w:val="0"/>
+        <w:i w:val="0"/>
+        <w:caps w:val="0"/>
+        <w:smallCaps w:val="0"/>
+        <w:strike w:val="0"/>
+        <w:dstrike w:val="0"/>
+        <w:color w:val="000000"/>
+        <w:spacing w:val="0"/>
+        <w:w w:val="100"/>
+        <w:position w:val="0"/>
+        <w:sz w:val="21"/>
+        <w:u w:val="none"/>
+        <w:vertAlign w:val="baseline"/>
+      </w:rPr>
+    </w:lvl>
+    <w:lvl w:ilvl="8">
+      <w:start w:val="1"/>
+      <w:numFmt w:val="bullet"/>
+      <w:lvlText w:val="-"/>
+      <w:lvlJc w:val="left"/>
+      <w:pPr>
+        <w:tabs>
+          <w:tab w:val="left" w:pos="0"/>
+        </w:tabs>
+        <w:ind w:left="3600" w:hanging="360"/>
+      </w:pPr>
+      <w:rPr>
+        <w:rFonts w:ascii="Sylfaen" w:hAnsi="Sylfaen" w:cs="Sylfaen" w:hint="default"/>
+        <w:b w:val="0"/>
+        <w:i w:val="0"/>
+        <w:caps w:val="0"/>
+        <w:smallCaps w:val="0"/>
+        <w:strike w:val="0"/>
+        <w:dstrike w:val="0"/>
+        <w:color w:val="000000"/>
+        <w:spacing w:val="0"/>
+        <w:w w:val="100"/>
+        <w:position w:val="0"/>
+        <w:sz w:val="21"/>
+        <w:u w:val="none"/>
+        <w:vertAlign w:val="baseline"/>
+      </w:rPr>
+    </w:lvl>
+  </w:abstractNum>
+  <w:num w:numId="1" w16cid:durableId="505825962">
+    <w:abstractNumId w:val="0"/>
+  </w:num>
+</w:numbering>
 </file>
 
 <file path=word/styles.xml><?xml version="1.0" encoding="utf-8"?>
@@ -5308,7 +7773,7 @@
     <w:lsdException w:name="Closing" w:semiHidden="1" w:unhideWhenUsed="1"/>
     <w:lsdException w:name="Signature" w:semiHidden="1" w:unhideWhenUsed="1"/>
     <w:lsdException w:name="Default Paragraph Font" w:semiHidden="1" w:uiPriority="1" w:unhideWhenUsed="1" w:qFormat="1"/>
-    <w:lsdException w:name="Body Text" w:semiHidden="1" w:unhideWhenUsed="1"/>
+    <w:lsdException w:name="Body Text" w:semiHidden="1" w:uiPriority="0" w:unhideWhenUsed="1" w:qFormat="1"/>
     <w:lsdException w:name="Body Text Indent" w:semiHidden="1" w:unhideWhenUsed="1"/>
     <w:lsdException w:name="List Continue" w:semiHidden="1" w:unhideWhenUsed="1"/>
     <w:lsdException w:name="List Continue 2" w:semiHidden="1" w:unhideWhenUsed="1"/>
@@ -5396,7 +7861,7 @@
     <w:lsdException w:name="Table Web 2" w:semiHidden="1" w:unhideWhenUsed="1"/>
     <w:lsdException w:name="Table Web 3" w:semiHidden="1" w:unhideWhenUsed="1"/>
     <w:lsdException w:name="Balloon Text" w:semiHidden="1" w:unhideWhenUsed="1" w:qFormat="1"/>
-    <w:lsdException w:name="Table Grid" w:qFormat="1"/>
+    <w:lsdException w:name="Table Grid" w:uiPriority="39" w:qFormat="1"/>
     <w:lsdException w:name="Table Theme" w:semiHidden="1" w:unhideWhenUsed="1"/>
     <w:lsdException w:name="Placeholder Text" w:semiHidden="1" w:unhideWhenUsed="1"/>
     <w:lsdException w:name="No Spacing" w:semiHidden="1" w:unhideWhenUsed="1"/>
@@ -5754,7 +8219,7 @@
   <w:style w:type="table" w:styleId="ad">
     <w:name w:val="Table Grid"/>
     <w:basedOn w:val="a1"/>
-    <w:uiPriority w:val="99"/>
+    <w:uiPriority w:val="39"/>
     <w:qFormat/>
     <w:tblPr>
       <w:tblBorders>
@@ -5922,6 +8387,72 @@
     <w:rPr>
       <w:rFonts w:ascii="Consolas" w:eastAsia="Times New Roman" w:hAnsi="Consolas"/>
     </w:rPr>
+  </w:style>
+  <w:style w:type="paragraph" w:styleId="af3">
+    <w:name w:val="Body Text"/>
+    <w:basedOn w:val="a"/>
+    <w:link w:val="af4"/>
+    <w:qFormat/>
+    <w:rsid w:val="007178AF"/>
+    <w:pPr>
+      <w:widowControl w:val="0"/>
+      <w:shd w:val="clear" w:color="auto" w:fill="FFFFFF"/>
+      <w:suppressAutoHyphens/>
+      <w:spacing w:after="120" w:line="264" w:lineRule="exact"/>
+    </w:pPr>
+    <w:rPr>
+      <w:rFonts w:ascii="Sylfaen" w:hAnsi="Sylfaen"/>
+      <w:color w:val="00000A"/>
+      <w:kern w:val="2"/>
+      <w:sz w:val="21"/>
+      <w:szCs w:val="21"/>
+      <w:lang w:val="en-US" w:eastAsia="en-US"/>
+    </w:rPr>
+  </w:style>
+  <w:style w:type="character" w:customStyle="1" w:styleId="af4">
+    <w:name w:val="Основной текст Знак"/>
+    <w:basedOn w:val="a0"/>
+    <w:link w:val="af3"/>
+    <w:rsid w:val="007178AF"/>
+    <w:rPr>
+      <w:rFonts w:ascii="Sylfaen" w:eastAsia="Times New Roman" w:hAnsi="Sylfaen"/>
+      <w:color w:val="00000A"/>
+      <w:kern w:val="2"/>
+      <w:sz w:val="21"/>
+      <w:szCs w:val="21"/>
+      <w:shd w:val="clear" w:color="auto" w:fill="FFFFFF"/>
+      <w:lang w:val="en-US" w:eastAsia="en-US"/>
+    </w:rPr>
+  </w:style>
+  <w:style w:type="character" w:customStyle="1" w:styleId="11">
+    <w:name w:val="Основной текст Знак1"/>
+    <w:qFormat/>
+    <w:rsid w:val="007178AF"/>
+    <w:rPr>
+      <w:rFonts w:ascii="Sylfaen" w:hAnsi="Sylfaen" w:cs="Sylfaen"/>
+      <w:sz w:val="21"/>
+      <w:szCs w:val="21"/>
+      <w:u w:val="none"/>
+    </w:rPr>
+  </w:style>
+  <w:style w:type="character" w:customStyle="1" w:styleId="af5">
+    <w:name w:val="Основной текст + Курсив"/>
+    <w:qFormat/>
+    <w:rsid w:val="007178AF"/>
+    <w:rPr>
+      <w:rFonts w:ascii="Sylfaen" w:hAnsi="Sylfaen" w:cs="Sylfaen"/>
+      <w:i/>
+      <w:iCs/>
+      <w:sz w:val="21"/>
+      <w:szCs w:val="21"/>
+      <w:u w:val="none"/>
+    </w:rPr>
+  </w:style>
+  <w:style w:type="character" w:customStyle="1" w:styleId="blk">
+    <w:name w:val="blk"/>
+    <w:basedOn w:val="a0"/>
+    <w:qFormat/>
+    <w:rsid w:val="007178AF"/>
   </w:style>
 </w:styles>
 </file>

</xml_diff>

<commit_message>
add fixes in templates
</commit_message>
<xml_diff>
--- a/patients/templates/patients/docs/card_IP_template.docx
+++ b/patients/templates/patients/docs/card_IP_template.docx
@@ -530,14 +530,16 @@
                 <w:b/>
                 <w:sz w:val="20"/>
                 <w:szCs w:val="20"/>
+                <w:u w:val="single"/>
               </w:rPr>
             </w:pPr>
             <w:proofErr w:type="gramStart"/>
             <w:r>
               <w:rPr>
                 <w:b/>
-                <w:sz w:val="20"/>
-                <w:szCs w:val="20"/>
+                <w:sz w:val="22"/>
+                <w:szCs w:val="22"/>
+                <w:u w:val="single"/>
               </w:rPr>
               <w:t xml:space="preserve">{{ </w:t>
             </w:r>
@@ -545,8 +547,9 @@
             <w:r>
               <w:rPr>
                 <w:b/>
-                <w:sz w:val="20"/>
-                <w:szCs w:val="20"/>
+                <w:sz w:val="22"/>
+                <w:szCs w:val="22"/>
+                <w:u w:val="single"/>
               </w:rPr>
               <w:t>card</w:t>
             </w:r>
@@ -554,8 +557,9 @@
             <w:r>
               <w:rPr>
                 <w:b/>
-                <w:sz w:val="20"/>
-                <w:szCs w:val="20"/>
+                <w:sz w:val="22"/>
+                <w:szCs w:val="22"/>
+                <w:u w:val="single"/>
               </w:rPr>
               <w:t>_number</w:t>
             </w:r>
@@ -563,8 +567,9 @@
             <w:r>
               <w:rPr>
                 <w:b/>
-                <w:sz w:val="20"/>
-                <w:szCs w:val="20"/>
+                <w:sz w:val="22"/>
+                <w:szCs w:val="22"/>
+                <w:u w:val="single"/>
               </w:rPr>
               <w:t xml:space="preserve"> }}</w:t>
             </w:r>
@@ -924,16 +929,20 @@
           <w:p>
             <w:pPr>
               <w:rPr>
-                <w:sz w:val="16"/>
-                <w:szCs w:val="16"/>
+                <w:b/>
+                <w:bCs/>
+                <w:sz w:val="22"/>
+                <w:szCs w:val="22"/>
                 <w:lang w:val="en-US"/>
               </w:rPr>
             </w:pPr>
             <w:proofErr w:type="gramStart"/>
             <w:r>
               <w:rPr>
-                <w:sz w:val="16"/>
-                <w:szCs w:val="16"/>
+                <w:b/>
+                <w:bCs/>
+                <w:sz w:val="22"/>
+                <w:szCs w:val="22"/>
                 <w:lang w:val="en-US"/>
               </w:rPr>
               <w:t>{{ surname</w:t>
@@ -941,8 +950,10 @@
             <w:proofErr w:type="gramEnd"/>
             <w:r>
               <w:rPr>
-                <w:sz w:val="16"/>
-                <w:szCs w:val="16"/>
+                <w:b/>
+                <w:bCs/>
+                <w:sz w:val="22"/>
+                <w:szCs w:val="22"/>
                 <w:lang w:val="en-US"/>
               </w:rPr>
               <w:t xml:space="preserve"> }} </w:t>
@@ -950,8 +961,10 @@
             <w:proofErr w:type="gramStart"/>
             <w:r>
               <w:rPr>
-                <w:sz w:val="16"/>
-                <w:szCs w:val="16"/>
+                <w:b/>
+                <w:bCs/>
+                <w:sz w:val="22"/>
+                <w:szCs w:val="22"/>
                 <w:lang w:val="en-US"/>
               </w:rPr>
               <w:t xml:space="preserve">{{ </w:t>
@@ -959,8 +972,10 @@
             <w:proofErr w:type="spellStart"/>
             <w:r>
               <w:rPr>
-                <w:sz w:val="16"/>
-                <w:szCs w:val="16"/>
+                <w:b/>
+                <w:bCs/>
+                <w:sz w:val="22"/>
+                <w:szCs w:val="22"/>
                 <w:lang w:val="en-US"/>
               </w:rPr>
               <w:t>first</w:t>
@@ -968,8 +983,10 @@
             <w:proofErr w:type="gramEnd"/>
             <w:r>
               <w:rPr>
-                <w:sz w:val="16"/>
-                <w:szCs w:val="16"/>
+                <w:b/>
+                <w:bCs/>
+                <w:sz w:val="22"/>
+                <w:szCs w:val="22"/>
                 <w:lang w:val="en-US"/>
               </w:rPr>
               <w:t>_</w:t>
@@ -977,8 +994,10 @@
             <w:proofErr w:type="gramStart"/>
             <w:r>
               <w:rPr>
-                <w:sz w:val="16"/>
-                <w:szCs w:val="16"/>
+                <w:b/>
+                <w:bCs/>
+                <w:sz w:val="22"/>
+                <w:szCs w:val="22"/>
                 <w:lang w:val="en-US"/>
               </w:rPr>
               <w:t>name</w:t>
@@ -986,8 +1005,10 @@
             <w:proofErr w:type="spellEnd"/>
             <w:r>
               <w:rPr>
-                <w:sz w:val="16"/>
-                <w:szCs w:val="16"/>
+                <w:b/>
+                <w:bCs/>
+                <w:sz w:val="22"/>
+                <w:szCs w:val="22"/>
                 <w:lang w:val="en-US"/>
               </w:rPr>
               <w:t xml:space="preserve"> }</w:t>
@@ -995,8 +1016,10 @@
             <w:proofErr w:type="gramEnd"/>
             <w:r>
               <w:rPr>
-                <w:sz w:val="16"/>
-                <w:szCs w:val="16"/>
+                <w:b/>
+                <w:bCs/>
+                <w:sz w:val="22"/>
+                <w:szCs w:val="22"/>
                 <w:lang w:val="en-US"/>
               </w:rPr>
               <w:t xml:space="preserve">} </w:t>
@@ -1004,8 +1027,10 @@
             <w:proofErr w:type="gramStart"/>
             <w:r>
               <w:rPr>
-                <w:sz w:val="16"/>
-                <w:szCs w:val="16"/>
+                <w:b/>
+                <w:bCs/>
+                <w:sz w:val="22"/>
+                <w:szCs w:val="22"/>
                 <w:lang w:val="en-US"/>
               </w:rPr>
               <w:t xml:space="preserve">{{ </w:t>
@@ -1013,8 +1038,10 @@
             <w:proofErr w:type="spellStart"/>
             <w:r>
               <w:rPr>
-                <w:sz w:val="16"/>
-                <w:szCs w:val="16"/>
+                <w:b/>
+                <w:bCs/>
+                <w:sz w:val="22"/>
+                <w:szCs w:val="22"/>
                 <w:lang w:val="en-US"/>
               </w:rPr>
               <w:t>last</w:t>
@@ -1022,8 +1049,10 @@
             <w:proofErr w:type="gramEnd"/>
             <w:r>
               <w:rPr>
-                <w:sz w:val="16"/>
-                <w:szCs w:val="16"/>
+                <w:b/>
+                <w:bCs/>
+                <w:sz w:val="22"/>
+                <w:szCs w:val="22"/>
                 <w:lang w:val="en-US"/>
               </w:rPr>
               <w:t>_</w:t>
@@ -1031,8 +1060,10 @@
             <w:proofErr w:type="gramStart"/>
             <w:r>
               <w:rPr>
-                <w:sz w:val="16"/>
-                <w:szCs w:val="16"/>
+                <w:b/>
+                <w:bCs/>
+                <w:sz w:val="22"/>
+                <w:szCs w:val="22"/>
                 <w:lang w:val="en-US"/>
               </w:rPr>
               <w:t>name</w:t>
@@ -1040,8 +1071,10 @@
             <w:proofErr w:type="spellEnd"/>
             <w:r>
               <w:rPr>
-                <w:sz w:val="16"/>
-                <w:szCs w:val="16"/>
+                <w:b/>
+                <w:bCs/>
+                <w:sz w:val="22"/>
+                <w:szCs w:val="22"/>
                 <w:lang w:val="en-US"/>
               </w:rPr>
               <w:t xml:space="preserve"> }</w:t>
@@ -1049,8 +1082,10 @@
             <w:proofErr w:type="gramEnd"/>
             <w:r>
               <w:rPr>
-                <w:sz w:val="16"/>
-                <w:szCs w:val="16"/>
+                <w:b/>
+                <w:bCs/>
+                <w:sz w:val="22"/>
+                <w:szCs w:val="22"/>
                 <w:lang w:val="en-US"/>
               </w:rPr>
               <w:t xml:space="preserve">} </w:t>
@@ -1113,36 +1148,46 @@
           <w:p>
             <w:pPr>
               <w:rPr>
-                <w:sz w:val="16"/>
-                <w:szCs w:val="16"/>
+                <w:b/>
+                <w:bCs/>
+                <w:sz w:val="22"/>
+                <w:szCs w:val="22"/>
               </w:rPr>
             </w:pPr>
             <w:proofErr w:type="gramStart"/>
             <w:r>
               <w:rPr>
-                <w:sz w:val="16"/>
-                <w:szCs w:val="16"/>
+                <w:b/>
+                <w:bCs/>
+                <w:sz w:val="22"/>
+                <w:szCs w:val="22"/>
               </w:rPr>
               <w:t>«</w:t>
             </w:r>
             <w:r>
               <w:rPr>
-                <w:sz w:val="16"/>
-                <w:szCs w:val="16"/>
+                <w:b/>
+                <w:bCs/>
+                <w:sz w:val="22"/>
+                <w:szCs w:val="22"/>
               </w:rPr>
               <w:t xml:space="preserve"> </w:t>
             </w:r>
             <w:r>
               <w:rPr>
-                <w:sz w:val="16"/>
-                <w:szCs w:val="16"/>
+                <w:b/>
+                <w:bCs/>
+                <w:sz w:val="22"/>
+                <w:szCs w:val="22"/>
               </w:rPr>
               <w:t xml:space="preserve"> </w:t>
             </w:r>
             <w:r>
               <w:rPr>
-                <w:sz w:val="16"/>
-                <w:szCs w:val="16"/>
+                <w:b/>
+                <w:bCs/>
+                <w:sz w:val="22"/>
+                <w:szCs w:val="22"/>
                 <w:lang w:val="en-US"/>
               </w:rPr>
               <w:t xml:space="preserve">{{ </w:t>
@@ -1150,32 +1195,40 @@
             <w:proofErr w:type="spellStart"/>
             <w:r>
               <w:rPr>
-                <w:sz w:val="16"/>
-                <w:szCs w:val="16"/>
+                <w:b/>
+                <w:bCs/>
+                <w:sz w:val="22"/>
+                <w:szCs w:val="22"/>
               </w:rPr>
               <w:t>b</w:t>
             </w:r>
             <w:proofErr w:type="gramEnd"/>
             <w:r>
               <w:rPr>
-                <w:sz w:val="16"/>
-                <w:szCs w:val="16"/>
+                <w:b/>
+                <w:bCs/>
+                <w:sz w:val="22"/>
+                <w:szCs w:val="22"/>
               </w:rPr>
               <w:t>_</w:t>
             </w:r>
             <w:proofErr w:type="gramStart"/>
             <w:r>
               <w:rPr>
-                <w:sz w:val="16"/>
-                <w:szCs w:val="16"/>
+                <w:b/>
+                <w:bCs/>
+                <w:sz w:val="22"/>
+                <w:szCs w:val="22"/>
               </w:rPr>
               <w:t>day</w:t>
             </w:r>
             <w:proofErr w:type="spellEnd"/>
             <w:r>
               <w:rPr>
-                <w:sz w:val="16"/>
-                <w:szCs w:val="16"/>
+                <w:b/>
+                <w:bCs/>
+                <w:sz w:val="22"/>
+                <w:szCs w:val="22"/>
                 <w:lang w:val="en-US"/>
               </w:rPr>
               <w:t xml:space="preserve"> }</w:t>
@@ -1183,8 +1236,10 @@
             <w:proofErr w:type="gramEnd"/>
             <w:r>
               <w:rPr>
-                <w:sz w:val="16"/>
-                <w:szCs w:val="16"/>
+                <w:b/>
+                <w:bCs/>
+                <w:sz w:val="22"/>
+                <w:szCs w:val="22"/>
                 <w:lang w:val="en-US"/>
               </w:rPr>
               <w:t>}</w:t>
@@ -1192,22 +1247,28 @@
             <w:proofErr w:type="gramStart"/>
             <w:r>
               <w:rPr>
-                <w:sz w:val="16"/>
-                <w:szCs w:val="16"/>
+                <w:b/>
+                <w:bCs/>
+                <w:sz w:val="22"/>
+                <w:szCs w:val="22"/>
               </w:rPr>
               <w:t xml:space="preserve"> </w:t>
             </w:r>
             <w:r>
               <w:rPr>
-                <w:sz w:val="16"/>
-                <w:szCs w:val="16"/>
+                <w:b/>
+                <w:bCs/>
+                <w:sz w:val="22"/>
+                <w:szCs w:val="22"/>
               </w:rPr>
               <w:t xml:space="preserve"> </w:t>
             </w:r>
             <w:r>
               <w:rPr>
-                <w:sz w:val="16"/>
-                <w:szCs w:val="16"/>
+                <w:b/>
+                <w:bCs/>
+                <w:sz w:val="22"/>
+                <w:szCs w:val="22"/>
               </w:rPr>
               <w:t>»</w:t>
             </w:r>
@@ -1229,16 +1290,20 @@
           <w:p>
             <w:pPr>
               <w:rPr>
-                <w:sz w:val="16"/>
-                <w:szCs w:val="16"/>
+                <w:b/>
+                <w:bCs/>
+                <w:sz w:val="22"/>
+                <w:szCs w:val="22"/>
                 <w:lang w:val="en-US"/>
               </w:rPr>
             </w:pPr>
             <w:proofErr w:type="gramStart"/>
             <w:r>
               <w:rPr>
-                <w:sz w:val="16"/>
-                <w:szCs w:val="16"/>
+                <w:b/>
+                <w:bCs/>
+                <w:sz w:val="22"/>
+                <w:szCs w:val="22"/>
                 <w:lang w:val="en-US"/>
               </w:rPr>
               <w:t xml:space="preserve">{{ </w:t>
@@ -1246,24 +1311,30 @@
             <w:proofErr w:type="spellStart"/>
             <w:r>
               <w:rPr>
-                <w:sz w:val="16"/>
-                <w:szCs w:val="16"/>
+                <w:b/>
+                <w:bCs/>
+                <w:sz w:val="22"/>
+                <w:szCs w:val="22"/>
               </w:rPr>
               <w:t>b</w:t>
             </w:r>
             <w:proofErr w:type="gramEnd"/>
             <w:r>
               <w:rPr>
-                <w:sz w:val="16"/>
-                <w:szCs w:val="16"/>
+                <w:b/>
+                <w:bCs/>
+                <w:sz w:val="22"/>
+                <w:szCs w:val="22"/>
               </w:rPr>
               <w:t>_month_name</w:t>
             </w:r>
             <w:proofErr w:type="spellEnd"/>
             <w:r>
               <w:rPr>
-                <w:sz w:val="16"/>
-                <w:szCs w:val="16"/>
+                <w:b/>
+                <w:bCs/>
+                <w:sz w:val="22"/>
+                <w:szCs w:val="22"/>
                 <w:lang w:val="en-US"/>
               </w:rPr>
               <w:t xml:space="preserve"> }}</w:t>
@@ -1285,15 +1356,19 @@
           <w:p>
             <w:pPr>
               <w:rPr>
-                <w:sz w:val="16"/>
-                <w:szCs w:val="16"/>
+                <w:b/>
+                <w:bCs/>
+                <w:sz w:val="22"/>
+                <w:szCs w:val="22"/>
               </w:rPr>
             </w:pPr>
             <w:proofErr w:type="gramStart"/>
             <w:r>
               <w:rPr>
-                <w:sz w:val="16"/>
-                <w:szCs w:val="16"/>
+                <w:b/>
+                <w:bCs/>
+                <w:sz w:val="22"/>
+                <w:szCs w:val="22"/>
                 <w:lang w:val="en-US"/>
               </w:rPr>
               <w:t xml:space="preserve">{{ </w:t>
@@ -1301,8 +1376,10 @@
             <w:proofErr w:type="spellStart"/>
             <w:r>
               <w:rPr>
-                <w:sz w:val="16"/>
-                <w:szCs w:val="16"/>
+                <w:b/>
+                <w:bCs/>
+                <w:sz w:val="22"/>
+                <w:szCs w:val="22"/>
                 <w:lang w:val="en-US"/>
               </w:rPr>
               <w:t>b</w:t>
@@ -1310,8 +1387,10 @@
             <w:proofErr w:type="gramEnd"/>
             <w:r>
               <w:rPr>
-                <w:sz w:val="16"/>
-                <w:szCs w:val="16"/>
+                <w:b/>
+                <w:bCs/>
+                <w:sz w:val="22"/>
+                <w:szCs w:val="22"/>
                 <w:lang w:val="en-US"/>
               </w:rPr>
               <w:t>_</w:t>
@@ -1319,8 +1398,10 @@
             <w:proofErr w:type="gramStart"/>
             <w:r>
               <w:rPr>
-                <w:sz w:val="16"/>
-                <w:szCs w:val="16"/>
+                <w:b/>
+                <w:bCs/>
+                <w:sz w:val="22"/>
+                <w:szCs w:val="22"/>
                 <w:lang w:val="en-US"/>
               </w:rPr>
               <w:t>year</w:t>
@@ -1328,8 +1409,10 @@
             <w:proofErr w:type="spellEnd"/>
             <w:r>
               <w:rPr>
-                <w:sz w:val="16"/>
-                <w:szCs w:val="16"/>
+                <w:b/>
+                <w:bCs/>
+                <w:sz w:val="22"/>
+                <w:szCs w:val="22"/>
                 <w:lang w:val="en-US"/>
               </w:rPr>
               <w:t xml:space="preserve"> }</w:t>
@@ -1337,16 +1420,20 @@
             <w:proofErr w:type="gramEnd"/>
             <w:r>
               <w:rPr>
-                <w:sz w:val="16"/>
-                <w:szCs w:val="16"/>
+                <w:b/>
+                <w:bCs/>
+                <w:sz w:val="22"/>
+                <w:szCs w:val="22"/>
                 <w:lang w:val="en-US"/>
               </w:rPr>
               <w:t>}</w:t>
             </w:r>
             <w:r>
               <w:rPr>
-                <w:sz w:val="16"/>
-                <w:szCs w:val="16"/>
+                <w:b/>
+                <w:bCs/>
+                <w:sz w:val="22"/>
+                <w:szCs w:val="22"/>
               </w:rPr>
               <w:t xml:space="preserve"> г.</w:t>
             </w:r>
@@ -1492,6 +1579,8 @@
           <w:p>
             <w:pPr>
               <w:rPr>
+                <w:b/>
+                <w:bCs/>
                 <w:sz w:val="16"/>
                 <w:szCs w:val="16"/>
                 <w:lang w:val="en-US"/>
@@ -1500,6 +1589,8 @@
             <w:proofErr w:type="gramStart"/>
             <w:r>
               <w:rPr>
+                <w:b/>
+                <w:bCs/>
                 <w:sz w:val="16"/>
                 <w:szCs w:val="16"/>
                 <w:lang w:val="en-US"/>
@@ -1509,6 +1600,8 @@
             <w:proofErr w:type="spellStart"/>
             <w:r>
               <w:rPr>
+                <w:b/>
+                <w:bCs/>
                 <w:sz w:val="16"/>
                 <w:szCs w:val="16"/>
               </w:rPr>
@@ -1518,6 +1611,8 @@
             <w:proofErr w:type="gramEnd"/>
             <w:r>
               <w:rPr>
+                <w:b/>
+                <w:bCs/>
                 <w:sz w:val="16"/>
                 <w:szCs w:val="16"/>
                 <w:lang w:val="en-US"/>
@@ -1570,6 +1665,8 @@
           <w:p>
             <w:pPr>
               <w:rPr>
+                <w:b/>
+                <w:bCs/>
                 <w:sz w:val="16"/>
                 <w:szCs w:val="16"/>
                 <w:lang w:val="en-US"/>
@@ -1578,6 +1675,8 @@
             <w:proofErr w:type="gramStart"/>
             <w:r>
               <w:rPr>
+                <w:b/>
+                <w:bCs/>
                 <w:sz w:val="16"/>
                 <w:szCs w:val="16"/>
                 <w:lang w:val="en-US"/>
@@ -1587,6 +1686,8 @@
             <w:proofErr w:type="spellStart"/>
             <w:r>
               <w:rPr>
+                <w:b/>
+                <w:bCs/>
                 <w:sz w:val="16"/>
                 <w:szCs w:val="16"/>
               </w:rPr>
@@ -1595,6 +1696,8 @@
             <w:proofErr w:type="gramEnd"/>
             <w:r>
               <w:rPr>
+                <w:b/>
+                <w:bCs/>
                 <w:sz w:val="16"/>
                 <w:szCs w:val="16"/>
               </w:rPr>
@@ -1603,6 +1706,8 @@
             <w:proofErr w:type="spellEnd"/>
             <w:r>
               <w:rPr>
+                <w:b/>
+                <w:bCs/>
                 <w:sz w:val="16"/>
                 <w:szCs w:val="16"/>
                 <w:lang w:val="en-US"/>
@@ -1655,6 +1760,8 @@
           <w:p>
             <w:pPr>
               <w:rPr>
+                <w:b/>
+                <w:bCs/>
                 <w:sz w:val="16"/>
                 <w:szCs w:val="16"/>
                 <w:lang w:val="en-US"/>
@@ -1663,6 +1770,8 @@
             <w:proofErr w:type="gramStart"/>
             <w:r>
               <w:rPr>
+                <w:b/>
+                <w:bCs/>
                 <w:sz w:val="16"/>
                 <w:szCs w:val="16"/>
                 <w:lang w:val="en-US"/>
@@ -1672,6 +1781,8 @@
             <w:proofErr w:type="spellStart"/>
             <w:r>
               <w:rPr>
+                <w:b/>
+                <w:bCs/>
                 <w:sz w:val="16"/>
                 <w:szCs w:val="16"/>
               </w:rPr>
@@ -1680,6 +1791,8 @@
             <w:proofErr w:type="gramEnd"/>
             <w:r>
               <w:rPr>
+                <w:b/>
+                <w:bCs/>
                 <w:sz w:val="16"/>
                 <w:szCs w:val="16"/>
               </w:rPr>
@@ -1688,6 +1801,8 @@
             <w:proofErr w:type="spellEnd"/>
             <w:r>
               <w:rPr>
+                <w:b/>
+                <w:bCs/>
                 <w:sz w:val="16"/>
                 <w:szCs w:val="16"/>
                 <w:lang w:val="en-US"/>
@@ -1746,16 +1861,20 @@
           <w:p>
             <w:pPr>
               <w:rPr>
-                <w:sz w:val="16"/>
-                <w:szCs w:val="16"/>
+                <w:b/>
+                <w:bCs/>
+                <w:sz w:val="22"/>
+                <w:szCs w:val="22"/>
                 <w:lang w:val="en-US"/>
               </w:rPr>
             </w:pPr>
             <w:proofErr w:type="gramStart"/>
             <w:r>
               <w:rPr>
-                <w:sz w:val="16"/>
-                <w:szCs w:val="16"/>
+                <w:b/>
+                <w:bCs/>
+                <w:sz w:val="22"/>
+                <w:szCs w:val="22"/>
                 <w:lang w:val="en-US"/>
               </w:rPr>
               <w:t xml:space="preserve">{{ </w:t>
@@ -1763,24 +1882,30 @@
             <w:proofErr w:type="spellStart"/>
             <w:r>
               <w:rPr>
-                <w:sz w:val="16"/>
-                <w:szCs w:val="16"/>
+                <w:b/>
+                <w:bCs/>
+                <w:sz w:val="22"/>
+                <w:szCs w:val="22"/>
               </w:rPr>
               <w:t>phone</w:t>
             </w:r>
             <w:proofErr w:type="gramEnd"/>
             <w:r>
               <w:rPr>
-                <w:sz w:val="16"/>
-                <w:szCs w:val="16"/>
+                <w:b/>
+                <w:bCs/>
+                <w:sz w:val="22"/>
+                <w:szCs w:val="22"/>
               </w:rPr>
               <w:t>_number</w:t>
             </w:r>
             <w:proofErr w:type="spellEnd"/>
             <w:r>
               <w:rPr>
-                <w:sz w:val="16"/>
-                <w:szCs w:val="16"/>
+                <w:b/>
+                <w:bCs/>
+                <w:sz w:val="22"/>
+                <w:szCs w:val="22"/>
                 <w:lang w:val="en-US"/>
               </w:rPr>
               <w:t xml:space="preserve"> }}</w:t>
@@ -1887,6 +2012,8 @@
           <w:p>
             <w:pPr>
               <w:rPr>
+                <w:b/>
+                <w:bCs/>
                 <w:sz w:val="16"/>
                 <w:szCs w:val="16"/>
               </w:rPr>
@@ -1894,6 +2021,8 @@
             <w:proofErr w:type="gramStart"/>
             <w:r>
               <w:rPr>
+                <w:b/>
+                <w:bCs/>
                 <w:sz w:val="16"/>
                 <w:szCs w:val="16"/>
                 <w:lang w:val="en-US"/>
@@ -1903,6 +2032,8 @@
             <w:proofErr w:type="spellStart"/>
             <w:r>
               <w:rPr>
+                <w:b/>
+                <w:bCs/>
                 <w:sz w:val="16"/>
                 <w:szCs w:val="16"/>
               </w:rPr>
@@ -1912,6 +2043,8 @@
             <w:proofErr w:type="gramEnd"/>
             <w:r>
               <w:rPr>
+                <w:b/>
+                <w:bCs/>
                 <w:sz w:val="16"/>
                 <w:szCs w:val="16"/>
                 <w:lang w:val="en-US"/>
@@ -1968,6 +2101,8 @@
           <w:p>
             <w:pPr>
               <w:rPr>
+                <w:b/>
+                <w:bCs/>
                 <w:sz w:val="16"/>
                 <w:szCs w:val="16"/>
               </w:rPr>
@@ -1975,6 +2110,8 @@
             <w:proofErr w:type="gramStart"/>
             <w:r>
               <w:rPr>
+                <w:b/>
+                <w:bCs/>
                 <w:sz w:val="16"/>
                 <w:szCs w:val="16"/>
                 <w:lang w:val="en-US"/>
@@ -1984,6 +2121,8 @@
             <w:proofErr w:type="spellStart"/>
             <w:r>
               <w:rPr>
+                <w:b/>
+                <w:bCs/>
                 <w:sz w:val="16"/>
                 <w:szCs w:val="16"/>
               </w:rPr>
@@ -1993,6 +2132,8 @@
             <w:proofErr w:type="gramEnd"/>
             <w:r>
               <w:rPr>
+                <w:b/>
+                <w:bCs/>
                 <w:sz w:val="16"/>
                 <w:szCs w:val="16"/>
                 <w:lang w:val="en-US"/>
@@ -2044,6 +2185,8 @@
           <w:p>
             <w:pPr>
               <w:rPr>
+                <w:b/>
+                <w:bCs/>
                 <w:sz w:val="16"/>
                 <w:szCs w:val="16"/>
               </w:rPr>
@@ -2051,6 +2194,8 @@
             <w:proofErr w:type="gramStart"/>
             <w:r>
               <w:rPr>
+                <w:b/>
+                <w:bCs/>
                 <w:sz w:val="16"/>
                 <w:szCs w:val="16"/>
                 <w:lang w:val="en-US"/>
@@ -2060,6 +2205,8 @@
             <w:proofErr w:type="spellStart"/>
             <w:r>
               <w:rPr>
+                <w:b/>
+                <w:bCs/>
                 <w:sz w:val="16"/>
                 <w:szCs w:val="16"/>
               </w:rPr>
@@ -2069,6 +2216,8 @@
             <w:proofErr w:type="gramEnd"/>
             <w:r>
               <w:rPr>
+                <w:b/>
+                <w:bCs/>
                 <w:sz w:val="16"/>
                 <w:szCs w:val="16"/>
                 <w:lang w:val="en-US"/>
@@ -2125,6 +2274,8 @@
           <w:p>
             <w:pPr>
               <w:rPr>
+                <w:b/>
+                <w:bCs/>
                 <w:sz w:val="16"/>
                 <w:szCs w:val="16"/>
               </w:rPr>
@@ -2132,6 +2283,8 @@
             <w:proofErr w:type="gramStart"/>
             <w:r>
               <w:rPr>
+                <w:b/>
+                <w:bCs/>
                 <w:sz w:val="16"/>
                 <w:szCs w:val="16"/>
                 <w:lang w:val="en-US"/>
@@ -2141,6 +2294,8 @@
             <w:proofErr w:type="spellStart"/>
             <w:r>
               <w:rPr>
+                <w:b/>
+                <w:bCs/>
                 <w:sz w:val="16"/>
                 <w:szCs w:val="16"/>
               </w:rPr>
@@ -2150,6 +2305,8 @@
             <w:proofErr w:type="gramEnd"/>
             <w:r>
               <w:rPr>
+                <w:b/>
+                <w:bCs/>
                 <w:sz w:val="16"/>
                 <w:szCs w:val="16"/>
               </w:rPr>
@@ -2157,6 +2314,8 @@
             </w:r>
             <w:r>
               <w:rPr>
+                <w:b/>
+                <w:bCs/>
                 <w:sz w:val="16"/>
                 <w:szCs w:val="16"/>
                 <w:lang w:val="en-US"/>
@@ -2208,6 +2367,8 @@
           <w:p>
             <w:pPr>
               <w:rPr>
+                <w:b/>
+                <w:bCs/>
                 <w:sz w:val="16"/>
                 <w:szCs w:val="16"/>
               </w:rPr>
@@ -2215,6 +2376,8 @@
             <w:proofErr w:type="gramStart"/>
             <w:r>
               <w:rPr>
+                <w:b/>
+                <w:bCs/>
                 <w:sz w:val="16"/>
                 <w:szCs w:val="16"/>
                 <w:lang w:val="en-US"/>
@@ -2224,6 +2387,8 @@
             <w:proofErr w:type="spellStart"/>
             <w:r>
               <w:rPr>
+                <w:b/>
+                <w:bCs/>
                 <w:sz w:val="16"/>
                 <w:szCs w:val="16"/>
               </w:rPr>
@@ -2233,6 +2398,8 @@
             <w:proofErr w:type="gramEnd"/>
             <w:r>
               <w:rPr>
+                <w:b/>
+                <w:bCs/>
                 <w:sz w:val="16"/>
                 <w:szCs w:val="16"/>
               </w:rPr>
@@ -2240,6 +2407,8 @@
             </w:r>
             <w:r>
               <w:rPr>
+                <w:b/>
+                <w:bCs/>
                 <w:sz w:val="16"/>
                 <w:szCs w:val="16"/>
                 <w:lang w:val="en-US"/>
@@ -2291,6 +2460,8 @@
           <w:p>
             <w:pPr>
               <w:rPr>
+                <w:b/>
+                <w:bCs/>
                 <w:sz w:val="16"/>
                 <w:szCs w:val="16"/>
               </w:rPr>
@@ -2298,6 +2469,8 @@
             <w:proofErr w:type="gramStart"/>
             <w:r>
               <w:rPr>
+                <w:b/>
+                <w:bCs/>
                 <w:sz w:val="16"/>
                 <w:szCs w:val="16"/>
                 <w:lang w:val="en-US"/>
@@ -2307,6 +2480,8 @@
             <w:proofErr w:type="spellStart"/>
             <w:r>
               <w:rPr>
+                <w:b/>
+                <w:bCs/>
                 <w:sz w:val="16"/>
                 <w:szCs w:val="16"/>
               </w:rPr>
@@ -2316,6 +2491,8 @@
             <w:proofErr w:type="gramEnd"/>
             <w:r>
               <w:rPr>
+                <w:b/>
+                <w:bCs/>
                 <w:sz w:val="16"/>
                 <w:szCs w:val="16"/>
               </w:rPr>
@@ -2323,6 +2500,8 @@
             </w:r>
             <w:r>
               <w:rPr>
+                <w:b/>
+                <w:bCs/>
                 <w:sz w:val="16"/>
                 <w:szCs w:val="16"/>
                 <w:lang w:val="en-US"/>
@@ -2374,6 +2553,8 @@
           <w:p>
             <w:pPr>
               <w:rPr>
+                <w:b/>
+                <w:bCs/>
                 <w:sz w:val="16"/>
                 <w:szCs w:val="16"/>
               </w:rPr>
@@ -2381,6 +2562,8 @@
             <w:proofErr w:type="gramStart"/>
             <w:r>
               <w:rPr>
+                <w:b/>
+                <w:bCs/>
                 <w:sz w:val="16"/>
                 <w:szCs w:val="16"/>
                 <w:lang w:val="en-US"/>
@@ -2390,6 +2573,8 @@
             <w:proofErr w:type="spellStart"/>
             <w:r>
               <w:rPr>
+                <w:b/>
+                <w:bCs/>
                 <w:sz w:val="16"/>
                 <w:szCs w:val="16"/>
               </w:rPr>
@@ -2399,6 +2584,8 @@
             <w:proofErr w:type="gramEnd"/>
             <w:r>
               <w:rPr>
+                <w:b/>
+                <w:bCs/>
                 <w:sz w:val="16"/>
                 <w:szCs w:val="16"/>
                 <w:lang w:val="en-US"/>
@@ -2512,6 +2699,8 @@
           <w:p>
             <w:pPr>
               <w:rPr>
+                <w:b/>
+                <w:bCs/>
                 <w:sz w:val="16"/>
                 <w:szCs w:val="16"/>
               </w:rPr>
@@ -2519,6 +2708,8 @@
             <w:proofErr w:type="gramStart"/>
             <w:r>
               <w:rPr>
+                <w:b/>
+                <w:bCs/>
                 <w:sz w:val="16"/>
                 <w:szCs w:val="16"/>
                 <w:lang w:val="en-US"/>
@@ -2528,6 +2719,8 @@
             <w:proofErr w:type="spellStart"/>
             <w:r>
               <w:rPr>
+                <w:b/>
+                <w:bCs/>
                 <w:sz w:val="16"/>
                 <w:szCs w:val="16"/>
               </w:rPr>
@@ -2537,6 +2730,8 @@
             <w:proofErr w:type="gramEnd"/>
             <w:r>
               <w:rPr>
+                <w:b/>
+                <w:bCs/>
                 <w:sz w:val="16"/>
                 <w:szCs w:val="16"/>
                 <w:lang w:val="en-US"/>
@@ -2593,6 +2788,8 @@
           <w:p>
             <w:pPr>
               <w:rPr>
+                <w:b/>
+                <w:bCs/>
                 <w:sz w:val="16"/>
                 <w:szCs w:val="16"/>
               </w:rPr>
@@ -2600,6 +2797,8 @@
             <w:proofErr w:type="gramStart"/>
             <w:r>
               <w:rPr>
+                <w:b/>
+                <w:bCs/>
                 <w:sz w:val="16"/>
                 <w:szCs w:val="16"/>
                 <w:lang w:val="en-US"/>
@@ -2609,6 +2808,8 @@
             <w:proofErr w:type="spellStart"/>
             <w:r>
               <w:rPr>
+                <w:b/>
+                <w:bCs/>
                 <w:sz w:val="16"/>
                 <w:szCs w:val="16"/>
               </w:rPr>
@@ -2618,6 +2819,8 @@
             <w:proofErr w:type="gramEnd"/>
             <w:r>
               <w:rPr>
+                <w:b/>
+                <w:bCs/>
                 <w:sz w:val="16"/>
                 <w:szCs w:val="16"/>
                 <w:lang w:val="en-US"/>
@@ -2669,6 +2872,8 @@
           <w:p>
             <w:pPr>
               <w:rPr>
+                <w:b/>
+                <w:bCs/>
                 <w:sz w:val="16"/>
                 <w:szCs w:val="16"/>
               </w:rPr>
@@ -2676,6 +2881,8 @@
             <w:proofErr w:type="gramStart"/>
             <w:r>
               <w:rPr>
+                <w:b/>
+                <w:bCs/>
                 <w:sz w:val="16"/>
                 <w:szCs w:val="16"/>
                 <w:lang w:val="en-US"/>
@@ -2685,6 +2892,8 @@
             <w:proofErr w:type="spellStart"/>
             <w:r>
               <w:rPr>
+                <w:b/>
+                <w:bCs/>
                 <w:sz w:val="16"/>
                 <w:szCs w:val="16"/>
               </w:rPr>
@@ -2694,6 +2903,8 @@
             <w:proofErr w:type="gramEnd"/>
             <w:r>
               <w:rPr>
+                <w:b/>
+                <w:bCs/>
                 <w:sz w:val="16"/>
                 <w:szCs w:val="16"/>
                 <w:lang w:val="en-US"/>
@@ -2750,6 +2961,8 @@
           <w:p>
             <w:pPr>
               <w:rPr>
+                <w:b/>
+                <w:bCs/>
                 <w:sz w:val="16"/>
                 <w:szCs w:val="16"/>
               </w:rPr>
@@ -2757,6 +2970,8 @@
             <w:proofErr w:type="gramStart"/>
             <w:r>
               <w:rPr>
+                <w:b/>
+                <w:bCs/>
                 <w:sz w:val="16"/>
                 <w:szCs w:val="16"/>
                 <w:lang w:val="en-US"/>
@@ -2766,6 +2981,8 @@
             <w:proofErr w:type="spellStart"/>
             <w:r>
               <w:rPr>
+                <w:b/>
+                <w:bCs/>
                 <w:sz w:val="16"/>
                 <w:szCs w:val="16"/>
               </w:rPr>
@@ -2775,6 +2992,8 @@
             <w:proofErr w:type="gramEnd"/>
             <w:r>
               <w:rPr>
+                <w:b/>
+                <w:bCs/>
                 <w:sz w:val="16"/>
                 <w:szCs w:val="16"/>
               </w:rPr>
@@ -2782,6 +3001,8 @@
             </w:r>
             <w:r>
               <w:rPr>
+                <w:b/>
+                <w:bCs/>
                 <w:sz w:val="16"/>
                 <w:szCs w:val="16"/>
                 <w:lang w:val="en-US"/>
@@ -2833,6 +3054,8 @@
           <w:p>
             <w:pPr>
               <w:rPr>
+                <w:b/>
+                <w:bCs/>
                 <w:sz w:val="16"/>
                 <w:szCs w:val="16"/>
               </w:rPr>
@@ -2840,6 +3063,8 @@
             <w:proofErr w:type="gramStart"/>
             <w:r>
               <w:rPr>
+                <w:b/>
+                <w:bCs/>
                 <w:sz w:val="16"/>
                 <w:szCs w:val="16"/>
                 <w:lang w:val="en-US"/>
@@ -2849,6 +3074,8 @@
             <w:proofErr w:type="spellStart"/>
             <w:r>
               <w:rPr>
+                <w:b/>
+                <w:bCs/>
                 <w:sz w:val="16"/>
                 <w:szCs w:val="16"/>
               </w:rPr>
@@ -2858,6 +3085,8 @@
             <w:proofErr w:type="gramEnd"/>
             <w:r>
               <w:rPr>
+                <w:b/>
+                <w:bCs/>
                 <w:sz w:val="16"/>
                 <w:szCs w:val="16"/>
               </w:rPr>
@@ -2865,6 +3094,8 @@
             </w:r>
             <w:r>
               <w:rPr>
+                <w:b/>
+                <w:bCs/>
                 <w:sz w:val="16"/>
                 <w:szCs w:val="16"/>
                 <w:lang w:val="en-US"/>
@@ -2916,6 +3147,8 @@
           <w:p>
             <w:pPr>
               <w:rPr>
+                <w:b/>
+                <w:bCs/>
                 <w:sz w:val="16"/>
                 <w:szCs w:val="16"/>
               </w:rPr>
@@ -2923,6 +3156,8 @@
             <w:proofErr w:type="gramStart"/>
             <w:r>
               <w:rPr>
+                <w:b/>
+                <w:bCs/>
                 <w:sz w:val="16"/>
                 <w:szCs w:val="16"/>
                 <w:lang w:val="en-US"/>
@@ -2932,6 +3167,8 @@
             <w:proofErr w:type="spellStart"/>
             <w:r>
               <w:rPr>
+                <w:b/>
+                <w:bCs/>
                 <w:sz w:val="16"/>
                 <w:szCs w:val="16"/>
               </w:rPr>
@@ -2941,6 +3178,8 @@
             <w:proofErr w:type="gramEnd"/>
             <w:r>
               <w:rPr>
+                <w:b/>
+                <w:bCs/>
                 <w:sz w:val="16"/>
                 <w:szCs w:val="16"/>
               </w:rPr>
@@ -2948,6 +3187,8 @@
             </w:r>
             <w:r>
               <w:rPr>
+                <w:b/>
+                <w:bCs/>
                 <w:sz w:val="16"/>
                 <w:szCs w:val="16"/>
                 <w:lang w:val="en-US"/>
@@ -2999,6 +3240,8 @@
           <w:p>
             <w:pPr>
               <w:rPr>
+                <w:b/>
+                <w:bCs/>
                 <w:sz w:val="16"/>
                 <w:szCs w:val="16"/>
               </w:rPr>
@@ -3006,6 +3249,8 @@
             <w:proofErr w:type="gramStart"/>
             <w:r>
               <w:rPr>
+                <w:b/>
+                <w:bCs/>
                 <w:sz w:val="16"/>
                 <w:szCs w:val="16"/>
                 <w:lang w:val="en-US"/>
@@ -3015,6 +3260,8 @@
             <w:proofErr w:type="spellStart"/>
             <w:r>
               <w:rPr>
+                <w:b/>
+                <w:bCs/>
                 <w:sz w:val="16"/>
                 <w:szCs w:val="16"/>
               </w:rPr>
@@ -3024,6 +3271,8 @@
             <w:proofErr w:type="gramEnd"/>
             <w:r>
               <w:rPr>
+                <w:b/>
+                <w:bCs/>
                 <w:sz w:val="16"/>
                 <w:szCs w:val="16"/>
                 <w:lang w:val="en-US"/>

</xml_diff>

<commit_message>
add fixes in schedule
</commit_message>
<xml_diff>
--- a/patients/templates/patients/docs/card_IP_template.docx
+++ b/patients/templates/patients/docs/card_IP_template.docx
@@ -540,7 +540,37 @@
                 <w:szCs w:val="22"/>
                 <w:u w:val="single"/>
               </w:rPr>
-              <w:t>{{ card_number }}</w:t>
+              <w:t xml:space="preserve">{{ </w:t>
+            </w:r>
+            <w:proofErr w:type="spellStart"/>
+            <w:r>
+              <w:rPr>
+                <w:b/>
+                <w:sz w:val="22"/>
+                <w:szCs w:val="22"/>
+                <w:u w:val="single"/>
+              </w:rPr>
+              <w:t>card_number</w:t>
+            </w:r>
+            <w:proofErr w:type="spellEnd"/>
+            <w:r>
+              <w:rPr>
+                <w:b/>
+                <w:sz w:val="22"/>
+                <w:szCs w:val="22"/>
+                <w:u w:val="single"/>
+                <w:lang w:val="en-US"/>
+              </w:rPr>
+              <w:t xml:space="preserve">_IP </w:t>
+            </w:r>
+            <w:r>
+              <w:rPr>
+                <w:b/>
+                <w:sz w:val="22"/>
+                <w:szCs w:val="22"/>
+                <w:u w:val="single"/>
+              </w:rPr>
+              <w:t>}}</w:t>
             </w:r>
           </w:p>
         </w:tc>
@@ -654,7 +684,25 @@
                 <w:szCs w:val="16"/>
                 <w:lang w:val="en-US"/>
               </w:rPr>
-              <w:t>{{ c_day }}</w:t>
+              <w:t xml:space="preserve">{{ </w:t>
+            </w:r>
+            <w:proofErr w:type="spellStart"/>
+            <w:r>
+              <w:rPr>
+                <w:sz w:val="16"/>
+                <w:szCs w:val="16"/>
+                <w:lang w:val="en-US"/>
+              </w:rPr>
+              <w:t>c_day</w:t>
+            </w:r>
+            <w:proofErr w:type="spellEnd"/>
+            <w:r>
+              <w:rPr>
+                <w:sz w:val="16"/>
+                <w:szCs w:val="16"/>
+                <w:lang w:val="en-US"/>
+              </w:rPr>
+              <w:t xml:space="preserve"> }}</w:t>
             </w:r>
           </w:p>
         </w:tc>
@@ -708,7 +756,25 @@
                 <w:szCs w:val="16"/>
                 <w:lang w:val="en-US"/>
               </w:rPr>
-              <w:t>{{ cur_month_ru }}</w:t>
+              <w:t xml:space="preserve">{{ </w:t>
+            </w:r>
+            <w:proofErr w:type="spellStart"/>
+            <w:r>
+              <w:rPr>
+                <w:sz w:val="16"/>
+                <w:szCs w:val="16"/>
+                <w:lang w:val="en-US"/>
+              </w:rPr>
+              <w:t>cur_month_ru</w:t>
+            </w:r>
+            <w:proofErr w:type="spellEnd"/>
+            <w:r>
+              <w:rPr>
+                <w:sz w:val="16"/>
+                <w:szCs w:val="16"/>
+                <w:lang w:val="en-US"/>
+              </w:rPr>
+              <w:t xml:space="preserve"> }}</w:t>
             </w:r>
           </w:p>
         </w:tc>
@@ -762,7 +828,25 @@
                 <w:szCs w:val="16"/>
                 <w:lang w:val="en-US"/>
               </w:rPr>
-              <w:t>{{ current_year }}</w:t>
+              <w:t xml:space="preserve">{{ </w:t>
+            </w:r>
+            <w:proofErr w:type="spellStart"/>
+            <w:r>
+              <w:rPr>
+                <w:sz w:val="16"/>
+                <w:szCs w:val="16"/>
+                <w:lang w:val="en-US"/>
+              </w:rPr>
+              <w:t>current_year</w:t>
+            </w:r>
+            <w:proofErr w:type="spellEnd"/>
+            <w:r>
+              <w:rPr>
+                <w:sz w:val="16"/>
+                <w:szCs w:val="16"/>
+                <w:lang w:val="en-US"/>
+              </w:rPr>
+              <w:t xml:space="preserve"> }}</w:t>
             </w:r>
           </w:p>
         </w:tc>
@@ -829,7 +913,51 @@
                 <w:szCs w:val="22"/>
                 <w:lang w:val="en-US"/>
               </w:rPr>
-              <w:t xml:space="preserve">{{ surname }} {{ first_name }} {{ last_name }} </w:t>
+              <w:t xml:space="preserve">{{ surname }} {{ </w:t>
+            </w:r>
+            <w:proofErr w:type="spellStart"/>
+            <w:r>
+              <w:rPr>
+                <w:b/>
+                <w:bCs/>
+                <w:sz w:val="22"/>
+                <w:szCs w:val="22"/>
+                <w:lang w:val="en-US"/>
+              </w:rPr>
+              <w:t>first_name</w:t>
+            </w:r>
+            <w:proofErr w:type="spellEnd"/>
+            <w:r>
+              <w:rPr>
+                <w:b/>
+                <w:bCs/>
+                <w:sz w:val="22"/>
+                <w:szCs w:val="22"/>
+                <w:lang w:val="en-US"/>
+              </w:rPr>
+              <w:t xml:space="preserve"> }} {{ </w:t>
+            </w:r>
+            <w:proofErr w:type="spellStart"/>
+            <w:r>
+              <w:rPr>
+                <w:b/>
+                <w:bCs/>
+                <w:sz w:val="22"/>
+                <w:szCs w:val="22"/>
+                <w:lang w:val="en-US"/>
+              </w:rPr>
+              <w:t>last_name</w:t>
+            </w:r>
+            <w:proofErr w:type="spellEnd"/>
+            <w:r>
+              <w:rPr>
+                <w:b/>
+                <w:bCs/>
+                <w:sz w:val="22"/>
+                <w:szCs w:val="22"/>
+                <w:lang w:val="en-US"/>
+              </w:rPr>
+              <w:t xml:space="preserve"> }} </w:t>
             </w:r>
           </w:p>
         </w:tc>
@@ -932,6 +1060,7 @@
               </w:rPr>
               <w:t xml:space="preserve">{{ </w:t>
             </w:r>
+            <w:proofErr w:type="spellStart"/>
             <w:r>
               <w:rPr>
                 <w:b/>
@@ -941,6 +1070,7 @@
               </w:rPr>
               <w:t>b_day</w:t>
             </w:r>
+            <w:proofErr w:type="spellEnd"/>
             <w:r>
               <w:rPr>
                 <w:b/>
@@ -1012,6 +1142,7 @@
               </w:rPr>
               <w:t xml:space="preserve">{{ </w:t>
             </w:r>
+            <w:proofErr w:type="spellStart"/>
             <w:r>
               <w:rPr>
                 <w:b/>
@@ -1021,6 +1152,7 @@
               </w:rPr>
               <w:t>b_month_name</w:t>
             </w:r>
+            <w:proofErr w:type="spellEnd"/>
             <w:r>
               <w:rPr>
                 <w:b/>
@@ -1062,7 +1194,29 @@
                 <w:szCs w:val="22"/>
                 <w:lang w:val="en-US"/>
               </w:rPr>
-              <w:t>{{ b_year }}</w:t>
+              <w:t xml:space="preserve">{{ </w:t>
+            </w:r>
+            <w:proofErr w:type="spellStart"/>
+            <w:r>
+              <w:rPr>
+                <w:b/>
+                <w:bCs/>
+                <w:sz w:val="22"/>
+                <w:szCs w:val="22"/>
+                <w:lang w:val="en-US"/>
+              </w:rPr>
+              <w:t>b_year</w:t>
+            </w:r>
+            <w:proofErr w:type="spellEnd"/>
+            <w:r>
+              <w:rPr>
+                <w:b/>
+                <w:bCs/>
+                <w:sz w:val="22"/>
+                <w:szCs w:val="22"/>
+                <w:lang w:val="en-US"/>
+              </w:rPr>
+              <w:t xml:space="preserve"> }}</w:t>
             </w:r>
             <w:r>
               <w:rPr>
@@ -1222,6 +1376,7 @@
               </w:rPr>
               <w:t xml:space="preserve">{{ </w:t>
             </w:r>
+            <w:proofErr w:type="spellStart"/>
             <w:r>
               <w:rPr>
                 <w:b/>
@@ -1231,6 +1386,7 @@
               </w:rPr>
               <w:t>passport</w:t>
             </w:r>
+            <w:proofErr w:type="spellEnd"/>
             <w:r>
               <w:rPr>
                 <w:b/>
@@ -1304,6 +1460,7 @@
               </w:rPr>
               <w:t xml:space="preserve">{{ </w:t>
             </w:r>
+            <w:proofErr w:type="spellStart"/>
             <w:r>
               <w:rPr>
                 <w:b/>
@@ -1313,6 +1470,7 @@
               </w:rPr>
               <w:t>p_series</w:t>
             </w:r>
+            <w:proofErr w:type="spellEnd"/>
             <w:r>
               <w:rPr>
                 <w:b/>
@@ -1386,6 +1544,7 @@
               </w:rPr>
               <w:t xml:space="preserve">{{ </w:t>
             </w:r>
+            <w:proofErr w:type="spellStart"/>
             <w:r>
               <w:rPr>
                 <w:b/>
@@ -1395,6 +1554,7 @@
               </w:rPr>
               <w:t>p_number</w:t>
             </w:r>
+            <w:proofErr w:type="spellEnd"/>
             <w:r>
               <w:rPr>
                 <w:b/>
@@ -1474,6 +1634,7 @@
               </w:rPr>
               <w:t xml:space="preserve">{{ </w:t>
             </w:r>
+            <w:proofErr w:type="spellStart"/>
             <w:r>
               <w:rPr>
                 <w:b/>
@@ -1483,6 +1644,7 @@
               </w:rPr>
               <w:t>phone_number</w:t>
             </w:r>
+            <w:proofErr w:type="spellEnd"/>
             <w:r>
               <w:rPr>
                 <w:b/>
@@ -1611,6 +1773,7 @@
               </w:rPr>
               <w:t xml:space="preserve">{{ </w:t>
             </w:r>
+            <w:proofErr w:type="spellStart"/>
             <w:r>
               <w:rPr>
                 <w:b/>
@@ -1620,6 +1783,7 @@
               </w:rPr>
               <w:t>area</w:t>
             </w:r>
+            <w:proofErr w:type="spellEnd"/>
             <w:r>
               <w:rPr>
                 <w:b/>
@@ -1696,6 +1860,7 @@
               </w:rPr>
               <w:t xml:space="preserve">{{ </w:t>
             </w:r>
+            <w:proofErr w:type="spellStart"/>
             <w:r>
               <w:rPr>
                 <w:b/>
@@ -1705,6 +1870,7 @@
               </w:rPr>
               <w:t>district</w:t>
             </w:r>
+            <w:proofErr w:type="spellEnd"/>
             <w:r>
               <w:rPr>
                 <w:b/>
@@ -1776,6 +1942,7 @@
               </w:rPr>
               <w:t xml:space="preserve">{{ </w:t>
             </w:r>
+            <w:proofErr w:type="spellStart"/>
             <w:r>
               <w:rPr>
                 <w:b/>
@@ -1785,6 +1952,7 @@
               </w:rPr>
               <w:t>locality</w:t>
             </w:r>
+            <w:proofErr w:type="spellEnd"/>
             <w:r>
               <w:rPr>
                 <w:b/>
@@ -1861,14 +2029,25 @@
               </w:rPr>
               <w:t xml:space="preserve">{{ </w:t>
             </w:r>
-            <w:r>
-              <w:rPr>
-                <w:b/>
-                <w:bCs/>
-                <w:sz w:val="16"/>
-                <w:szCs w:val="16"/>
-              </w:rPr>
-              <w:t xml:space="preserve">street </w:t>
+            <w:proofErr w:type="spellStart"/>
+            <w:r>
+              <w:rPr>
+                <w:b/>
+                <w:bCs/>
+                <w:sz w:val="16"/>
+                <w:szCs w:val="16"/>
+              </w:rPr>
+              <w:t>street</w:t>
+            </w:r>
+            <w:proofErr w:type="spellEnd"/>
+            <w:r>
+              <w:rPr>
+                <w:b/>
+                <w:bCs/>
+                <w:sz w:val="16"/>
+                <w:szCs w:val="16"/>
+              </w:rPr>
+              <w:t xml:space="preserve"> </w:t>
             </w:r>
             <w:r>
               <w:rPr>
@@ -1941,14 +2120,25 @@
               </w:rPr>
               <w:t xml:space="preserve">{{ </w:t>
             </w:r>
-            <w:r>
-              <w:rPr>
-                <w:b/>
-                <w:bCs/>
-                <w:sz w:val="16"/>
-                <w:szCs w:val="16"/>
-              </w:rPr>
-              <w:t xml:space="preserve">home </w:t>
+            <w:proofErr w:type="spellStart"/>
+            <w:r>
+              <w:rPr>
+                <w:b/>
+                <w:bCs/>
+                <w:sz w:val="16"/>
+                <w:szCs w:val="16"/>
+              </w:rPr>
+              <w:t>home</w:t>
+            </w:r>
+            <w:proofErr w:type="spellEnd"/>
+            <w:r>
+              <w:rPr>
+                <w:b/>
+                <w:bCs/>
+                <w:sz w:val="16"/>
+                <w:szCs w:val="16"/>
+              </w:rPr>
+              <w:t xml:space="preserve"> </w:t>
             </w:r>
             <w:r>
               <w:rPr>
@@ -2021,14 +2211,25 @@
               </w:rPr>
               <w:t xml:space="preserve">{{ </w:t>
             </w:r>
-            <w:r>
-              <w:rPr>
-                <w:b/>
-                <w:bCs/>
-                <w:sz w:val="16"/>
-                <w:szCs w:val="16"/>
-              </w:rPr>
-              <w:t xml:space="preserve">building </w:t>
+            <w:proofErr w:type="spellStart"/>
+            <w:r>
+              <w:rPr>
+                <w:b/>
+                <w:bCs/>
+                <w:sz w:val="16"/>
+                <w:szCs w:val="16"/>
+              </w:rPr>
+              <w:t>building</w:t>
+            </w:r>
+            <w:proofErr w:type="spellEnd"/>
+            <w:r>
+              <w:rPr>
+                <w:b/>
+                <w:bCs/>
+                <w:sz w:val="16"/>
+                <w:szCs w:val="16"/>
+              </w:rPr>
+              <w:t xml:space="preserve"> </w:t>
             </w:r>
             <w:r>
               <w:rPr>
@@ -2101,6 +2302,7 @@
               </w:rPr>
               <w:t xml:space="preserve">{{ </w:t>
             </w:r>
+            <w:proofErr w:type="spellStart"/>
             <w:r>
               <w:rPr>
                 <w:b/>
@@ -2110,6 +2312,7 @@
               </w:rPr>
               <w:t>apartment</w:t>
             </w:r>
+            <w:proofErr w:type="spellEnd"/>
             <w:r>
               <w:rPr>
                 <w:b/>
@@ -2243,6 +2446,7 @@
               </w:rPr>
               <w:t xml:space="preserve">{{ </w:t>
             </w:r>
+            <w:proofErr w:type="spellStart"/>
             <w:r>
               <w:rPr>
                 <w:b/>
@@ -2252,6 +2456,7 @@
               </w:rPr>
               <w:t>area</w:t>
             </w:r>
+            <w:proofErr w:type="spellEnd"/>
             <w:r>
               <w:rPr>
                 <w:b/>
@@ -2328,6 +2533,7 @@
               </w:rPr>
               <w:t xml:space="preserve">{{ </w:t>
             </w:r>
+            <w:proofErr w:type="spellStart"/>
             <w:r>
               <w:rPr>
                 <w:b/>
@@ -2337,6 +2543,7 @@
               </w:rPr>
               <w:t>district</w:t>
             </w:r>
+            <w:proofErr w:type="spellEnd"/>
             <w:r>
               <w:rPr>
                 <w:b/>
@@ -2408,6 +2615,7 @@
               </w:rPr>
               <w:t xml:space="preserve">{{ </w:t>
             </w:r>
+            <w:proofErr w:type="spellStart"/>
             <w:r>
               <w:rPr>
                 <w:b/>
@@ -2417,6 +2625,7 @@
               </w:rPr>
               <w:t>locality</w:t>
             </w:r>
+            <w:proofErr w:type="spellEnd"/>
             <w:r>
               <w:rPr>
                 <w:b/>
@@ -2493,14 +2702,25 @@
               </w:rPr>
               <w:t xml:space="preserve">{{ </w:t>
             </w:r>
-            <w:r>
-              <w:rPr>
-                <w:b/>
-                <w:bCs/>
-                <w:sz w:val="16"/>
-                <w:szCs w:val="16"/>
-              </w:rPr>
-              <w:t xml:space="preserve">street </w:t>
+            <w:proofErr w:type="spellStart"/>
+            <w:r>
+              <w:rPr>
+                <w:b/>
+                <w:bCs/>
+                <w:sz w:val="16"/>
+                <w:szCs w:val="16"/>
+              </w:rPr>
+              <w:t>street</w:t>
+            </w:r>
+            <w:proofErr w:type="spellEnd"/>
+            <w:r>
+              <w:rPr>
+                <w:b/>
+                <w:bCs/>
+                <w:sz w:val="16"/>
+                <w:szCs w:val="16"/>
+              </w:rPr>
+              <w:t xml:space="preserve"> </w:t>
             </w:r>
             <w:r>
               <w:rPr>
@@ -2573,14 +2793,25 @@
               </w:rPr>
               <w:t xml:space="preserve">{{ </w:t>
             </w:r>
-            <w:r>
-              <w:rPr>
-                <w:b/>
-                <w:bCs/>
-                <w:sz w:val="16"/>
-                <w:szCs w:val="16"/>
-              </w:rPr>
-              <w:t xml:space="preserve">home </w:t>
+            <w:proofErr w:type="spellStart"/>
+            <w:r>
+              <w:rPr>
+                <w:b/>
+                <w:bCs/>
+                <w:sz w:val="16"/>
+                <w:szCs w:val="16"/>
+              </w:rPr>
+              <w:t>home</w:t>
+            </w:r>
+            <w:proofErr w:type="spellEnd"/>
+            <w:r>
+              <w:rPr>
+                <w:b/>
+                <w:bCs/>
+                <w:sz w:val="16"/>
+                <w:szCs w:val="16"/>
+              </w:rPr>
+              <w:t xml:space="preserve"> </w:t>
             </w:r>
             <w:r>
               <w:rPr>
@@ -2653,14 +2884,25 @@
               </w:rPr>
               <w:t xml:space="preserve">{{ </w:t>
             </w:r>
-            <w:r>
-              <w:rPr>
-                <w:b/>
-                <w:bCs/>
-                <w:sz w:val="16"/>
-                <w:szCs w:val="16"/>
-              </w:rPr>
-              <w:t xml:space="preserve">building </w:t>
+            <w:proofErr w:type="spellStart"/>
+            <w:r>
+              <w:rPr>
+                <w:b/>
+                <w:bCs/>
+                <w:sz w:val="16"/>
+                <w:szCs w:val="16"/>
+              </w:rPr>
+              <w:t>building</w:t>
+            </w:r>
+            <w:proofErr w:type="spellEnd"/>
+            <w:r>
+              <w:rPr>
+                <w:b/>
+                <w:bCs/>
+                <w:sz w:val="16"/>
+                <w:szCs w:val="16"/>
+              </w:rPr>
+              <w:t xml:space="preserve"> </w:t>
             </w:r>
             <w:r>
               <w:rPr>
@@ -2733,6 +2975,7 @@
               </w:rPr>
               <w:t xml:space="preserve">{{ </w:t>
             </w:r>
+            <w:proofErr w:type="spellStart"/>
             <w:r>
               <w:rPr>
                 <w:b/>
@@ -2742,6 +2985,7 @@
               </w:rPr>
               <w:t>apartment</w:t>
             </w:r>
+            <w:proofErr w:type="spellEnd"/>
             <w:r>
               <w:rPr>
                 <w:b/>
@@ -5413,8 +5657,17 @@
                 <w:sz w:val="20"/>
                 <w:szCs w:val="20"/>
               </w:rPr>
-              <w:t>антиген К1 системы Kell</w:t>
-            </w:r>
+              <w:t xml:space="preserve">антиген К1 системы </w:t>
+            </w:r>
+            <w:proofErr w:type="spellStart"/>
+            <w:r>
+              <w:rPr>
+                <w:sz w:val="20"/>
+                <w:szCs w:val="20"/>
+              </w:rPr>
+              <w:t>Kell</w:t>
+            </w:r>
+            <w:proofErr w:type="spellEnd"/>
           </w:p>
         </w:tc>
         <w:tc>
@@ -5726,8 +5979,69 @@
           <w:szCs w:val="24"/>
           <w:lang w:eastAsia="zh-CN" w:bidi="ar"/>
         </w:rPr>
-        <w:t>П Епифанова Ольга Евгеньевна</w:t>
-      </w:r>
+        <w:t xml:space="preserve">П </w:t>
+      </w:r>
+      <w:proofErr w:type="spellStart"/>
+      <w:r>
+        <w:rPr>
+          <w:rFonts w:ascii="Times New Roman" w:eastAsia="SimSun" w:hAnsi="Times New Roman"/>
+          <w:color w:val="auto"/>
+          <w:kern w:val="0"/>
+          <w:sz w:val="24"/>
+          <w:szCs w:val="24"/>
+          <w:lang w:eastAsia="zh-CN" w:bidi="ar"/>
+        </w:rPr>
+        <w:t>Епифанова</w:t>
+      </w:r>
+      <w:proofErr w:type="spellEnd"/>
+      <w:r>
+        <w:rPr>
+          <w:rFonts w:ascii="Times New Roman" w:eastAsia="SimSun" w:hAnsi="Times New Roman"/>
+          <w:color w:val="auto"/>
+          <w:kern w:val="0"/>
+          <w:sz w:val="24"/>
+          <w:szCs w:val="24"/>
+          <w:lang w:eastAsia="zh-CN" w:bidi="ar"/>
+        </w:rPr>
+        <w:t xml:space="preserve"> </w:t>
+      </w:r>
+      <w:proofErr w:type="spellStart"/>
+      <w:r>
+        <w:rPr>
+          <w:rFonts w:ascii="Times New Roman" w:eastAsia="SimSun" w:hAnsi="Times New Roman"/>
+          <w:color w:val="auto"/>
+          <w:kern w:val="0"/>
+          <w:sz w:val="24"/>
+          <w:szCs w:val="24"/>
+          <w:lang w:eastAsia="zh-CN" w:bidi="ar"/>
+        </w:rPr>
+        <w:t>Ольга</w:t>
+      </w:r>
+      <w:proofErr w:type="spellEnd"/>
+      <w:r>
+        <w:rPr>
+          <w:rFonts w:ascii="Times New Roman" w:eastAsia="SimSun" w:hAnsi="Times New Roman"/>
+          <w:color w:val="auto"/>
+          <w:kern w:val="0"/>
+          <w:sz w:val="24"/>
+          <w:szCs w:val="24"/>
+          <w:lang w:eastAsia="zh-CN" w:bidi="ar"/>
+        </w:rPr>
+        <w:t xml:space="preserve"> </w:t>
+      </w:r>
+      <w:proofErr w:type="spellStart"/>
+      <w:r>
+        <w:rPr>
+          <w:rFonts w:ascii="Times New Roman" w:eastAsia="SimSun" w:hAnsi="Times New Roman"/>
+          <w:color w:val="auto"/>
+          <w:kern w:val="0"/>
+          <w:sz w:val="24"/>
+          <w:szCs w:val="24"/>
+          <w:lang w:eastAsia="zh-CN" w:bidi="ar"/>
+        </w:rPr>
+        <w:t>Евгеньевна</w:t>
+      </w:r>
+      <w:proofErr w:type="spellEnd"/>
     </w:p>
     <w:tbl>
       <w:tblPr>
@@ -5885,7 +6199,79 @@
           <w:szCs w:val="22"/>
           <w:lang w:val="ru-RU"/>
         </w:rPr>
-        <w:t>{{ surname }} {{ first_name }} {{ last_name }}</w:t>
+        <w:t xml:space="preserve">{{ </w:t>
+      </w:r>
+      <w:proofErr w:type="spellStart"/>
+      <w:r>
+        <w:rPr>
+          <w:rFonts w:ascii="Times New Roman" w:hAnsi="Times New Roman"/>
+          <w:b/>
+          <w:bCs/>
+          <w:sz w:val="22"/>
+          <w:szCs w:val="22"/>
+          <w:lang w:val="ru-RU"/>
+        </w:rPr>
+        <w:t>surname</w:t>
+      </w:r>
+      <w:proofErr w:type="spellEnd"/>
+      <w:r>
+        <w:rPr>
+          <w:rFonts w:ascii="Times New Roman" w:hAnsi="Times New Roman"/>
+          <w:b/>
+          <w:bCs/>
+          <w:sz w:val="22"/>
+          <w:szCs w:val="22"/>
+          <w:lang w:val="ru-RU"/>
+        </w:rPr>
+        <w:t xml:space="preserve"> }} {{ </w:t>
+      </w:r>
+      <w:proofErr w:type="spellStart"/>
+      <w:r>
+        <w:rPr>
+          <w:rFonts w:ascii="Times New Roman" w:hAnsi="Times New Roman"/>
+          <w:b/>
+          <w:bCs/>
+          <w:sz w:val="22"/>
+          <w:szCs w:val="22"/>
+          <w:lang w:val="ru-RU"/>
+        </w:rPr>
+        <w:t>first_name</w:t>
+      </w:r>
+      <w:proofErr w:type="spellEnd"/>
+      <w:r>
+        <w:rPr>
+          <w:rFonts w:ascii="Times New Roman" w:hAnsi="Times New Roman"/>
+          <w:b/>
+          <w:bCs/>
+          <w:sz w:val="22"/>
+          <w:szCs w:val="22"/>
+          <w:lang w:val="ru-RU"/>
+        </w:rPr>
+        <w:t xml:space="preserve"> }} {{ </w:t>
+      </w:r>
+      <w:proofErr w:type="spellStart"/>
+      <w:r>
+        <w:rPr>
+          <w:rFonts w:ascii="Times New Roman" w:hAnsi="Times New Roman"/>
+          <w:b/>
+          <w:bCs/>
+          <w:sz w:val="22"/>
+          <w:szCs w:val="22"/>
+          <w:lang w:val="ru-RU"/>
+        </w:rPr>
+        <w:t>last_name</w:t>
+      </w:r>
+      <w:proofErr w:type="spellEnd"/>
+      <w:r>
+        <w:rPr>
+          <w:rFonts w:ascii="Times New Roman" w:hAnsi="Times New Roman"/>
+          <w:b/>
+          <w:bCs/>
+          <w:sz w:val="22"/>
+          <w:szCs w:val="22"/>
+          <w:lang w:val="ru-RU"/>
+        </w:rPr>
+        <w:t xml:space="preserve"> }}</w:t>
       </w:r>
       <w:r>
         <w:rPr>
@@ -6117,6 +6503,7 @@
         </w:rPr>
         <w:t>_</w:t>
       </w:r>
+      <w:proofErr w:type="spellStart"/>
       <w:r>
         <w:rPr>
           <w:rFonts w:ascii="Times New Roman" w:hAnsi="Times New Roman"/>
@@ -6125,6 +6512,7 @@
         </w:rPr>
         <w:t>ru</w:t>
       </w:r>
+      <w:proofErr w:type="spellEnd"/>
       <w:r>
         <w:rPr>
           <w:rFonts w:ascii="Times New Roman" w:hAnsi="Times New Roman"/>
@@ -6243,8 +6631,19 @@
                 <w:szCs w:val="22"/>
                 <w:u w:val="single"/>
               </w:rPr>
-              <w:t xml:space="preserve"> appointment_date</w:t>
-            </w:r>
+              <w:t xml:space="preserve"> </w:t>
+            </w:r>
+            <w:proofErr w:type="spellStart"/>
+            <w:r>
+              <w:rPr>
+                <w:rFonts w:ascii="Times New Roman" w:hAnsi="Times New Roman"/>
+                <w:sz w:val="22"/>
+                <w:szCs w:val="22"/>
+                <w:u w:val="single"/>
+              </w:rPr>
+              <w:t>appointment_date</w:t>
+            </w:r>
+            <w:proofErr w:type="spellEnd"/>
             <w:r>
               <w:rPr>
                 <w:rFonts w:ascii="Times New Roman" w:hAnsi="Times New Roman"/>
@@ -6426,8 +6825,69 @@
           <w:szCs w:val="24"/>
           <w:lang w:eastAsia="zh-CN" w:bidi="ar"/>
         </w:rPr>
-        <w:t>П Епифанова Ольга Евгеньевна</w:t>
-      </w:r>
+        <w:t xml:space="preserve">П </w:t>
+      </w:r>
+      <w:proofErr w:type="spellStart"/>
+      <w:r>
+        <w:rPr>
+          <w:rFonts w:ascii="Times New Roman" w:eastAsia="SimSun" w:hAnsi="Times New Roman"/>
+          <w:color w:val="auto"/>
+          <w:kern w:val="0"/>
+          <w:sz w:val="24"/>
+          <w:szCs w:val="24"/>
+          <w:lang w:eastAsia="zh-CN" w:bidi="ar"/>
+        </w:rPr>
+        <w:t>Епифанова</w:t>
+      </w:r>
+      <w:proofErr w:type="spellEnd"/>
+      <w:r>
+        <w:rPr>
+          <w:rFonts w:ascii="Times New Roman" w:eastAsia="SimSun" w:hAnsi="Times New Roman"/>
+          <w:color w:val="auto"/>
+          <w:kern w:val="0"/>
+          <w:sz w:val="24"/>
+          <w:szCs w:val="24"/>
+          <w:lang w:eastAsia="zh-CN" w:bidi="ar"/>
+        </w:rPr>
+        <w:t xml:space="preserve"> </w:t>
+      </w:r>
+      <w:proofErr w:type="spellStart"/>
+      <w:r>
+        <w:rPr>
+          <w:rFonts w:ascii="Times New Roman" w:eastAsia="SimSun" w:hAnsi="Times New Roman"/>
+          <w:color w:val="auto"/>
+          <w:kern w:val="0"/>
+          <w:sz w:val="24"/>
+          <w:szCs w:val="24"/>
+          <w:lang w:eastAsia="zh-CN" w:bidi="ar"/>
+        </w:rPr>
+        <w:t>Ольга</w:t>
+      </w:r>
+      <w:proofErr w:type="spellEnd"/>
+      <w:r>
+        <w:rPr>
+          <w:rFonts w:ascii="Times New Roman" w:eastAsia="SimSun" w:hAnsi="Times New Roman"/>
+          <w:color w:val="auto"/>
+          <w:kern w:val="0"/>
+          <w:sz w:val="24"/>
+          <w:szCs w:val="24"/>
+          <w:lang w:eastAsia="zh-CN" w:bidi="ar"/>
+        </w:rPr>
+        <w:t xml:space="preserve"> </w:t>
+      </w:r>
+      <w:proofErr w:type="spellStart"/>
+      <w:r>
+        <w:rPr>
+          <w:rFonts w:ascii="Times New Roman" w:eastAsia="SimSun" w:hAnsi="Times New Roman"/>
+          <w:color w:val="auto"/>
+          <w:kern w:val="0"/>
+          <w:sz w:val="24"/>
+          <w:szCs w:val="24"/>
+          <w:lang w:eastAsia="zh-CN" w:bidi="ar"/>
+        </w:rPr>
+        <w:t>Евгеньевна</w:t>
+      </w:r>
+      <w:proofErr w:type="spellEnd"/>
     </w:p>
     <w:tbl>
       <w:tblPr>
@@ -6581,7 +7041,79 @@
           <w:color w:val="000000"/>
           <w:lang w:val="ru-RU"/>
         </w:rPr>
-        <w:t>{{ surname }} {{ first_name }} {{ last_name }},</w:t>
+        <w:t xml:space="preserve">{{ </w:t>
+      </w:r>
+      <w:proofErr w:type="spellStart"/>
+      <w:r>
+        <w:rPr>
+          <w:rStyle w:val="11"/>
+          <w:rFonts w:ascii="Times New Roman" w:hAnsi="Times New Roman"/>
+          <w:b/>
+          <w:bCs/>
+          <w:color w:val="000000"/>
+          <w:lang w:val="ru-RU"/>
+        </w:rPr>
+        <w:t>surname</w:t>
+      </w:r>
+      <w:proofErr w:type="spellEnd"/>
+      <w:r>
+        <w:rPr>
+          <w:rStyle w:val="11"/>
+          <w:rFonts w:ascii="Times New Roman" w:hAnsi="Times New Roman"/>
+          <w:b/>
+          <w:bCs/>
+          <w:color w:val="000000"/>
+          <w:lang w:val="ru-RU"/>
+        </w:rPr>
+        <w:t xml:space="preserve"> }} {{ </w:t>
+      </w:r>
+      <w:proofErr w:type="spellStart"/>
+      <w:r>
+        <w:rPr>
+          <w:rStyle w:val="11"/>
+          <w:rFonts w:ascii="Times New Roman" w:hAnsi="Times New Roman"/>
+          <w:b/>
+          <w:bCs/>
+          <w:color w:val="000000"/>
+          <w:lang w:val="ru-RU"/>
+        </w:rPr>
+        <w:t>first_name</w:t>
+      </w:r>
+      <w:proofErr w:type="spellEnd"/>
+      <w:r>
+        <w:rPr>
+          <w:rStyle w:val="11"/>
+          <w:rFonts w:ascii="Times New Roman" w:hAnsi="Times New Roman"/>
+          <w:b/>
+          <w:bCs/>
+          <w:color w:val="000000"/>
+          <w:lang w:val="ru-RU"/>
+        </w:rPr>
+        <w:t xml:space="preserve"> }} {{ </w:t>
+      </w:r>
+      <w:proofErr w:type="spellStart"/>
+      <w:r>
+        <w:rPr>
+          <w:rStyle w:val="11"/>
+          <w:rFonts w:ascii="Times New Roman" w:hAnsi="Times New Roman"/>
+          <w:b/>
+          <w:bCs/>
+          <w:color w:val="000000"/>
+          <w:lang w:val="ru-RU"/>
+        </w:rPr>
+        <w:t>last_name</w:t>
+      </w:r>
+      <w:proofErr w:type="spellEnd"/>
+      <w:r>
+        <w:rPr>
+          <w:rStyle w:val="11"/>
+          <w:rFonts w:ascii="Times New Roman" w:hAnsi="Times New Roman"/>
+          <w:b/>
+          <w:bCs/>
+          <w:color w:val="000000"/>
+          <w:lang w:val="ru-RU"/>
+        </w:rPr>
+        <w:t xml:space="preserve"> }},</w:t>
       </w:r>
       <w:r>
         <w:rPr>
@@ -6711,6 +7243,7 @@
         </w:rPr>
         <w:t xml:space="preserve">{{  </w:t>
       </w:r>
+      <w:proofErr w:type="spellStart"/>
       <w:r>
         <w:rPr>
           <w:rFonts w:ascii="Times New Roman" w:hAnsi="Times New Roman"/>
@@ -6741,6 +7274,7 @@
         </w:rPr>
         <w:t>name</w:t>
       </w:r>
+      <w:proofErr w:type="spellEnd"/>
       <w:r>
         <w:rPr>
           <w:rFonts w:ascii="Times New Roman" w:hAnsi="Times New Roman"/>
@@ -6772,6 +7306,7 @@
         </w:rPr>
         <w:t xml:space="preserve"> {{ </w:t>
       </w:r>
+      <w:proofErr w:type="spellStart"/>
       <w:r>
         <w:rPr>
           <w:rFonts w:ascii="Times New Roman" w:hAnsi="Times New Roman"/>
@@ -6799,6 +7334,7 @@
         </w:rPr>
         <w:t>specialization</w:t>
       </w:r>
+      <w:proofErr w:type="spellEnd"/>
       <w:r>
         <w:rPr>
           <w:rFonts w:ascii="Times New Roman" w:hAnsi="Times New Roman"/>
@@ -6968,6 +7504,7 @@
           <w:i w:val="0"/>
           <w:iCs w:val="0"/>
           <w:color w:val="000000"/>
+          <w:lang w:val="ru-RU"/>
         </w:rPr>
       </w:pPr>
     </w:p>
@@ -7188,8 +7725,19 @@
                 <w:szCs w:val="22"/>
                 <w:u w:val="single"/>
               </w:rPr>
-              <w:t xml:space="preserve"> appointment_date</w:t>
-            </w:r>
+              <w:t xml:space="preserve"> </w:t>
+            </w:r>
+            <w:proofErr w:type="spellStart"/>
+            <w:r>
+              <w:rPr>
+                <w:rFonts w:ascii="Times New Roman" w:hAnsi="Times New Roman"/>
+                <w:sz w:val="22"/>
+                <w:szCs w:val="22"/>
+                <w:u w:val="single"/>
+              </w:rPr>
+              <w:t>appointment_date</w:t>
+            </w:r>
+            <w:proofErr w:type="spellEnd"/>
             <w:r>
               <w:rPr>
                 <w:rFonts w:ascii="Times New Roman" w:hAnsi="Times New Roman"/>
@@ -7397,12 +7945,21 @@
               </w:rPr>
               <w:t xml:space="preserve">{{ </w:t>
             </w:r>
+            <w:proofErr w:type="spellStart"/>
             <w:r>
               <w:rPr>
                 <w:rFonts w:ascii="Times New Roman" w:hAnsi="Times New Roman"/>
                 <w:shd w:val="clear" w:color="auto" w:fill="FFFFFF"/>
               </w:rPr>
-              <w:t>doctor_specialization }}</w:t>
+              <w:t>doctor_specialization</w:t>
+            </w:r>
+            <w:proofErr w:type="spellEnd"/>
+            <w:r>
+              <w:rPr>
+                <w:rFonts w:ascii="Times New Roman" w:hAnsi="Times New Roman"/>
+                <w:shd w:val="clear" w:color="auto" w:fill="FFFFFF"/>
+              </w:rPr>
+              <w:t xml:space="preserve"> }}</w:t>
             </w:r>
             <w:r>
               <w:rPr>
@@ -7410,8 +7967,18 @@
                 <w:color w:val="000000"/>
                 <w:shd w:val="clear" w:color="auto" w:fill="FFFFFF"/>
               </w:rPr>
-              <w:t xml:space="preserve"> {{  doctor_name</w:t>
-            </w:r>
+              <w:t xml:space="preserve"> {{  </w:t>
+            </w:r>
+            <w:proofErr w:type="spellStart"/>
+            <w:r>
+              <w:rPr>
+                <w:rFonts w:ascii="Times New Roman" w:hAnsi="Times New Roman"/>
+                <w:color w:val="000000"/>
+                <w:shd w:val="clear" w:color="auto" w:fill="FFFFFF"/>
+              </w:rPr>
+              <w:t>doctor_name</w:t>
+            </w:r>
+            <w:proofErr w:type="spellEnd"/>
             <w:r>
               <w:rPr>
                 <w:rFonts w:ascii="Times New Roman" w:hAnsi="Times New Roman"/>

</xml_diff>

<commit_message>
add fixes in print and docs templates
</commit_message>
<xml_diff>
--- a/patients/templates/patients/docs/card_IP_template.docx
+++ b/patients/templates/patients/docs/card_IP_template.docx
@@ -115,6 +115,7 @@
           </w:tcPr>
           <w:p>
             <w:pPr>
+              <w:ind w:left="137"/>
               <w:rPr>
                 <w:b/>
                 <w:bCs/>
@@ -201,6 +202,7 @@
           </w:tcPr>
           <w:p>
             <w:pPr>
+              <w:ind w:left="137"/>
               <w:rPr>
                 <w:sz w:val="16"/>
                 <w:szCs w:val="16"/>
@@ -271,6 +273,7 @@
           </w:tcPr>
           <w:p>
             <w:pPr>
+              <w:ind w:left="137"/>
               <w:rPr>
                 <w:sz w:val="16"/>
                 <w:szCs w:val="16"/>
@@ -349,6 +352,7 @@
           </w:tcPr>
           <w:p>
             <w:pPr>
+              <w:ind w:left="137"/>
               <w:rPr>
                 <w:sz w:val="16"/>
                 <w:szCs w:val="16"/>
@@ -533,6 +537,7 @@
                 <w:u w:val="single"/>
               </w:rPr>
             </w:pPr>
+            <w:proofErr w:type="gramStart"/>
             <w:r>
               <w:rPr>
                 <w:b/>
@@ -550,7 +555,17 @@
                 <w:szCs w:val="22"/>
                 <w:u w:val="single"/>
               </w:rPr>
-              <w:t>card_number</w:t>
+              <w:t>card</w:t>
+            </w:r>
+            <w:proofErr w:type="gramEnd"/>
+            <w:r>
+              <w:rPr>
+                <w:b/>
+                <w:sz w:val="22"/>
+                <w:szCs w:val="22"/>
+                <w:u w:val="single"/>
+              </w:rPr>
+              <w:t>_number</w:t>
             </w:r>
             <w:proofErr w:type="spellEnd"/>
             <w:r>
@@ -588,7 +603,7 @@
       <w:tblPr>
         <w:tblStyle w:val="ad"/>
         <w:tblW w:w="11057" w:type="dxa"/>
-        <w:tblInd w:w="-601" w:type="dxa"/>
+        <w:tblInd w:w="-426" w:type="dxa"/>
         <w:tblLayout w:type="fixed"/>
         <w:tblLook w:val="04A0" w:firstRow="1" w:lastRow="0" w:firstColumn="1" w:lastColumn="0" w:noHBand="0" w:noVBand="1"/>
       </w:tblPr>
@@ -678,6 +693,7 @@
                 <w:szCs w:val="16"/>
               </w:rPr>
             </w:pPr>
+            <w:proofErr w:type="gramStart"/>
             <w:r>
               <w:rPr>
                 <w:sz w:val="16"/>
@@ -693,7 +709,16 @@
                 <w:szCs w:val="16"/>
                 <w:lang w:val="en-US"/>
               </w:rPr>
-              <w:t>c_day</w:t>
+              <w:t>c</w:t>
+            </w:r>
+            <w:proofErr w:type="gramEnd"/>
+            <w:r>
+              <w:rPr>
+                <w:sz w:val="16"/>
+                <w:szCs w:val="16"/>
+                <w:lang w:val="en-US"/>
+              </w:rPr>
+              <w:t>_day</w:t>
             </w:r>
             <w:proofErr w:type="spellEnd"/>
             <w:r>
@@ -750,6 +775,7 @@
                 <w:szCs w:val="16"/>
               </w:rPr>
             </w:pPr>
+            <w:proofErr w:type="gramStart"/>
             <w:r>
               <w:rPr>
                 <w:sz w:val="16"/>
@@ -765,7 +791,16 @@
                 <w:szCs w:val="16"/>
                 <w:lang w:val="en-US"/>
               </w:rPr>
-              <w:t>cur_month_ru</w:t>
+              <w:t>cur</w:t>
+            </w:r>
+            <w:proofErr w:type="gramEnd"/>
+            <w:r>
+              <w:rPr>
+                <w:sz w:val="16"/>
+                <w:szCs w:val="16"/>
+                <w:lang w:val="en-US"/>
+              </w:rPr>
+              <w:t>_month_ru</w:t>
             </w:r>
             <w:proofErr w:type="spellEnd"/>
             <w:r>
@@ -822,6 +857,7 @@
                 <w:szCs w:val="16"/>
               </w:rPr>
             </w:pPr>
+            <w:proofErr w:type="gramStart"/>
             <w:r>
               <w:rPr>
                 <w:sz w:val="16"/>
@@ -837,7 +873,16 @@
                 <w:szCs w:val="16"/>
                 <w:lang w:val="en-US"/>
               </w:rPr>
-              <w:t>current_year</w:t>
+              <w:t>current</w:t>
+            </w:r>
+            <w:proofErr w:type="gramEnd"/>
+            <w:r>
+              <w:rPr>
+                <w:sz w:val="16"/>
+                <w:szCs w:val="16"/>
+                <w:lang w:val="en-US"/>
+              </w:rPr>
+              <w:t>_year</w:t>
             </w:r>
             <w:proofErr w:type="spellEnd"/>
             <w:r>
@@ -905,6 +950,7 @@
                 <w:lang w:val="en-US"/>
               </w:rPr>
             </w:pPr>
+            <w:proofErr w:type="gramStart"/>
             <w:r>
               <w:rPr>
                 <w:b/>
@@ -913,9 +959,9 @@
                 <w:szCs w:val="22"/>
                 <w:lang w:val="en-US"/>
               </w:rPr>
-              <w:t xml:space="preserve">{{ surname }} {{ </w:t>
-            </w:r>
-            <w:proofErr w:type="spellStart"/>
+              <w:t>{{ surname</w:t>
+            </w:r>
+            <w:proofErr w:type="gramEnd"/>
             <w:r>
               <w:rPr>
                 <w:b/>
@@ -924,9 +970,9 @@
                 <w:szCs w:val="22"/>
                 <w:lang w:val="en-US"/>
               </w:rPr>
-              <w:t>first_name</w:t>
-            </w:r>
-            <w:proofErr w:type="spellEnd"/>
+              <w:t xml:space="preserve"> }} </w:t>
+            </w:r>
+            <w:proofErr w:type="gramStart"/>
             <w:r>
               <w:rPr>
                 <w:b/>
@@ -935,7 +981,7 @@
                 <w:szCs w:val="22"/>
                 <w:lang w:val="en-US"/>
               </w:rPr>
-              <w:t xml:space="preserve"> }} {{ </w:t>
+              <w:t xml:space="preserve">{{ </w:t>
             </w:r>
             <w:proofErr w:type="spellStart"/>
             <w:r>
@@ -946,9 +992,9 @@
                 <w:szCs w:val="22"/>
                 <w:lang w:val="en-US"/>
               </w:rPr>
-              <w:t>last_name</w:t>
-            </w:r>
-            <w:proofErr w:type="spellEnd"/>
+              <w:t>first</w:t>
+            </w:r>
+            <w:proofErr w:type="gramEnd"/>
             <w:r>
               <w:rPr>
                 <w:b/>
@@ -957,7 +1003,106 @@
                 <w:szCs w:val="22"/>
                 <w:lang w:val="en-US"/>
               </w:rPr>
-              <w:t xml:space="preserve"> }} </w:t>
+              <w:t>_</w:t>
+            </w:r>
+            <w:proofErr w:type="gramStart"/>
+            <w:r>
+              <w:rPr>
+                <w:b/>
+                <w:bCs/>
+                <w:sz w:val="22"/>
+                <w:szCs w:val="22"/>
+                <w:lang w:val="en-US"/>
+              </w:rPr>
+              <w:t>name</w:t>
+            </w:r>
+            <w:proofErr w:type="spellEnd"/>
+            <w:r>
+              <w:rPr>
+                <w:b/>
+                <w:bCs/>
+                <w:sz w:val="22"/>
+                <w:szCs w:val="22"/>
+                <w:lang w:val="en-US"/>
+              </w:rPr>
+              <w:t xml:space="preserve"> }</w:t>
+            </w:r>
+            <w:proofErr w:type="gramEnd"/>
+            <w:r>
+              <w:rPr>
+                <w:b/>
+                <w:bCs/>
+                <w:sz w:val="22"/>
+                <w:szCs w:val="22"/>
+                <w:lang w:val="en-US"/>
+              </w:rPr>
+              <w:t xml:space="preserve">} </w:t>
+            </w:r>
+            <w:proofErr w:type="gramStart"/>
+            <w:r>
+              <w:rPr>
+                <w:b/>
+                <w:bCs/>
+                <w:sz w:val="22"/>
+                <w:szCs w:val="22"/>
+                <w:lang w:val="en-US"/>
+              </w:rPr>
+              <w:t xml:space="preserve">{{ </w:t>
+            </w:r>
+            <w:proofErr w:type="spellStart"/>
+            <w:r>
+              <w:rPr>
+                <w:b/>
+                <w:bCs/>
+                <w:sz w:val="22"/>
+                <w:szCs w:val="22"/>
+                <w:lang w:val="en-US"/>
+              </w:rPr>
+              <w:t>last</w:t>
+            </w:r>
+            <w:proofErr w:type="gramEnd"/>
+            <w:r>
+              <w:rPr>
+                <w:b/>
+                <w:bCs/>
+                <w:sz w:val="22"/>
+                <w:szCs w:val="22"/>
+                <w:lang w:val="en-US"/>
+              </w:rPr>
+              <w:t>_</w:t>
+            </w:r>
+            <w:proofErr w:type="gramStart"/>
+            <w:r>
+              <w:rPr>
+                <w:b/>
+                <w:bCs/>
+                <w:sz w:val="22"/>
+                <w:szCs w:val="22"/>
+                <w:lang w:val="en-US"/>
+              </w:rPr>
+              <w:t>name</w:t>
+            </w:r>
+            <w:proofErr w:type="spellEnd"/>
+            <w:r>
+              <w:rPr>
+                <w:b/>
+                <w:bCs/>
+                <w:sz w:val="22"/>
+                <w:szCs w:val="22"/>
+                <w:lang w:val="en-US"/>
+              </w:rPr>
+              <w:t xml:space="preserve"> }</w:t>
+            </w:r>
+            <w:proofErr w:type="gramEnd"/>
+            <w:r>
+              <w:rPr>
+                <w:b/>
+                <w:bCs/>
+                <w:sz w:val="22"/>
+                <w:szCs w:val="22"/>
+                <w:lang w:val="en-US"/>
+              </w:rPr>
+              <w:t xml:space="preserve">} </w:t>
             </w:r>
           </w:p>
         </w:tc>
@@ -1023,6 +1168,7 @@
                 <w:szCs w:val="22"/>
               </w:rPr>
             </w:pPr>
+            <w:proofErr w:type="gramStart"/>
             <w:r>
               <w:rPr>
                 <w:b/>
@@ -1068,7 +1214,27 @@
                 <w:sz w:val="22"/>
                 <w:szCs w:val="22"/>
               </w:rPr>
-              <w:t>b_day</w:t>
+              <w:t>b</w:t>
+            </w:r>
+            <w:proofErr w:type="gramEnd"/>
+            <w:r>
+              <w:rPr>
+                <w:b/>
+                <w:bCs/>
+                <w:sz w:val="22"/>
+                <w:szCs w:val="22"/>
+              </w:rPr>
+              <w:t>_</w:t>
+            </w:r>
+            <w:proofErr w:type="gramStart"/>
+            <w:r>
+              <w:rPr>
+                <w:b/>
+                <w:bCs/>
+                <w:sz w:val="22"/>
+                <w:szCs w:val="22"/>
+              </w:rPr>
+              <w:t>day</w:t>
             </w:r>
             <w:proofErr w:type="spellEnd"/>
             <w:r>
@@ -1079,51 +1245,10 @@
                 <w:szCs w:val="22"/>
                 <w:lang w:val="en-US"/>
               </w:rPr>
-              <w:t xml:space="preserve"> }}</w:t>
-            </w:r>
-            <w:r>
-              <w:rPr>
-                <w:b/>
-                <w:bCs/>
-                <w:sz w:val="22"/>
-                <w:szCs w:val="22"/>
-              </w:rPr>
-              <w:t xml:space="preserve"> </w:t>
-            </w:r>
-            <w:r>
-              <w:rPr>
-                <w:b/>
-                <w:bCs/>
-                <w:sz w:val="22"/>
-                <w:szCs w:val="22"/>
-              </w:rPr>
-              <w:t xml:space="preserve"> </w:t>
-            </w:r>
-            <w:r>
-              <w:rPr>
-                <w:b/>
-                <w:bCs/>
-                <w:sz w:val="22"/>
-                <w:szCs w:val="22"/>
-              </w:rPr>
-              <w:t>»</w:t>
-            </w:r>
-          </w:p>
-        </w:tc>
-        <w:tc>
-          <w:tcPr>
-            <w:tcW w:w="1701" w:type="dxa"/>
-            <w:gridSpan w:val="6"/>
-            <w:tcBorders>
-              <w:top w:val="nil"/>
-              <w:left w:val="nil"/>
-              <w:bottom w:val="single" w:sz="4" w:space="0" w:color="auto"/>
-              <w:right w:val="nil"/>
-            </w:tcBorders>
-            <w:vAlign w:val="bottom"/>
-          </w:tcPr>
-          <w:p>
-            <w:pPr>
+              <w:t xml:space="preserve"> }</w:t>
+            </w:r>
+            <w:proofErr w:type="gramEnd"/>
+            <w:r>
               <w:rPr>
                 <w:b/>
                 <w:bCs/>
@@ -1131,8 +1256,53 @@
                 <w:szCs w:val="22"/>
                 <w:lang w:val="en-US"/>
               </w:rPr>
-            </w:pPr>
-            <w:r>
+              <w:t>}</w:t>
+            </w:r>
+            <w:proofErr w:type="gramStart"/>
+            <w:r>
+              <w:rPr>
+                <w:b/>
+                <w:bCs/>
+                <w:sz w:val="22"/>
+                <w:szCs w:val="22"/>
+              </w:rPr>
+              <w:t xml:space="preserve"> </w:t>
+            </w:r>
+            <w:r>
+              <w:rPr>
+                <w:b/>
+                <w:bCs/>
+                <w:sz w:val="22"/>
+                <w:szCs w:val="22"/>
+              </w:rPr>
+              <w:t xml:space="preserve"> </w:t>
+            </w:r>
+            <w:r>
+              <w:rPr>
+                <w:b/>
+                <w:bCs/>
+                <w:sz w:val="22"/>
+                <w:szCs w:val="22"/>
+              </w:rPr>
+              <w:t>»</w:t>
+            </w:r>
+            <w:proofErr w:type="gramEnd"/>
+          </w:p>
+        </w:tc>
+        <w:tc>
+          <w:tcPr>
+            <w:tcW w:w="1701" w:type="dxa"/>
+            <w:gridSpan w:val="6"/>
+            <w:tcBorders>
+              <w:top w:val="nil"/>
+              <w:left w:val="nil"/>
+              <w:bottom w:val="single" w:sz="4" w:space="0" w:color="auto"/>
+              <w:right w:val="nil"/>
+            </w:tcBorders>
+            <w:vAlign w:val="bottom"/>
+          </w:tcPr>
+          <w:p>
+            <w:pPr>
               <w:rPr>
                 <w:b/>
                 <w:bCs/>
@@ -1140,19 +1310,8 @@
                 <w:szCs w:val="22"/>
                 <w:lang w:val="en-US"/>
               </w:rPr>
-              <w:t xml:space="preserve">{{ </w:t>
-            </w:r>
-            <w:proofErr w:type="spellStart"/>
-            <w:r>
-              <w:rPr>
-                <w:b/>
-                <w:bCs/>
-                <w:sz w:val="22"/>
-                <w:szCs w:val="22"/>
-              </w:rPr>
-              <w:t>b_month_name</w:t>
-            </w:r>
-            <w:proofErr w:type="spellEnd"/>
+            </w:pPr>
+            <w:proofErr w:type="gramStart"/>
             <w:r>
               <w:rPr>
                 <w:b/>
@@ -1161,31 +1320,29 @@
                 <w:szCs w:val="22"/>
                 <w:lang w:val="en-US"/>
               </w:rPr>
-              <w:t xml:space="preserve"> }}</w:t>
-            </w:r>
-          </w:p>
-        </w:tc>
-        <w:tc>
-          <w:tcPr>
-            <w:tcW w:w="1275" w:type="dxa"/>
-            <w:gridSpan w:val="10"/>
-            <w:tcBorders>
-              <w:top w:val="nil"/>
-              <w:left w:val="nil"/>
-              <w:bottom w:val="single" w:sz="4" w:space="0" w:color="auto"/>
-              <w:right w:val="nil"/>
-            </w:tcBorders>
-            <w:vAlign w:val="bottom"/>
-          </w:tcPr>
-          <w:p>
-            <w:pPr>
+              <w:t xml:space="preserve">{{ </w:t>
+            </w:r>
+            <w:proofErr w:type="spellStart"/>
+            <w:r>
               <w:rPr>
                 <w:b/>
                 <w:bCs/>
                 <w:sz w:val="22"/>
                 <w:szCs w:val="22"/>
               </w:rPr>
-            </w:pPr>
+              <w:t>b</w:t>
+            </w:r>
+            <w:proofErr w:type="gramEnd"/>
+            <w:r>
+              <w:rPr>
+                <w:b/>
+                <w:bCs/>
+                <w:sz w:val="22"/>
+                <w:szCs w:val="22"/>
+              </w:rPr>
+              <w:t>_month_name</w:t>
+            </w:r>
+            <w:proofErr w:type="spellEnd"/>
             <w:r>
               <w:rPr>
                 <w:b/>
@@ -1194,9 +1351,32 @@
                 <w:szCs w:val="22"/>
                 <w:lang w:val="en-US"/>
               </w:rPr>
-              <w:t xml:space="preserve">{{ </w:t>
-            </w:r>
-            <w:proofErr w:type="spellStart"/>
+              <w:t xml:space="preserve"> }}</w:t>
+            </w:r>
+          </w:p>
+        </w:tc>
+        <w:tc>
+          <w:tcPr>
+            <w:tcW w:w="1275" w:type="dxa"/>
+            <w:gridSpan w:val="10"/>
+            <w:tcBorders>
+              <w:top w:val="nil"/>
+              <w:left w:val="nil"/>
+              <w:bottom w:val="single" w:sz="4" w:space="0" w:color="auto"/>
+              <w:right w:val="nil"/>
+            </w:tcBorders>
+            <w:vAlign w:val="bottom"/>
+          </w:tcPr>
+          <w:p>
+            <w:pPr>
+              <w:rPr>
+                <w:b/>
+                <w:bCs/>
+                <w:sz w:val="22"/>
+                <w:szCs w:val="22"/>
+              </w:rPr>
+            </w:pPr>
+            <w:proofErr w:type="gramStart"/>
             <w:r>
               <w:rPr>
                 <w:b/>
@@ -1205,9 +1385,9 @@
                 <w:szCs w:val="22"/>
                 <w:lang w:val="en-US"/>
               </w:rPr>
-              <w:t>b_year</w:t>
-            </w:r>
-            <w:proofErr w:type="spellEnd"/>
+              <w:t xml:space="preserve">{{ </w:t>
+            </w:r>
+            <w:proofErr w:type="spellStart"/>
             <w:r>
               <w:rPr>
                 <w:b/>
@@ -1216,7 +1396,51 @@
                 <w:szCs w:val="22"/>
                 <w:lang w:val="en-US"/>
               </w:rPr>
-              <w:t xml:space="preserve"> }}</w:t>
+              <w:t>b</w:t>
+            </w:r>
+            <w:proofErr w:type="gramEnd"/>
+            <w:r>
+              <w:rPr>
+                <w:b/>
+                <w:bCs/>
+                <w:sz w:val="22"/>
+                <w:szCs w:val="22"/>
+                <w:lang w:val="en-US"/>
+              </w:rPr>
+              <w:t>_</w:t>
+            </w:r>
+            <w:proofErr w:type="gramStart"/>
+            <w:r>
+              <w:rPr>
+                <w:b/>
+                <w:bCs/>
+                <w:sz w:val="22"/>
+                <w:szCs w:val="22"/>
+                <w:lang w:val="en-US"/>
+              </w:rPr>
+              <w:t>year</w:t>
+            </w:r>
+            <w:proofErr w:type="spellEnd"/>
+            <w:r>
+              <w:rPr>
+                <w:b/>
+                <w:bCs/>
+                <w:sz w:val="22"/>
+                <w:szCs w:val="22"/>
+                <w:lang w:val="en-US"/>
+              </w:rPr>
+              <w:t xml:space="preserve"> }</w:t>
+            </w:r>
+            <w:proofErr w:type="gramEnd"/>
+            <w:r>
+              <w:rPr>
+                <w:b/>
+                <w:bCs/>
+                <w:sz w:val="22"/>
+                <w:szCs w:val="22"/>
+                <w:lang w:val="en-US"/>
+              </w:rPr>
+              <w:t>}</w:t>
             </w:r>
             <w:r>
               <w:rPr>
@@ -1256,13 +1480,23 @@
               </w:rPr>
               <w:t xml:space="preserve">Пол: </w:t>
             </w:r>
+            <w:proofErr w:type="gramStart"/>
             <w:r>
               <w:rPr>
                 <w:sz w:val="16"/>
                 <w:szCs w:val="16"/>
                 <w:lang w:val="en-US"/>
               </w:rPr>
-              <w:t>{{ gender }}</w:t>
+              <w:t>{{ gender</w:t>
+            </w:r>
+            <w:proofErr w:type="gramEnd"/>
+            <w:r>
+              <w:rPr>
+                <w:sz w:val="16"/>
+                <w:szCs w:val="16"/>
+                <w:lang w:val="en-US"/>
+              </w:rPr>
+              <w:t xml:space="preserve"> }}</w:t>
             </w:r>
             <w:r>
               <w:rPr>
@@ -1366,6 +1600,7 @@
                 <w:lang w:val="en-US"/>
               </w:rPr>
             </w:pPr>
+            <w:proofErr w:type="gramStart"/>
             <w:r>
               <w:rPr>
                 <w:b/>
@@ -1387,6 +1622,7 @@
               <w:t>passport</w:t>
             </w:r>
             <w:proofErr w:type="spellEnd"/>
+            <w:proofErr w:type="gramEnd"/>
             <w:r>
               <w:rPr>
                 <w:b/>
@@ -1450,6 +1686,7 @@
                 <w:lang w:val="en-US"/>
               </w:rPr>
             </w:pPr>
+            <w:proofErr w:type="gramStart"/>
             <w:r>
               <w:rPr>
                 <w:b/>
@@ -1468,7 +1705,17 @@
                 <w:sz w:val="16"/>
                 <w:szCs w:val="16"/>
               </w:rPr>
-              <w:t>p_series</w:t>
+              <w:t>p</w:t>
+            </w:r>
+            <w:proofErr w:type="gramEnd"/>
+            <w:r>
+              <w:rPr>
+                <w:b/>
+                <w:bCs/>
+                <w:sz w:val="16"/>
+                <w:szCs w:val="16"/>
+              </w:rPr>
+              <w:t>_series</w:t>
             </w:r>
             <w:proofErr w:type="spellEnd"/>
             <w:r>
@@ -1534,6 +1781,7 @@
                 <w:lang w:val="en-US"/>
               </w:rPr>
             </w:pPr>
+            <w:proofErr w:type="gramStart"/>
             <w:r>
               <w:rPr>
                 <w:b/>
@@ -1552,7 +1800,17 @@
                 <w:sz w:val="16"/>
                 <w:szCs w:val="16"/>
               </w:rPr>
-              <w:t>p_number</w:t>
+              <w:t>p</w:t>
+            </w:r>
+            <w:proofErr w:type="gramEnd"/>
+            <w:r>
+              <w:rPr>
+                <w:b/>
+                <w:bCs/>
+                <w:sz w:val="16"/>
+                <w:szCs w:val="16"/>
+              </w:rPr>
+              <w:t>_number</w:t>
             </w:r>
             <w:proofErr w:type="spellEnd"/>
             <w:r>
@@ -1624,6 +1882,7 @@
                 <w:lang w:val="en-US"/>
               </w:rPr>
             </w:pPr>
+            <w:proofErr w:type="gramStart"/>
             <w:r>
               <w:rPr>
                 <w:b/>
@@ -1642,7 +1901,17 @@
                 <w:sz w:val="22"/>
                 <w:szCs w:val="22"/>
               </w:rPr>
-              <w:t>phone_number</w:t>
+              <w:t>phone</w:t>
+            </w:r>
+            <w:proofErr w:type="gramEnd"/>
+            <w:r>
+              <w:rPr>
+                <w:b/>
+                <w:bCs/>
+                <w:sz w:val="22"/>
+                <w:szCs w:val="22"/>
+              </w:rPr>
+              <w:t>_number</w:t>
             </w:r>
             <w:proofErr w:type="spellEnd"/>
             <w:r>
@@ -1763,6 +2032,7 @@
                 <w:szCs w:val="16"/>
               </w:rPr>
             </w:pPr>
+            <w:proofErr w:type="gramStart"/>
             <w:r>
               <w:rPr>
                 <w:b/>
@@ -1784,6 +2054,7 @@
               <w:t>area</w:t>
             </w:r>
             <w:proofErr w:type="spellEnd"/>
+            <w:proofErr w:type="gramEnd"/>
             <w:r>
               <w:rPr>
                 <w:b/>
@@ -1850,6 +2121,7 @@
                 <w:szCs w:val="16"/>
               </w:rPr>
             </w:pPr>
+            <w:proofErr w:type="gramStart"/>
             <w:r>
               <w:rPr>
                 <w:b/>
@@ -1871,6 +2143,7 @@
               <w:t>district</w:t>
             </w:r>
             <w:proofErr w:type="spellEnd"/>
+            <w:proofErr w:type="gramEnd"/>
             <w:r>
               <w:rPr>
                 <w:b/>
@@ -1932,6 +2205,7 @@
                 <w:szCs w:val="16"/>
               </w:rPr>
             </w:pPr>
+            <w:proofErr w:type="gramStart"/>
             <w:r>
               <w:rPr>
                 <w:b/>
@@ -1953,6 +2227,7 @@
               <w:t>locality</w:t>
             </w:r>
             <w:proofErr w:type="spellEnd"/>
+            <w:proofErr w:type="gramEnd"/>
             <w:r>
               <w:rPr>
                 <w:b/>
@@ -2019,6 +2294,7 @@
                 <w:szCs w:val="16"/>
               </w:rPr>
             </w:pPr>
+            <w:proofErr w:type="gramStart"/>
             <w:r>
               <w:rPr>
                 <w:b/>
@@ -2040,6 +2316,7 @@
               <w:t>street</w:t>
             </w:r>
             <w:proofErr w:type="spellEnd"/>
+            <w:proofErr w:type="gramEnd"/>
             <w:r>
               <w:rPr>
                 <w:b/>
@@ -2110,6 +2387,7 @@
                 <w:szCs w:val="16"/>
               </w:rPr>
             </w:pPr>
+            <w:proofErr w:type="gramStart"/>
             <w:r>
               <w:rPr>
                 <w:b/>
@@ -2131,6 +2409,7 @@
               <w:t>home</w:t>
             </w:r>
             <w:proofErr w:type="spellEnd"/>
+            <w:proofErr w:type="gramEnd"/>
             <w:r>
               <w:rPr>
                 <w:b/>
@@ -2201,6 +2480,7 @@
                 <w:szCs w:val="16"/>
               </w:rPr>
             </w:pPr>
+            <w:proofErr w:type="gramStart"/>
             <w:r>
               <w:rPr>
                 <w:b/>
@@ -2222,6 +2502,7 @@
               <w:t>building</w:t>
             </w:r>
             <w:proofErr w:type="spellEnd"/>
+            <w:proofErr w:type="gramEnd"/>
             <w:r>
               <w:rPr>
                 <w:b/>
@@ -2292,6 +2573,7 @@
                 <w:szCs w:val="16"/>
               </w:rPr>
             </w:pPr>
+            <w:proofErr w:type="gramStart"/>
             <w:r>
               <w:rPr>
                 <w:b/>
@@ -2313,6 +2595,7 @@
               <w:t>apartment</w:t>
             </w:r>
             <w:proofErr w:type="spellEnd"/>
+            <w:proofErr w:type="gramEnd"/>
             <w:r>
               <w:rPr>
                 <w:b/>
@@ -2436,6 +2719,7 @@
                 <w:szCs w:val="16"/>
               </w:rPr>
             </w:pPr>
+            <w:proofErr w:type="gramStart"/>
             <w:r>
               <w:rPr>
                 <w:b/>
@@ -2457,6 +2741,7 @@
               <w:t>area</w:t>
             </w:r>
             <w:proofErr w:type="spellEnd"/>
+            <w:proofErr w:type="gramEnd"/>
             <w:r>
               <w:rPr>
                 <w:b/>
@@ -2523,6 +2808,7 @@
                 <w:szCs w:val="16"/>
               </w:rPr>
             </w:pPr>
+            <w:proofErr w:type="gramStart"/>
             <w:r>
               <w:rPr>
                 <w:b/>
@@ -2544,6 +2830,7 @@
               <w:t>district</w:t>
             </w:r>
             <w:proofErr w:type="spellEnd"/>
+            <w:proofErr w:type="gramEnd"/>
             <w:r>
               <w:rPr>
                 <w:b/>
@@ -2605,6 +2892,7 @@
                 <w:szCs w:val="16"/>
               </w:rPr>
             </w:pPr>
+            <w:proofErr w:type="gramStart"/>
             <w:r>
               <w:rPr>
                 <w:b/>
@@ -2626,6 +2914,7 @@
               <w:t>locality</w:t>
             </w:r>
             <w:proofErr w:type="spellEnd"/>
+            <w:proofErr w:type="gramEnd"/>
             <w:r>
               <w:rPr>
                 <w:b/>
@@ -2692,6 +2981,7 @@
                 <w:szCs w:val="16"/>
               </w:rPr>
             </w:pPr>
+            <w:proofErr w:type="gramStart"/>
             <w:r>
               <w:rPr>
                 <w:b/>
@@ -2713,6 +3003,7 @@
               <w:t>street</w:t>
             </w:r>
             <w:proofErr w:type="spellEnd"/>
+            <w:proofErr w:type="gramEnd"/>
             <w:r>
               <w:rPr>
                 <w:b/>
@@ -2783,6 +3074,7 @@
                 <w:szCs w:val="16"/>
               </w:rPr>
             </w:pPr>
+            <w:proofErr w:type="gramStart"/>
             <w:r>
               <w:rPr>
                 <w:b/>
@@ -2804,6 +3096,7 @@
               <w:t>home</w:t>
             </w:r>
             <w:proofErr w:type="spellEnd"/>
+            <w:proofErr w:type="gramEnd"/>
             <w:r>
               <w:rPr>
                 <w:b/>
@@ -2874,6 +3167,7 @@
                 <w:szCs w:val="16"/>
               </w:rPr>
             </w:pPr>
+            <w:proofErr w:type="gramStart"/>
             <w:r>
               <w:rPr>
                 <w:b/>
@@ -2895,6 +3189,7 @@
               <w:t>building</w:t>
             </w:r>
             <w:proofErr w:type="spellEnd"/>
+            <w:proofErr w:type="gramEnd"/>
             <w:r>
               <w:rPr>
                 <w:b/>
@@ -2965,6 +3260,7 @@
                 <w:szCs w:val="16"/>
               </w:rPr>
             </w:pPr>
+            <w:proofErr w:type="gramStart"/>
             <w:r>
               <w:rPr>
                 <w:b/>
@@ -2986,6 +3282,7 @@
               <w:t>apartment</w:t>
             </w:r>
             <w:proofErr w:type="spellEnd"/>
+            <w:proofErr w:type="gramEnd"/>
             <w:r>
               <w:rPr>
                 <w:b/>
@@ -3583,7 +3880,15 @@
                 <w:sz w:val="16"/>
                 <w:szCs w:val="16"/>
               </w:rPr>
-              <w:t xml:space="preserve">Занятость: работает — 1, проходит военную и приравненную к ней службу — 2; пенсионер — 3, обучающийся — 4, не работает — 5, </w:t>
+              <w:t xml:space="preserve">Занятость: работает — 1, проходит военную и приравненную к ней службу — 2; пенсионер — 3, обучающийся — 4, не работает — </w:t>
+            </w:r>
+            <w:proofErr w:type="gramStart"/>
+            <w:r>
+              <w:rPr>
+                <w:sz w:val="16"/>
+                <w:szCs w:val="16"/>
+              </w:rPr>
+              <w:t xml:space="preserve">5, </w:t>
             </w:r>
             <w:r>
               <w:rPr>
@@ -3597,7 +3902,15 @@
                 <w:sz w:val="16"/>
                 <w:szCs w:val="16"/>
               </w:rPr>
-              <w:t>прочее — 6</w:t>
+              <w:t>прочее</w:t>
+            </w:r>
+            <w:proofErr w:type="gramEnd"/>
+            <w:r>
+              <w:rPr>
+                <w:sz w:val="16"/>
+                <w:szCs w:val="16"/>
+              </w:rPr>
+              <w:t xml:space="preserve"> — 6</w:t>
             </w:r>
             <w:r>
               <w:rPr>
@@ -5949,7 +6262,6 @@
           <w:tab w:val="left" w:leader="underscore" w:pos="7372"/>
         </w:tabs>
         <w:spacing w:line="100" w:lineRule="atLeast"/>
-        <w:ind w:firstLine="360"/>
         <w:jc w:val="center"/>
         <w:rPr>
           <w:b/>
@@ -6130,7 +6442,6 @@
           <w:tab w:val="left" w:leader="underscore" w:pos="7372"/>
         </w:tabs>
         <w:spacing w:line="100" w:lineRule="atLeast"/>
-        <w:ind w:firstLine="360"/>
         <w:jc w:val="right"/>
         <w:rPr>
           <w:b/>
@@ -6163,7 +6474,29 @@
           <w:color w:val="000000"/>
           <w:lang w:val="ru-RU"/>
         </w:rPr>
-        <w:t>Информированное добровольное согласие  на обработку персональных данных</w:t>
+        <w:t xml:space="preserve">Информированное добровольное </w:t>
+      </w:r>
+      <w:proofErr w:type="gramStart"/>
+      <w:r>
+        <w:rPr>
+          <w:rStyle w:val="11"/>
+          <w:rFonts w:ascii="Times New Roman" w:hAnsi="Times New Roman"/>
+          <w:b/>
+          <w:color w:val="000000"/>
+          <w:lang w:val="ru-RU"/>
+        </w:rPr>
+        <w:t>согласие  на</w:t>
+      </w:r>
+      <w:proofErr w:type="gramEnd"/>
+      <w:r>
+        <w:rPr>
+          <w:rStyle w:val="11"/>
+          <w:rFonts w:ascii="Times New Roman" w:hAnsi="Times New Roman"/>
+          <w:b/>
+          <w:color w:val="000000"/>
+          <w:lang w:val="ru-RU"/>
+        </w:rPr>
+        <w:t xml:space="preserve"> обработку персональных данных</w:t>
       </w:r>
     </w:p>
     <w:p>
@@ -6433,16 +6766,9 @@
           <w:szCs w:val="22"/>
           <w:lang w:val="ru-RU"/>
         </w:rPr>
-        <w:t xml:space="preserve">«{{ </w:t>
-      </w:r>
-      <w:r>
-        <w:rPr>
-          <w:rFonts w:ascii="Times New Roman" w:hAnsi="Times New Roman"/>
-          <w:sz w:val="22"/>
-          <w:szCs w:val="22"/>
-        </w:rPr>
-        <w:t>c</w:t>
-      </w:r>
+        <w:t>«</w:t>
+      </w:r>
+      <w:proofErr w:type="gramStart"/>
       <w:r>
         <w:rPr>
           <w:rFonts w:ascii="Times New Roman" w:hAnsi="Times New Roman"/>
@@ -6450,7 +6776,7 @@
           <w:szCs w:val="22"/>
           <w:lang w:val="ru-RU"/>
         </w:rPr>
-        <w:t>_</w:t>
+        <w:t xml:space="preserve">{{ </w:t>
       </w:r>
       <w:r>
         <w:rPr>
@@ -6458,8 +6784,9 @@
           <w:sz w:val="22"/>
           <w:szCs w:val="22"/>
         </w:rPr>
-        <w:t>day</w:t>
-      </w:r>
+        <w:t>c</w:t>
+      </w:r>
+      <w:proofErr w:type="gramEnd"/>
       <w:r>
         <w:rPr>
           <w:rFonts w:ascii="Times New Roman" w:hAnsi="Times New Roman"/>
@@ -6467,15 +6794,16 @@
           <w:szCs w:val="22"/>
           <w:lang w:val="ru-RU"/>
         </w:rPr>
-        <w:t xml:space="preserve"> }}» {{ </w:t>
-      </w:r>
+        <w:t>_</w:t>
+      </w:r>
+      <w:proofErr w:type="gramStart"/>
       <w:r>
         <w:rPr>
           <w:rFonts w:ascii="Times New Roman" w:hAnsi="Times New Roman"/>
           <w:sz w:val="22"/>
           <w:szCs w:val="22"/>
         </w:rPr>
-        <w:t>cur</w:t>
+        <w:t>day</w:t>
       </w:r>
       <w:r>
         <w:rPr>
@@ -6484,16 +6812,9 @@
           <w:szCs w:val="22"/>
           <w:lang w:val="ru-RU"/>
         </w:rPr>
-        <w:t>_</w:t>
-      </w:r>
-      <w:r>
-        <w:rPr>
-          <w:rFonts w:ascii="Times New Roman" w:hAnsi="Times New Roman"/>
-          <w:sz w:val="22"/>
-          <w:szCs w:val="22"/>
-        </w:rPr>
-        <w:t>month</w:t>
-      </w:r>
+        <w:t xml:space="preserve"> }</w:t>
+      </w:r>
+      <w:proofErr w:type="gramEnd"/>
       <w:r>
         <w:rPr>
           <w:rFonts w:ascii="Times New Roman" w:hAnsi="Times New Roman"/>
@@ -6501,18 +6822,9 @@
           <w:szCs w:val="22"/>
           <w:lang w:val="ru-RU"/>
         </w:rPr>
-        <w:t>_</w:t>
-      </w:r>
-      <w:proofErr w:type="spellStart"/>
-      <w:r>
-        <w:rPr>
-          <w:rFonts w:ascii="Times New Roman" w:hAnsi="Times New Roman"/>
-          <w:sz w:val="22"/>
-          <w:szCs w:val="22"/>
-        </w:rPr>
-        <w:t>ru</w:t>
-      </w:r>
-      <w:proofErr w:type="spellEnd"/>
+        <w:t xml:space="preserve">}» </w:t>
+      </w:r>
+      <w:proofErr w:type="gramStart"/>
       <w:r>
         <w:rPr>
           <w:rFonts w:ascii="Times New Roman" w:hAnsi="Times New Roman"/>
@@ -6520,7 +6832,7 @@
           <w:szCs w:val="22"/>
           <w:lang w:val="ru-RU"/>
         </w:rPr>
-        <w:t xml:space="preserve"> }} {{ </w:t>
+        <w:t xml:space="preserve">{{ </w:t>
       </w:r>
       <w:r>
         <w:rPr>
@@ -6528,8 +6840,9 @@
           <w:sz w:val="22"/>
           <w:szCs w:val="22"/>
         </w:rPr>
-        <w:t>current</w:t>
-      </w:r>
+        <w:t>cur</w:t>
+      </w:r>
+      <w:proofErr w:type="gramEnd"/>
       <w:r>
         <w:rPr>
           <w:rFonts w:ascii="Times New Roman" w:hAnsi="Times New Roman"/>
@@ -6545,7 +6858,7 @@
           <w:sz w:val="22"/>
           <w:szCs w:val="22"/>
         </w:rPr>
-        <w:t>year</w:t>
+        <w:t>month</w:t>
       </w:r>
       <w:r>
         <w:rPr>
@@ -6554,8 +6867,19 @@
           <w:szCs w:val="22"/>
           <w:lang w:val="ru-RU"/>
         </w:rPr>
-        <w:t xml:space="preserve"> }}</w:t>
-      </w:r>
+        <w:t>_</w:t>
+      </w:r>
+      <w:proofErr w:type="spellStart"/>
+      <w:proofErr w:type="gramStart"/>
+      <w:r>
+        <w:rPr>
+          <w:rFonts w:ascii="Times New Roman" w:hAnsi="Times New Roman"/>
+          <w:sz w:val="22"/>
+          <w:szCs w:val="22"/>
+        </w:rPr>
+        <w:t>ru</w:t>
+      </w:r>
+      <w:proofErr w:type="spellEnd"/>
       <w:r>
         <w:rPr>
           <w:rFonts w:ascii="Times New Roman" w:hAnsi="Times New Roman"/>
@@ -6563,7 +6887,102 @@
           <w:szCs w:val="22"/>
           <w:lang w:val="ru-RU"/>
         </w:rPr>
-        <w:t>г. до минования надобности. Я оставляю за собой право отозвать своё согласие на обработку персональных данных посредством составления соответствующего письменного документа, который может быть направлен мной в адрес Оператора по почте заказным письмом с уведомлением о вручении либо вручён лично под расписку представителю Оператора. В случае получения моего письменного заявления об отзыве настоящего согласия на обработку персональных данных Оператор обязан прекратить их обработку в течение периода времени, необходимого для завершения взаиморасчетов по оплате оказанной мне (несовершеннолетнему пациенту/лицу, признанному недееспособным) до этого медицинской помощи.</w:t>
+        <w:t xml:space="preserve"> }</w:t>
+      </w:r>
+      <w:proofErr w:type="gramEnd"/>
+      <w:r>
+        <w:rPr>
+          <w:rFonts w:ascii="Times New Roman" w:hAnsi="Times New Roman"/>
+          <w:sz w:val="22"/>
+          <w:szCs w:val="22"/>
+          <w:lang w:val="ru-RU"/>
+        </w:rPr>
+        <w:t xml:space="preserve">} </w:t>
+      </w:r>
+      <w:proofErr w:type="gramStart"/>
+      <w:r>
+        <w:rPr>
+          <w:rFonts w:ascii="Times New Roman" w:hAnsi="Times New Roman"/>
+          <w:sz w:val="22"/>
+          <w:szCs w:val="22"/>
+          <w:lang w:val="ru-RU"/>
+        </w:rPr>
+        <w:t xml:space="preserve">{{ </w:t>
+      </w:r>
+      <w:r>
+        <w:rPr>
+          <w:rFonts w:ascii="Times New Roman" w:hAnsi="Times New Roman"/>
+          <w:sz w:val="22"/>
+          <w:szCs w:val="22"/>
+        </w:rPr>
+        <w:t>current</w:t>
+      </w:r>
+      <w:proofErr w:type="gramEnd"/>
+      <w:r>
+        <w:rPr>
+          <w:rFonts w:ascii="Times New Roman" w:hAnsi="Times New Roman"/>
+          <w:sz w:val="22"/>
+          <w:szCs w:val="22"/>
+          <w:lang w:val="ru-RU"/>
+        </w:rPr>
+        <w:t>_</w:t>
+      </w:r>
+      <w:proofErr w:type="gramStart"/>
+      <w:r>
+        <w:rPr>
+          <w:rFonts w:ascii="Times New Roman" w:hAnsi="Times New Roman"/>
+          <w:sz w:val="22"/>
+          <w:szCs w:val="22"/>
+        </w:rPr>
+        <w:t>year</w:t>
+      </w:r>
+      <w:r>
+        <w:rPr>
+          <w:rFonts w:ascii="Times New Roman" w:hAnsi="Times New Roman"/>
+          <w:sz w:val="22"/>
+          <w:szCs w:val="22"/>
+          <w:lang w:val="ru-RU"/>
+        </w:rPr>
+        <w:t xml:space="preserve"> }}</w:t>
+      </w:r>
+      <w:r>
+        <w:rPr>
+          <w:rFonts w:ascii="Times New Roman" w:hAnsi="Times New Roman"/>
+          <w:sz w:val="22"/>
+          <w:szCs w:val="22"/>
+          <w:lang w:val="ru-RU"/>
+        </w:rPr>
+        <w:t>г.</w:t>
+      </w:r>
+      <w:proofErr w:type="gramEnd"/>
+      <w:r>
+        <w:rPr>
+          <w:rFonts w:ascii="Times New Roman" w:hAnsi="Times New Roman"/>
+          <w:sz w:val="22"/>
+          <w:szCs w:val="22"/>
+          <w:lang w:val="ru-RU"/>
+        </w:rPr>
+        <w:t xml:space="preserve"> до минования надобности. Я оставляю за собой право отозвать своё согласие на обработку персональных данных посредством составления соответствующего письменного документа, который может быть направлен мной в адрес Оператора по почте заказным письмом с уведомлением о вручении либо вручён лично под расписку представителю Оператора. В случае получения моего письменного заявления об отзыве настоящего согласия на обработку персональных данных Оператор обязан прекратить их обработку в течение периода времени, необходимого для завершения взаиморасчетов </w:t>
+      </w:r>
+      <w:proofErr w:type="gramStart"/>
+      <w:r>
+        <w:rPr>
+          <w:rFonts w:ascii="Times New Roman" w:hAnsi="Times New Roman"/>
+          <w:sz w:val="22"/>
+          <w:szCs w:val="22"/>
+          <w:lang w:val="ru-RU"/>
+        </w:rPr>
+        <w:t>по оплате</w:t>
+      </w:r>
+      <w:proofErr w:type="gramEnd"/>
+      <w:r>
+        <w:rPr>
+          <w:rFonts w:ascii="Times New Roman" w:hAnsi="Times New Roman"/>
+          <w:sz w:val="22"/>
+          <w:szCs w:val="22"/>
+          <w:lang w:val="ru-RU"/>
+        </w:rPr>
+        <w:t xml:space="preserve"> оказанной мне (несовершеннолетнему пациенту/лицу, признанному недееспособным) до этого медицинской помощи.</w:t>
       </w:r>
     </w:p>
     <w:p>
@@ -6615,6 +7034,7 @@
               <w:spacing w:after="0" w:line="240" w:lineRule="auto"/>
               <w:jc w:val="both"/>
             </w:pPr>
+            <w:proofErr w:type="gramStart"/>
             <w:r>
               <w:rPr>
                 <w:rFonts w:ascii="Times New Roman" w:hAnsi="Times New Roman"/>
@@ -6641,7 +7061,17 @@
                 <w:szCs w:val="22"/>
                 <w:u w:val="single"/>
               </w:rPr>
-              <w:t>appointment_date</w:t>
+              <w:t>appointment</w:t>
+            </w:r>
+            <w:proofErr w:type="gramEnd"/>
+            <w:r>
+              <w:rPr>
+                <w:rFonts w:ascii="Times New Roman" w:hAnsi="Times New Roman"/>
+                <w:sz w:val="22"/>
+                <w:szCs w:val="22"/>
+                <w:u w:val="single"/>
+              </w:rPr>
+              <w:t>_date</w:t>
             </w:r>
             <w:proofErr w:type="spellEnd"/>
             <w:r>
@@ -6794,7 +7224,6 @@
           <w:tab w:val="left" w:leader="underscore" w:pos="7372"/>
         </w:tabs>
         <w:spacing w:line="100" w:lineRule="atLeast"/>
-        <w:ind w:firstLine="360"/>
         <w:jc w:val="center"/>
         <w:rPr>
           <w:b/>
@@ -7233,6 +7662,7 @@
         </w:rPr>
         <w:t xml:space="preserve"> </w:t>
       </w:r>
+      <w:proofErr w:type="gramStart"/>
       <w:r>
         <w:rPr>
           <w:rFonts w:ascii="Times New Roman" w:hAnsi="Times New Roman"/>
@@ -7244,6 +7674,7 @@
         <w:t xml:space="preserve">{{  </w:t>
       </w:r>
       <w:proofErr w:type="spellStart"/>
+      <w:proofErr w:type="gramEnd"/>
       <w:r>
         <w:rPr>
           <w:rFonts w:ascii="Times New Roman" w:hAnsi="Times New Roman"/>
@@ -7264,6 +7695,7 @@
         </w:rPr>
         <w:t>_</w:t>
       </w:r>
+      <w:proofErr w:type="gramStart"/>
       <w:r>
         <w:rPr>
           <w:rFonts w:ascii="Times New Roman" w:hAnsi="Times New Roman"/>
@@ -7283,7 +7715,18 @@
           <w:color w:val="000000"/>
           <w:shd w:val="clear" w:color="auto" w:fill="FFFFFF"/>
         </w:rPr>
-        <w:t xml:space="preserve"> }} </w:t>
+        <w:t xml:space="preserve"> }</w:t>
+      </w:r>
+      <w:proofErr w:type="gramEnd"/>
+      <w:r>
+        <w:rPr>
+          <w:rFonts w:ascii="Times New Roman" w:hAnsi="Times New Roman"/>
+          <w:b/>
+          <w:bCs/>
+          <w:color w:val="000000"/>
+          <w:shd w:val="clear" w:color="auto" w:fill="FFFFFF"/>
+        </w:rPr>
+        <w:t xml:space="preserve">} </w:t>
       </w:r>
       <w:r>
         <w:rPr>
@@ -7304,7 +7747,18 @@
           <w:color w:val="000000"/>
           <w:shd w:val="clear" w:color="auto" w:fill="FFFFFF"/>
         </w:rPr>
-        <w:t xml:space="preserve"> {{ </w:t>
+        <w:t xml:space="preserve"> </w:t>
+      </w:r>
+      <w:proofErr w:type="gramStart"/>
+      <w:r>
+        <w:rPr>
+          <w:rFonts w:ascii="Times New Roman" w:hAnsi="Times New Roman"/>
+          <w:b/>
+          <w:bCs/>
+          <w:color w:val="000000"/>
+          <w:shd w:val="clear" w:color="auto" w:fill="FFFFFF"/>
+        </w:rPr>
+        <w:t xml:space="preserve">{{ </w:t>
       </w:r>
       <w:proofErr w:type="spellStart"/>
       <w:r>
@@ -7316,6 +7770,7 @@
         </w:rPr>
         <w:t>doctor</w:t>
       </w:r>
+      <w:proofErr w:type="gramEnd"/>
       <w:r>
         <w:rPr>
           <w:rFonts w:ascii="Times New Roman" w:hAnsi="Times New Roman"/>
@@ -7325,6 +7780,7 @@
         </w:rPr>
         <w:t>_</w:t>
       </w:r>
+      <w:proofErr w:type="gramStart"/>
       <w:r>
         <w:rPr>
           <w:rFonts w:ascii="Times New Roman" w:hAnsi="Times New Roman"/>
@@ -7342,7 +7798,17 @@
           <w:bCs/>
           <w:shd w:val="clear" w:color="auto" w:fill="FFFFFF"/>
         </w:rPr>
-        <w:t xml:space="preserve"> }}</w:t>
+        <w:t xml:space="preserve"> }</w:t>
+      </w:r>
+      <w:proofErr w:type="gramEnd"/>
+      <w:r>
+        <w:rPr>
+          <w:rFonts w:ascii="Times New Roman" w:hAnsi="Times New Roman"/>
+          <w:b/>
+          <w:bCs/>
+          <w:shd w:val="clear" w:color="auto" w:fill="FFFFFF"/>
+        </w:rPr>
+        <w:t>}</w:t>
       </w:r>
       <w:r>
         <w:rPr>
@@ -7709,6 +8175,7 @@
               <w:spacing w:after="0" w:line="240" w:lineRule="auto"/>
               <w:jc w:val="both"/>
             </w:pPr>
+            <w:proofErr w:type="gramStart"/>
             <w:r>
               <w:rPr>
                 <w:rFonts w:ascii="Times New Roman" w:hAnsi="Times New Roman"/>
@@ -7735,7 +8202,17 @@
                 <w:szCs w:val="22"/>
                 <w:u w:val="single"/>
               </w:rPr>
-              <w:t>appointment_date</w:t>
+              <w:t>appointment</w:t>
+            </w:r>
+            <w:proofErr w:type="gramEnd"/>
+            <w:r>
+              <w:rPr>
+                <w:rFonts w:ascii="Times New Roman" w:hAnsi="Times New Roman"/>
+                <w:sz w:val="22"/>
+                <w:szCs w:val="22"/>
+                <w:u w:val="single"/>
+              </w:rPr>
+              <w:t>_date</w:t>
             </w:r>
             <w:proofErr w:type="spellEnd"/>
             <w:r>
@@ -7937,6 +8414,7 @@
               </w:rPr>
               <w:t xml:space="preserve"> </w:t>
             </w:r>
+            <w:proofErr w:type="gramStart"/>
             <w:r>
               <w:rPr>
                 <w:rFonts w:ascii="Times New Roman" w:hAnsi="Times New Roman"/>
@@ -7951,15 +8429,39 @@
                 <w:rFonts w:ascii="Times New Roman" w:hAnsi="Times New Roman"/>
                 <w:shd w:val="clear" w:color="auto" w:fill="FFFFFF"/>
               </w:rPr>
-              <w:t>doctor_specialization</w:t>
-            </w:r>
-            <w:proofErr w:type="spellEnd"/>
+              <w:t>doctor</w:t>
+            </w:r>
+            <w:proofErr w:type="gramEnd"/>
             <w:r>
               <w:rPr>
                 <w:rFonts w:ascii="Times New Roman" w:hAnsi="Times New Roman"/>
                 <w:shd w:val="clear" w:color="auto" w:fill="FFFFFF"/>
               </w:rPr>
-              <w:t xml:space="preserve"> }}</w:t>
+              <w:t>_</w:t>
+            </w:r>
+            <w:proofErr w:type="gramStart"/>
+            <w:r>
+              <w:rPr>
+                <w:rFonts w:ascii="Times New Roman" w:hAnsi="Times New Roman"/>
+                <w:shd w:val="clear" w:color="auto" w:fill="FFFFFF"/>
+              </w:rPr>
+              <w:t>specialization</w:t>
+            </w:r>
+            <w:proofErr w:type="spellEnd"/>
+            <w:r>
+              <w:rPr>
+                <w:rFonts w:ascii="Times New Roman" w:hAnsi="Times New Roman"/>
+                <w:shd w:val="clear" w:color="auto" w:fill="FFFFFF"/>
+              </w:rPr>
+              <w:t xml:space="preserve"> }</w:t>
+            </w:r>
+            <w:proofErr w:type="gramEnd"/>
+            <w:r>
+              <w:rPr>
+                <w:rFonts w:ascii="Times New Roman" w:hAnsi="Times New Roman"/>
+                <w:shd w:val="clear" w:color="auto" w:fill="FFFFFF"/>
+              </w:rPr>
+              <w:t>}</w:t>
             </w:r>
             <w:r>
               <w:rPr>
@@ -7967,9 +8469,19 @@
                 <w:color w:val="000000"/>
                 <w:shd w:val="clear" w:color="auto" w:fill="FFFFFF"/>
               </w:rPr>
-              <w:t xml:space="preserve"> {{  </w:t>
+              <w:t xml:space="preserve"> </w:t>
+            </w:r>
+            <w:proofErr w:type="gramStart"/>
+            <w:r>
+              <w:rPr>
+                <w:rFonts w:ascii="Times New Roman" w:hAnsi="Times New Roman"/>
+                <w:color w:val="000000"/>
+                <w:shd w:val="clear" w:color="auto" w:fill="FFFFFF"/>
+              </w:rPr>
+              <w:t xml:space="preserve">{{  </w:t>
             </w:r>
             <w:proofErr w:type="spellStart"/>
+            <w:proofErr w:type="gramEnd"/>
             <w:r>
               <w:rPr>
                 <w:rFonts w:ascii="Times New Roman" w:hAnsi="Times New Roman"/>

</xml_diff>